<commit_message>
Render push fe857de10a116454d148d37d0e392a8a7507035a Merge pull request #31 from seandavi/issue-17-trends-csl
Switch CSL to trends-journals (#17) fe857de10a116454d148d37d0e392a8a7507035a
</commit_message>
<xml_diff>
--- a/manuscript.docx
+++ b/manuscript.docx
@@ -8695,7 +8695,7 @@
       </w:tr>
     </w:tbl>
     <w:bookmarkEnd w:id="36"/>
-    <w:bookmarkStart w:id="160" w:name="references"/>
+    <w:bookmarkStart w:id="100" w:name="references"/>
     <w:p>
       <w:pPr>
         <w:pStyle w:val="Heading1"/>
@@ -8704,8 +8704,8 @@
         <w:t xml:space="preserve">References</w:t>
       </w:r>
     </w:p>
-    <w:bookmarkStart w:id="159" w:name="refs"/>
-    <w:bookmarkStart w:id="40" w:name="ref-pmid:24071849"/>
+    <w:bookmarkStart w:id="99" w:name="refs"/>
+    <w:bookmarkStart w:id="38" w:name="ref-pmid:24071849"/>
     <w:p>
       <w:pPr>
         <w:pStyle w:val="Bibliography"/>
@@ -8721,29 +8721,16 @@
       </w:r>
       <w:r>
         <w:rPr>
-          <w:b/>
-          <w:bCs/>
-        </w:rPr>
-        <w:t xml:space="preserve">The Cancer Genome Atlas Pan-Cancer analysis project.</w:t>
-      </w:r>
-      <w:r>
-        <w:t xml:space="preserve">, John N Weinstein, Eric A Collisson, Gordon B Mills, Kenna RMills Shaw, Brad A Ozenberger, Kyle Ellrott, Ilya Shmulevich, Chris Sander, Joshua M Stuart</w:t>
-      </w:r>
-      <w:r>
-        <w:t xml:space="preserve"> </w:t>
-      </w:r>
-      <w:r>
-        <w:rPr>
           <w:i/>
           <w:iCs/>
         </w:rPr>
-        <w:t xml:space="preserve">Nature genetics</w:t>
-      </w:r>
-      <w:r>
-        <w:t xml:space="preserve"> </w:t>
-      </w:r>
-      <w:r>
-        <w:t xml:space="preserve">(2013-10)</w:t>
+        <w:t xml:space="preserve">et al.</w:t>
+      </w:r>
+      <w:r>
+        <w:t xml:space="preserve"> </w:t>
+      </w:r>
+      <w:r>
+        <w:t xml:space="preserve">(2013)</w:t>
       </w:r>
       <w:r>
         <w:t xml:space="preserve"> </w:t>
@@ -8753,48 +8740,59 @@
           <w:rPr>
             <w:rStyle w:val="Hyperlink"/>
           </w:rPr>
-          <w:t xml:space="preserve">https://www.ncbi.nlm.nih.gov/pubmed/24071849</w:t>
+          <w:t xml:space="preserve">The Cancer Genome Atlas Pan-Cancer analysis project.</w:t>
         </w:r>
       </w:hyperlink>
       <w:r>
         <w:t xml:space="preserve"> </w:t>
       </w:r>
       <w:r>
-        <w:t xml:space="preserve">DOI:</w:t>
-      </w:r>
-      <w:r>
-        <w:t xml:space="preserve"> </w:t>
-      </w:r>
-      <w:hyperlink r:id="rId38">
-        <w:r>
-          <w:rPr>
-            <w:rStyle w:val="Hyperlink"/>
-          </w:rPr>
-          <w:t xml:space="preserve">10.1038/ng.2764</w:t>
-        </w:r>
-      </w:hyperlink>
-      <w:r>
-        <w:t xml:space="preserve"> </w:t>
-      </w:r>
-      <w:r>
-        <w:t xml:space="preserve">· PMID:</w:t>
-      </w:r>
-      <w:r>
-        <w:t xml:space="preserve"> </w:t>
-      </w:r>
-      <w:hyperlink r:id="rId37">
-        <w:r>
-          <w:rPr>
-            <w:rStyle w:val="Hyperlink"/>
-          </w:rPr>
-          <w:t xml:space="preserve">24071849</w:t>
-        </w:r>
-      </w:hyperlink>
-      <w:r>
-        <w:t xml:space="preserve"> </w:t>
-      </w:r>
-      <w:r>
-        <w:t xml:space="preserve">· PMCID:</w:t>
+        <w:rPr>
+          <w:i/>
+          <w:iCs/>
+        </w:rPr>
+        <w:t xml:space="preserve">Nat Genet</w:t>
+      </w:r>
+      <w:r>
+        <w:t xml:space="preserve"> </w:t>
+      </w:r>
+      <w:r>
+        <w:t xml:space="preserve">45, 1113–20</w:t>
+      </w:r>
+    </w:p>
+    <w:bookmarkEnd w:id="38"/>
+    <w:bookmarkStart w:id="40" w:name="ref-doi:10.1038/ng.2653"/>
+    <w:p>
+      <w:pPr>
+        <w:pStyle w:val="Bibliography"/>
+      </w:pPr>
+      <w:r>
+        <w:t xml:space="preserve">2.</w:t>
+      </w:r>
+      <w:r>
+        <w:t xml:space="preserve"> </w:t>
+      </w:r>
+      <w:r>
+        <w:t xml:space="preserve">	</w:t>
+      </w:r>
+      <w:r>
+        <w:t xml:space="preserve">Lonsdale, J.</w:t>
+      </w:r>
+      <w:r>
+        <w:t xml:space="preserve"> </w:t>
+      </w:r>
+      <w:r>
+        <w:rPr>
+          <w:i/>
+          <w:iCs/>
+        </w:rPr>
+        <w:t xml:space="preserve">et al.</w:t>
+      </w:r>
+      <w:r>
+        <w:t xml:space="preserve"> </w:t>
+      </w:r>
+      <w:r>
+        <w:t xml:space="preserve">(2013)</w:t>
       </w:r>
       <w:r>
         <w:t xml:space="preserve"> </w:t>
@@ -8804,18 +8802,37 @@
           <w:rPr>
             <w:rStyle w:val="Hyperlink"/>
           </w:rPr>
-          <w:t xml:space="preserve">PMC3919969</w:t>
+          <w:t xml:space="preserve">The Genotype-Tissue Expression (GTEx) project</w:t>
         </w:r>
       </w:hyperlink>
+      <w:r>
+        <w:t xml:space="preserve">.</w:t>
+      </w:r>
+      <w:r>
+        <w:t xml:space="preserve"> </w:t>
+      </w:r>
+      <w:r>
+        <w:rPr>
+          <w:i/>
+          <w:iCs/>
+        </w:rPr>
+        <w:t xml:space="preserve">Nat Genet</w:t>
+      </w:r>
+      <w:r>
+        <w:t xml:space="preserve"> </w:t>
+      </w:r>
+      <w:r>
+        <w:t xml:space="preserve">45, 580–585</w:t>
+      </w:r>
     </w:p>
     <w:bookmarkEnd w:id="40"/>
-    <w:bookmarkStart w:id="45" w:name="ref-doi:10.1038/ng.2653"/>
+    <w:bookmarkStart w:id="42" w:name="ref-doi:10.1056/NEJMsr1809937"/>
     <w:p>
       <w:pPr>
         <w:pStyle w:val="Bibliography"/>
       </w:pPr>
       <w:r>
-        <w:t xml:space="preserve">2.</w:t>
+        <w:t xml:space="preserve">3.</w:t>
       </w:r>
       <w:r>
         <w:t xml:space="preserve"> </w:t>
@@ -8824,33 +8841,7 @@
         <w:t xml:space="preserve">	</w:t>
       </w:r>
       <w:r>
-        <w:rPr>
-          <w:b/>
-          <w:bCs/>
-        </w:rPr>
-        <w:t xml:space="preserve">The Genotype-Tissue Expression (GTEx) project</w:t>
-      </w:r>
-      <w:r>
-        <w:t xml:space="preserve"> </w:t>
-      </w:r>
-      <w:r>
-        <w:t xml:space="preserve">John Lonsdale, Jeffrey Thomas, Mike Salvatore, Rebecca Phillips, Edmund Lo, Saboor Shad, Richard Hasz, Gary Walters, Fernando Garcia, Nancy Young, … Helen F Moore</w:t>
-      </w:r>
-      <w:r>
-        <w:t xml:space="preserve"> </w:t>
-      </w:r>
-      <w:r>
-        <w:rPr>
-          <w:i/>
-          <w:iCs/>
-        </w:rPr>
-        <w:t xml:space="preserve">Nature Genetics</w:t>
-      </w:r>
-      <w:r>
-        <w:t xml:space="preserve"> </w:t>
-      </w:r>
-      <w:r>
-        <w:t xml:space="preserve">(2013-05-29)</w:t>
+        <w:t xml:space="preserve">(2019)</w:t>
       </w:r>
       <w:r>
         <w:t xml:space="preserve"> </w:t>
@@ -8860,31 +8851,86 @@
           <w:rPr>
             <w:rStyle w:val="Hyperlink"/>
           </w:rPr>
-          <w:t xml:space="preserve">https://doi.org/gd5z68</w:t>
+          <w:t xml:space="preserve">The</w:t>
         </w:r>
-      </w:hyperlink>
-      <w:r>
-        <w:t xml:space="preserve"> </w:t>
-      </w:r>
-      <w:r>
-        <w:t xml:space="preserve">DOI:</w:t>
-      </w:r>
-      <w:r>
-        <w:t xml:space="preserve"> </w:t>
-      </w:r>
-      <w:hyperlink r:id="rId42">
         <w:r>
           <w:rPr>
             <w:rStyle w:val="Hyperlink"/>
           </w:rPr>
-          <w:t xml:space="preserve">10.1038/ng.2653</w:t>
+          <w:t xml:space="preserve"> </w:t>
+        </w:r>
+        <w:r>
+          <w:rPr>
+            <w:rStyle w:val="Hyperlink"/>
+          </w:rPr>
+          <w:t xml:space="preserve">“All of Us”</w:t>
+        </w:r>
+        <w:r>
+          <w:rPr>
+            <w:rStyle w:val="Hyperlink"/>
+          </w:rPr>
+          <w:t xml:space="preserve"> </w:t>
+        </w:r>
+        <w:r>
+          <w:rPr>
+            <w:rStyle w:val="Hyperlink"/>
+          </w:rPr>
+          <w:t xml:space="preserve">Research Program</w:t>
         </w:r>
       </w:hyperlink>
       <w:r>
-        <w:t xml:space="preserve"> </w:t>
-      </w:r>
-      <w:r>
-        <w:t xml:space="preserve">· PMID:</w:t>
+        <w:t xml:space="preserve">.</w:t>
+      </w:r>
+      <w:r>
+        <w:t xml:space="preserve"> </w:t>
+      </w:r>
+      <w:r>
+        <w:rPr>
+          <w:i/>
+          <w:iCs/>
+        </w:rPr>
+        <w:t xml:space="preserve">N Engl J Med</w:t>
+      </w:r>
+      <w:r>
+        <w:t xml:space="preserve"> </w:t>
+      </w:r>
+      <w:r>
+        <w:t xml:space="preserve">381, 668–676</w:t>
+      </w:r>
+    </w:p>
+    <w:bookmarkEnd w:id="42"/>
+    <w:bookmarkStart w:id="44" w:name="ref-doi:10.1093/gigascience/giac105"/>
+    <w:p>
+      <w:pPr>
+        <w:pStyle w:val="Bibliography"/>
+      </w:pPr>
+      <w:r>
+        <w:t xml:space="preserve">4.</w:t>
+      </w:r>
+      <w:r>
+        <w:t xml:space="preserve"> </w:t>
+      </w:r>
+      <w:r>
+        <w:t xml:space="preserve">	</w:t>
+      </w:r>
+      <w:r>
+        <w:t xml:space="preserve">Charbonneau, A.L.</w:t>
+      </w:r>
+      <w:r>
+        <w:t xml:space="preserve"> </w:t>
+      </w:r>
+      <w:r>
+        <w:rPr>
+          <w:i/>
+          <w:iCs/>
+        </w:rPr>
+        <w:t xml:space="preserve">et al.</w:t>
+      </w:r>
+      <w:r>
+        <w:t xml:space="preserve"> </w:t>
+      </w:r>
+      <w:r>
+        <w:t xml:space="preserve">(2022)</w:t>
       </w:r>
       <w:r>
         <w:t xml:space="preserve"> </w:t>
@@ -8894,166 +8940,11 @@
           <w:rPr>
             <w:rStyle w:val="Hyperlink"/>
           </w:rPr>
-          <w:t xml:space="preserve">23715323</w:t>
+          <w:t xml:space="preserve">Making Common Fund data more findable: catalyzing a data ecosystem</w:t>
         </w:r>
       </w:hyperlink>
       <w:r>
-        <w:t xml:space="preserve"> </w:t>
-      </w:r>
-      <w:r>
-        <w:t xml:space="preserve">· PMCID:</w:t>
-      </w:r>
-      <w:r>
-        <w:t xml:space="preserve"> </w:t>
-      </w:r>
-      <w:hyperlink r:id="rId44">
-        <w:r>
-          <w:rPr>
-            <w:rStyle w:val="Hyperlink"/>
-          </w:rPr>
-          <w:t xml:space="preserve">PMC4010069</w:t>
-        </w:r>
-      </w:hyperlink>
-    </w:p>
-    <w:bookmarkEnd w:id="45"/>
-    <w:bookmarkStart w:id="49" w:name="ref-doi:10.1056/NEJMsr1809937"/>
-    <w:p>
-      <w:pPr>
-        <w:pStyle w:val="Bibliography"/>
-      </w:pPr>
-      <w:r>
-        <w:t xml:space="preserve">3.</w:t>
-      </w:r>
-      <w:r>
-        <w:t xml:space="preserve"> </w:t>
-      </w:r>
-      <w:r>
-        <w:t xml:space="preserve">	</w:t>
-      </w:r>
-      <w:r>
-        <w:rPr>
-          <w:b/>
-          <w:bCs/>
-        </w:rPr>
-        <w:t xml:space="preserve">The</w:t>
-      </w:r>
-      <w:r>
-        <w:rPr>
-          <w:b/>
-          <w:bCs/>
-        </w:rPr>
-        <w:t xml:space="preserve"> </w:t>
-      </w:r>
-      <w:r>
-        <w:rPr>
-          <w:b/>
-          <w:bCs/>
-        </w:rPr>
-        <w:t xml:space="preserve">“All of Us”</w:t>
-      </w:r>
-      <w:r>
-        <w:rPr>
-          <w:b/>
-          <w:bCs/>
-        </w:rPr>
-        <w:t xml:space="preserve"> </w:t>
-      </w:r>
-      <w:r>
-        <w:rPr>
-          <w:b/>
-          <w:bCs/>
-        </w:rPr>
-        <w:t xml:space="preserve">Research Program</w:t>
-      </w:r>
-      <w:r>
-        <w:t xml:space="preserve"> </w:t>
-      </w:r>
-      <w:r>
-        <w:rPr>
-          <w:i/>
-          <w:iCs/>
-        </w:rPr>
-        <w:t xml:space="preserve">New England Journal of Medicine</w:t>
-      </w:r>
-      <w:r>
-        <w:t xml:space="preserve"> </w:t>
-      </w:r>
-      <w:r>
-        <w:t xml:space="preserve">(2019-08-15)</w:t>
-      </w:r>
-      <w:r>
-        <w:t xml:space="preserve"> </w:t>
-      </w:r>
-      <w:hyperlink r:id="rId46">
-        <w:r>
-          <w:rPr>
-            <w:rStyle w:val="Hyperlink"/>
-          </w:rPr>
-          <w:t xml:space="preserve">https://doi.org/ggjdzj</w:t>
-        </w:r>
-      </w:hyperlink>
-      <w:r>
-        <w:t xml:space="preserve"> </w:t>
-      </w:r>
-      <w:r>
-        <w:t xml:space="preserve">DOI:</w:t>
-      </w:r>
-      <w:r>
-        <w:t xml:space="preserve"> </w:t>
-      </w:r>
-      <w:hyperlink r:id="rId47">
-        <w:r>
-          <w:rPr>
-            <w:rStyle w:val="Hyperlink"/>
-          </w:rPr>
-          <w:t xml:space="preserve">10.1056/nejmsr1809937</w:t>
-        </w:r>
-      </w:hyperlink>
-      <w:r>
-        <w:t xml:space="preserve"> </w:t>
-      </w:r>
-      <w:r>
-        <w:t xml:space="preserve">· PMID:</w:t>
-      </w:r>
-      <w:r>
-        <w:t xml:space="preserve"> </w:t>
-      </w:r>
-      <w:hyperlink r:id="rId48">
-        <w:r>
-          <w:rPr>
-            <w:rStyle w:val="Hyperlink"/>
-          </w:rPr>
-          <w:t xml:space="preserve">31412182</w:t>
-        </w:r>
-      </w:hyperlink>
-    </w:p>
-    <w:bookmarkEnd w:id="49"/>
-    <w:bookmarkStart w:id="54" w:name="ref-doi:10.1093/gigascience/giac105"/>
-    <w:p>
-      <w:pPr>
-        <w:pStyle w:val="Bibliography"/>
-      </w:pPr>
-      <w:r>
-        <w:t xml:space="preserve">4.</w:t>
-      </w:r>
-      <w:r>
-        <w:t xml:space="preserve"> </w:t>
-      </w:r>
-      <w:r>
-        <w:t xml:space="preserve">	</w:t>
-      </w:r>
-      <w:r>
-        <w:rPr>
-          <w:b/>
-          <w:bCs/>
-        </w:rPr>
-        <w:t xml:space="preserve">Making Common Fund data more findable: catalyzing a data ecosystem</w:t>
-      </w:r>
-      <w:r>
-        <w:t xml:space="preserve"> </w:t>
-      </w:r>
-      <w:r>
-        <w:t xml:space="preserve">Amanda L Charbonneau, Arthur Brady, Karl Czajkowski, Jain Aluvathingal, Saranya Canchi, Robert Carter, Kyle Chard, Daniel JB Clarke, Jonathan Crabtree, Heather H Creasy, … Owen White</w:t>
+        <w:t xml:space="preserve">.</w:t>
       </w:r>
       <w:r>
         <w:t xml:space="preserve"> </w:t>
@@ -9069,73 +8960,11 @@
         <w:t xml:space="preserve"> </w:t>
       </w:r>
       <w:r>
-        <w:t xml:space="preserve">(2022)</w:t>
-      </w:r>
-      <w:r>
-        <w:t xml:space="preserve"> </w:t>
-      </w:r>
-      <w:hyperlink r:id="rId50">
-        <w:r>
-          <w:rPr>
-            <w:rStyle w:val="Hyperlink"/>
-          </w:rPr>
-          <w:t xml:space="preserve">https://doi.org/gsxq6b</w:t>
-        </w:r>
-      </w:hyperlink>
-      <w:r>
-        <w:t xml:space="preserve"> </w:t>
-      </w:r>
-      <w:r>
-        <w:t xml:space="preserve">DOI:</w:t>
-      </w:r>
-      <w:r>
-        <w:t xml:space="preserve"> </w:t>
-      </w:r>
-      <w:hyperlink r:id="rId51">
-        <w:r>
-          <w:rPr>
-            <w:rStyle w:val="Hyperlink"/>
-          </w:rPr>
-          <w:t xml:space="preserve">10.1093/gigascience/giac105</w:t>
-        </w:r>
-      </w:hyperlink>
-      <w:r>
-        <w:t xml:space="preserve"> </w:t>
-      </w:r>
-      <w:r>
-        <w:t xml:space="preserve">· PMID:</w:t>
-      </w:r>
-      <w:r>
-        <w:t xml:space="preserve"> </w:t>
-      </w:r>
-      <w:hyperlink r:id="rId52">
-        <w:r>
-          <w:rPr>
-            <w:rStyle w:val="Hyperlink"/>
-          </w:rPr>
-          <w:t xml:space="preserve">36409836</w:t>
-        </w:r>
-      </w:hyperlink>
-      <w:r>
-        <w:t xml:space="preserve"> </w:t>
-      </w:r>
-      <w:r>
-        <w:t xml:space="preserve">· PMCID:</w:t>
-      </w:r>
-      <w:r>
-        <w:t xml:space="preserve"> </w:t>
-      </w:r>
-      <w:hyperlink r:id="rId53">
-        <w:r>
-          <w:rPr>
-            <w:rStyle w:val="Hyperlink"/>
-          </w:rPr>
-          <w:t xml:space="preserve">PMC9677336</w:t>
-        </w:r>
-      </w:hyperlink>
+        <w:t xml:space="preserve">11</w:t>
+      </w:r>
     </w:p>
-    <w:bookmarkEnd w:id="54"/>
-    <w:bookmarkStart w:id="56" w:name="X7a93631224c49a632e3119c84b1b3a6b629c733"/>
+    <w:bookmarkEnd w:id="44"/>
+    <w:bookmarkStart w:id="46" w:name="X7a93631224c49a632e3119c84b1b3a6b629c733"/>
     <w:p>
       <w:pPr>
         <w:pStyle w:val="Bibliography"/>
@@ -9149,7 +8978,13 @@
       <w:r>
         <w:t xml:space="preserve">	</w:t>
       </w:r>
-      <w:hyperlink r:id="rId55">
+      <w:r>
+        <w:t xml:space="preserve">[Online]. Available:</w:t>
+      </w:r>
+      <w:r>
+        <w:t xml:space="preserve"> </w:t>
+      </w:r>
+      <w:hyperlink r:id="rId45">
         <w:r>
           <w:rPr>
             <w:rStyle w:val="Hyperlink"/>
@@ -9158,8 +8993,8 @@
         </w:r>
       </w:hyperlink>
     </w:p>
-    <w:bookmarkEnd w:id="56"/>
-    <w:bookmarkStart w:id="57" w:name="ref-isbn:9780471465102"/>
+    <w:bookmarkEnd w:id="46"/>
+    <w:bookmarkStart w:id="47" w:name="ref-isbn:9780471465102"/>
     <w:p>
       <w:pPr>
         <w:pStyle w:val="Bibliography"/>
@@ -9174,17 +9009,7 @@
         <w:t xml:space="preserve">	</w:t>
       </w:r>
       <w:r>
-        <w:rPr>
-          <w:b/>
-          <w:bCs/>
-        </w:rPr>
-        <w:t xml:space="preserve">Decisions with multiple objectives: preferences and value tradeoffs</w:t>
-      </w:r>
-      <w:r>
-        <w:t xml:space="preserve"> </w:t>
-      </w:r>
-      <w:r>
-        <w:t xml:space="preserve">Ralph L Keeney, Howard Raiffa</w:t>
+        <w:t xml:space="preserve">Keeney, R.L. and Raiffa, H. (1976)</w:t>
       </w:r>
       <w:r>
         <w:t xml:space="preserve"> </w:t>
@@ -9194,23 +9019,14 @@
           <w:i/>
           <w:iCs/>
         </w:rPr>
-        <w:t xml:space="preserve">Wiley</w:t>
-      </w:r>
-      <w:r>
-        <w:t xml:space="preserve"> </w:t>
-      </w:r>
-      <w:r>
-        <w:t xml:space="preserve">(1976)</w:t>
-      </w:r>
-      <w:r>
-        <w:t xml:space="preserve"> </w:t>
-      </w:r>
-      <w:r>
-        <w:t xml:space="preserve">ISBN: 9780471465102</w:t>
+        <w:t xml:space="preserve">Decisions with multiple objectives: preferences and value tradeoffs</w:t>
+      </w:r>
+      <w:r>
+        <w:t xml:space="preserve">, Wiley</w:t>
       </w:r>
     </w:p>
-    <w:bookmarkEnd w:id="57"/>
-    <w:bookmarkStart w:id="58" w:name="ref-isbn:9780792375067"/>
+    <w:bookmarkEnd w:id="47"/>
+    <w:bookmarkStart w:id="48" w:name="ref-isbn:9780792375067"/>
     <w:p>
       <w:pPr>
         <w:pStyle w:val="Bibliography"/>
@@ -9225,17 +9041,7 @@
         <w:t xml:space="preserve">	</w:t>
       </w:r>
       <w:r>
-        <w:rPr>
-          <w:b/>
-          <w:bCs/>
-        </w:rPr>
-        <w:t xml:space="preserve">Advances in information security management &amp; small systems security: IFIP TC11 WG11.1/WG11.2 Eighth Annual Working Conference on Information Security Management &amp; Small Systems Security, September 27-28, 2001, Las Vegas, Nevada, USA</w:t>
-      </w:r>
-      <w:r>
-        <w:t xml:space="preserve"> </w:t>
-      </w:r>
-      <w:r>
-        <w:t xml:space="preserve">Jan HP Eloff (editor)</w:t>
+        <w:t xml:space="preserve">Eloff, J.H.P., ed. (2001)</w:t>
       </w:r>
       <w:r>
         <w:t xml:space="preserve"> </w:t>
@@ -9245,23 +9051,14 @@
           <w:i/>
           <w:iCs/>
         </w:rPr>
-        <w:t xml:space="preserve">Kluwer Academic Publishers</w:t>
-      </w:r>
-      <w:r>
-        <w:t xml:space="preserve"> </w:t>
-      </w:r>
-      <w:r>
-        <w:t xml:space="preserve">(2001)</w:t>
-      </w:r>
-      <w:r>
-        <w:t xml:space="preserve"> </w:t>
-      </w:r>
-      <w:r>
-        <w:t xml:space="preserve">ISBN: 9780792375067</w:t>
+        <w:t xml:space="preserve">Advances in information security management &amp; small systems security: IFIP TC11 WG11.1/WG11.2 Eighth Annual Working Conference on Information Security Management &amp; Small Systems Security, September 27-28, 2001, Las Vegas, Nevada, USA</w:t>
+      </w:r>
+      <w:r>
+        <w:t xml:space="preserve">, Kluwer Academic Publishers</w:t>
       </w:r>
     </w:p>
-    <w:bookmarkEnd w:id="58"/>
-    <w:bookmarkStart w:id="63" w:name="ref-doi:10.1038/sdata.2016.18"/>
+    <w:bookmarkEnd w:id="48"/>
+    <w:bookmarkStart w:id="50" w:name="ref-doi:10.1038/sdata.2016.18"/>
     <w:p>
       <w:pPr>
         <w:pStyle w:val="Bibliography"/>
@@ -9276,17 +9073,7 @@
         <w:t xml:space="preserve">	</w:t>
       </w:r>
       <w:r>
-        <w:rPr>
-          <w:b/>
-          <w:bCs/>
-        </w:rPr>
-        <w:t xml:space="preserve">The FAIR Guiding Principles for scientific data management and stewardship</w:t>
-      </w:r>
-      <w:r>
-        <w:t xml:space="preserve"> </w:t>
-      </w:r>
-      <w:r>
-        <w:t xml:space="preserve">Mark D Wilkinson, Michel Dumontier, IJsbrand Jan Aalbersberg, Gabrielle Appleton, Myles Axton, Arie Baak, Niklas Blomberg, Jan-Willem Boiten, Luiz Bonino da Silva Santos, Philip E Bourne, … Barend Mons</w:t>
+        <w:t xml:space="preserve">Wilkinson, M.D.</w:t>
       </w:r>
       <w:r>
         <w:t xml:space="preserve"> </w:t>
@@ -9296,13 +9083,338 @@
           <w:i/>
           <w:iCs/>
         </w:rPr>
-        <w:t xml:space="preserve">Scientific Data</w:t>
-      </w:r>
-      <w:r>
-        <w:t xml:space="preserve"> </w:t>
-      </w:r>
-      <w:r>
-        <w:t xml:space="preserve">(2016-03-15)</w:t>
+        <w:t xml:space="preserve">et al.</w:t>
+      </w:r>
+      <w:r>
+        <w:t xml:space="preserve"> </w:t>
+      </w:r>
+      <w:r>
+        <w:t xml:space="preserve">(2016)</w:t>
+      </w:r>
+      <w:r>
+        <w:t xml:space="preserve"> </w:t>
+      </w:r>
+      <w:hyperlink r:id="rId49">
+        <w:r>
+          <w:rPr>
+            <w:rStyle w:val="Hyperlink"/>
+          </w:rPr>
+          <w:t xml:space="preserve">The FAIR Guiding Principles for scientific data management and stewardship</w:t>
+        </w:r>
+      </w:hyperlink>
+      <w:r>
+        <w:t xml:space="preserve">.</w:t>
+      </w:r>
+      <w:r>
+        <w:t xml:space="preserve"> </w:t>
+      </w:r>
+      <w:r>
+        <w:rPr>
+          <w:i/>
+          <w:iCs/>
+        </w:rPr>
+        <w:t xml:space="preserve">Sci Data</w:t>
+      </w:r>
+      <w:r>
+        <w:t xml:space="preserve"> </w:t>
+      </w:r>
+      <w:r>
+        <w:t xml:space="preserve">3</w:t>
+      </w:r>
+    </w:p>
+    <w:bookmarkEnd w:id="50"/>
+    <w:bookmarkStart w:id="52" w:name="ref-doi:10.1038/sdata.2018.118"/>
+    <w:p>
+      <w:pPr>
+        <w:pStyle w:val="Bibliography"/>
+      </w:pPr>
+      <w:r>
+        <w:t xml:space="preserve">9.</w:t>
+      </w:r>
+      <w:r>
+        <w:t xml:space="preserve"> </w:t>
+      </w:r>
+      <w:r>
+        <w:t xml:space="preserve">	</w:t>
+      </w:r>
+      <w:r>
+        <w:t xml:space="preserve">Wilkinson, M.D.</w:t>
+      </w:r>
+      <w:r>
+        <w:t xml:space="preserve"> </w:t>
+      </w:r>
+      <w:r>
+        <w:rPr>
+          <w:i/>
+          <w:iCs/>
+        </w:rPr>
+        <w:t xml:space="preserve">et al.</w:t>
+      </w:r>
+      <w:r>
+        <w:t xml:space="preserve"> </w:t>
+      </w:r>
+      <w:r>
+        <w:t xml:space="preserve">(2018)</w:t>
+      </w:r>
+      <w:r>
+        <w:t xml:space="preserve"> </w:t>
+      </w:r>
+      <w:hyperlink r:id="rId51">
+        <w:r>
+          <w:rPr>
+            <w:rStyle w:val="Hyperlink"/>
+          </w:rPr>
+          <w:t xml:space="preserve">A design framework and exemplar metrics for FAIRness</w:t>
+        </w:r>
+      </w:hyperlink>
+      <w:r>
+        <w:t xml:space="preserve">.</w:t>
+      </w:r>
+      <w:r>
+        <w:t xml:space="preserve"> </w:t>
+      </w:r>
+      <w:r>
+        <w:rPr>
+          <w:i/>
+          <w:iCs/>
+        </w:rPr>
+        <w:t xml:space="preserve">Sci Data</w:t>
+      </w:r>
+      <w:r>
+        <w:t xml:space="preserve"> </w:t>
+      </w:r>
+      <w:r>
+        <w:t xml:space="preserve">5</w:t>
+      </w:r>
+    </w:p>
+    <w:bookmarkEnd w:id="52"/>
+    <w:bookmarkStart w:id="54" w:name="ref-doi:10.1371/journal.pone.0311493"/>
+    <w:p>
+      <w:pPr>
+        <w:pStyle w:val="Bibliography"/>
+      </w:pPr>
+      <w:r>
+        <w:t xml:space="preserve">10.</w:t>
+      </w:r>
+      <w:r>
+        <w:t xml:space="preserve"> </w:t>
+      </w:r>
+      <w:r>
+        <w:t xml:space="preserve">	</w:t>
+      </w:r>
+      <w:r>
+        <w:t xml:space="preserve">Colavizza, G.</w:t>
+      </w:r>
+      <w:r>
+        <w:t xml:space="preserve"> </w:t>
+      </w:r>
+      <w:r>
+        <w:rPr>
+          <w:i/>
+          <w:iCs/>
+        </w:rPr>
+        <w:t xml:space="preserve">et al.</w:t>
+      </w:r>
+      <w:r>
+        <w:t xml:space="preserve"> </w:t>
+      </w:r>
+      <w:r>
+        <w:t xml:space="preserve">(2024)</w:t>
+      </w:r>
+      <w:r>
+        <w:t xml:space="preserve"> </w:t>
+      </w:r>
+      <w:hyperlink r:id="rId53">
+        <w:r>
+          <w:rPr>
+            <w:rStyle w:val="Hyperlink"/>
+          </w:rPr>
+          <w:t xml:space="preserve">An analysis of the effects of sharing research data, code, and preprints on citations</w:t>
+        </w:r>
+      </w:hyperlink>
+      <w:r>
+        <w:t xml:space="preserve">.</w:t>
+      </w:r>
+      <w:r>
+        <w:t xml:space="preserve"> </w:t>
+      </w:r>
+      <w:r>
+        <w:rPr>
+          <w:i/>
+          <w:iCs/>
+        </w:rPr>
+        <w:t xml:space="preserve">PLoS ONE</w:t>
+      </w:r>
+      <w:r>
+        <w:t xml:space="preserve"> </w:t>
+      </w:r>
+      <w:r>
+        <w:t xml:space="preserve">19, e0311493</w:t>
+      </w:r>
+    </w:p>
+    <w:bookmarkEnd w:id="54"/>
+    <w:bookmarkStart w:id="56" w:name="ref-doi:10.1038/520429a"/>
+    <w:p>
+      <w:pPr>
+        <w:pStyle w:val="Bibliography"/>
+      </w:pPr>
+      <w:r>
+        <w:t xml:space="preserve">11.</w:t>
+      </w:r>
+      <w:r>
+        <w:t xml:space="preserve"> </w:t>
+      </w:r>
+      <w:r>
+        <w:t xml:space="preserve">	</w:t>
+      </w:r>
+      <w:r>
+        <w:t xml:space="preserve">Hicks, D.</w:t>
+      </w:r>
+      <w:r>
+        <w:t xml:space="preserve"> </w:t>
+      </w:r>
+      <w:r>
+        <w:rPr>
+          <w:i/>
+          <w:iCs/>
+        </w:rPr>
+        <w:t xml:space="preserve">et al.</w:t>
+      </w:r>
+      <w:r>
+        <w:t xml:space="preserve"> </w:t>
+      </w:r>
+      <w:r>
+        <w:t xml:space="preserve">(2015)</w:t>
+      </w:r>
+      <w:r>
+        <w:t xml:space="preserve"> </w:t>
+      </w:r>
+      <w:hyperlink r:id="rId55">
+        <w:r>
+          <w:rPr>
+            <w:rStyle w:val="Hyperlink"/>
+          </w:rPr>
+          <w:t xml:space="preserve">Bibliometrics: The Leiden Manifesto for research metrics</w:t>
+        </w:r>
+      </w:hyperlink>
+      <w:r>
+        <w:t xml:space="preserve">.</w:t>
+      </w:r>
+      <w:r>
+        <w:t xml:space="preserve"> </w:t>
+      </w:r>
+      <w:r>
+        <w:rPr>
+          <w:i/>
+          <w:iCs/>
+        </w:rPr>
+        <w:t xml:space="preserve">Nature</w:t>
+      </w:r>
+      <w:r>
+        <w:t xml:space="preserve"> </w:t>
+      </w:r>
+      <w:r>
+        <w:t xml:space="preserve">520, 429–431</w:t>
+      </w:r>
+    </w:p>
+    <w:bookmarkEnd w:id="56"/>
+    <w:bookmarkStart w:id="58" w:name="ref-doi:10.4103/1008-682X.171582"/>
+    <w:p>
+      <w:pPr>
+        <w:pStyle w:val="Bibliography"/>
+      </w:pPr>
+      <w:r>
+        <w:t xml:space="preserve">12.</w:t>
+      </w:r>
+      <w:r>
+        <w:t xml:space="preserve"> </w:t>
+      </w:r>
+      <w:r>
+        <w:t xml:space="preserve">	</w:t>
+      </w:r>
+      <w:r>
+        <w:t xml:space="preserve">Agarwal, A.</w:t>
+      </w:r>
+      <w:r>
+        <w:t xml:space="preserve"> </w:t>
+      </w:r>
+      <w:r>
+        <w:rPr>
+          <w:i/>
+          <w:iCs/>
+        </w:rPr>
+        <w:t xml:space="preserve">et al.</w:t>
+      </w:r>
+      <w:r>
+        <w:t xml:space="preserve"> </w:t>
+      </w:r>
+      <w:r>
+        <w:t xml:space="preserve">(2016)</w:t>
+      </w:r>
+      <w:r>
+        <w:t xml:space="preserve"> </w:t>
+      </w:r>
+      <w:hyperlink r:id="rId57">
+        <w:r>
+          <w:rPr>
+            <w:rStyle w:val="Hyperlink"/>
+          </w:rPr>
+          <w:t xml:space="preserve">Bibliometrics: tracking research impact by selecting the appropriate metrics</w:t>
+        </w:r>
+      </w:hyperlink>
+      <w:r>
+        <w:t xml:space="preserve">.</w:t>
+      </w:r>
+      <w:r>
+        <w:t xml:space="preserve"> </w:t>
+      </w:r>
+      <w:r>
+        <w:rPr>
+          <w:i/>
+          <w:iCs/>
+        </w:rPr>
+        <w:t xml:space="preserve">Asian J Androl</w:t>
+      </w:r>
+      <w:r>
+        <w:t xml:space="preserve"> </w:t>
+      </w:r>
+      <w:r>
+        <w:t xml:space="preserve">18, 296</w:t>
+      </w:r>
+    </w:p>
+    <w:bookmarkEnd w:id="58"/>
+    <w:bookmarkStart w:id="60" w:name="ref-doi:10.1101/2023.09.12.557386"/>
+    <w:p>
+      <w:pPr>
+        <w:pStyle w:val="Bibliography"/>
+      </w:pPr>
+      <w:r>
+        <w:t xml:space="preserve">13.</w:t>
+      </w:r>
+      <w:r>
+        <w:t xml:space="preserve"> </w:t>
+      </w:r>
+      <w:r>
+        <w:t xml:space="preserve">	</w:t>
+      </w:r>
+      <w:r>
+        <w:t xml:space="preserve">Emissah, H.</w:t>
+      </w:r>
+      <w:r>
+        <w:t xml:space="preserve"> </w:t>
+      </w:r>
+      <w:r>
+        <w:rPr>
+          <w:i/>
+          <w:iCs/>
+        </w:rPr>
+        <w:t xml:space="preserve">et al.</w:t>
+      </w:r>
+      <w:r>
+        <w:t xml:space="preserve"> </w:t>
+      </w:r>
+      <w:r>
+        <w:t xml:space="preserve">(2023)</w:t>
       </w:r>
       <w:r>
         <w:t xml:space="preserve"> </w:t>
@@ -9312,31 +9424,30 @@
           <w:rPr>
             <w:rStyle w:val="Hyperlink"/>
           </w:rPr>
-          <w:t xml:space="preserve">https://doi.org/bdd4</w:t>
+          <w:t xml:space="preserve">Bibliometric analysis of neuroscience publications quantifies the impact of data sharing</w:t>
         </w:r>
       </w:hyperlink>
       <w:r>
-        <w:t xml:space="preserve"> </w:t>
-      </w:r>
-      <w:r>
-        <w:t xml:space="preserve">DOI:</w:t>
-      </w:r>
-      <w:r>
-        <w:t xml:space="preserve"> </w:t>
-      </w:r>
-      <w:hyperlink r:id="rId60">
-        <w:r>
-          <w:rPr>
-            <w:rStyle w:val="Hyperlink"/>
-          </w:rPr>
-          <w:t xml:space="preserve">10.1038/sdata.2016.18</w:t>
-        </w:r>
-      </w:hyperlink>
-      <w:r>
-        <w:t xml:space="preserve"> </w:t>
-      </w:r>
-      <w:r>
-        <w:t xml:space="preserve">· PMID:</w:t>
+        <w:t xml:space="preserve">openRxiv</w:t>
+      </w:r>
+    </w:p>
+    <w:bookmarkEnd w:id="60"/>
+    <w:bookmarkStart w:id="62" w:name="ref-doi:10.2196/63544"/>
+    <w:p>
+      <w:pPr>
+        <w:pStyle w:val="Bibliography"/>
+      </w:pPr>
+      <w:r>
+        <w:t xml:space="preserve">14.</w:t>
+      </w:r>
+      <w:r>
+        <w:t xml:space="preserve"> </w:t>
+      </w:r>
+      <w:r>
+        <w:t xml:space="preserve">	</w:t>
+      </w:r>
+      <w:r>
+        <w:t xml:space="preserve">Wang, D. and Liu, Y. (2025)</w:t>
       </w:r>
       <w:r>
         <w:t xml:space="preserve"> </w:t>
@@ -9346,35 +9457,86 @@
           <w:rPr>
             <w:rStyle w:val="Hyperlink"/>
           </w:rPr>
-          <w:t xml:space="preserve">26978244</w:t>
+          <w:t xml:space="preserve">Medical Science Data Value Evaluation Model: Mixed Methods Study</w:t>
         </w:r>
       </w:hyperlink>
       <w:r>
-        <w:t xml:space="preserve"> </w:t>
-      </w:r>
-      <w:r>
-        <w:t xml:space="preserve">· PMCID:</w:t>
-      </w:r>
-      <w:r>
-        <w:t xml:space="preserve"> </w:t>
-      </w:r>
-      <w:hyperlink r:id="rId62">
+        <w:t xml:space="preserve">.</w:t>
+      </w:r>
+      <w:r>
+        <w:t xml:space="preserve"> </w:t>
+      </w:r>
+      <w:r>
+        <w:rPr>
+          <w:i/>
+          <w:iCs/>
+        </w:rPr>
+        <w:t xml:space="preserve">JMIR Med Inform</w:t>
+      </w:r>
+      <w:r>
+        <w:t xml:space="preserve"> </w:t>
+      </w:r>
+      <w:r>
+        <w:t xml:space="preserve">13, e63544–e63544</w:t>
+      </w:r>
+    </w:p>
+    <w:bookmarkEnd w:id="62"/>
+    <w:bookmarkStart w:id="64" w:name="ref-doi:10.15265/IY-2014-0020"/>
+    <w:p>
+      <w:pPr>
+        <w:pStyle w:val="Bibliography"/>
+      </w:pPr>
+      <w:r>
+        <w:t xml:space="preserve">15.</w:t>
+      </w:r>
+      <w:r>
+        <w:t xml:space="preserve"> </w:t>
+      </w:r>
+      <w:r>
+        <w:t xml:space="preserve">	</w:t>
+      </w:r>
+      <w:r>
+        <w:t xml:space="preserve">Verspoor, K. and Martin-Sanchez, F. (2014)</w:t>
+      </w:r>
+      <w:r>
+        <w:t xml:space="preserve"> </w:t>
+      </w:r>
+      <w:hyperlink r:id="rId63">
         <w:r>
           <w:rPr>
             <w:rStyle w:val="Hyperlink"/>
           </w:rPr>
-          <w:t xml:space="preserve">PMC4792175</w:t>
+          <w:t xml:space="preserve">Big Data in Medicine Is Driving Big Changes</w:t>
         </w:r>
       </w:hyperlink>
+      <w:r>
+        <w:t xml:space="preserve">.</w:t>
+      </w:r>
+      <w:r>
+        <w:t xml:space="preserve"> </w:t>
+      </w:r>
+      <w:r>
+        <w:rPr>
+          <w:i/>
+          <w:iCs/>
+        </w:rPr>
+        <w:t xml:space="preserve">Yearb Med Inform</w:t>
+      </w:r>
+      <w:r>
+        <w:t xml:space="preserve"> </w:t>
+      </w:r>
+      <w:r>
+        <w:t xml:space="preserve">23, 14–20</w:t>
+      </w:r>
     </w:p>
-    <w:bookmarkEnd w:id="63"/>
-    <w:bookmarkStart w:id="68" w:name="ref-doi:10.1038/sdata.2018.118"/>
+    <w:bookmarkEnd w:id="64"/>
+    <w:bookmarkStart w:id="66" w:name="ref-doi:10.1371/journal.pone.0229003"/>
     <w:p>
       <w:pPr>
         <w:pStyle w:val="Bibliography"/>
       </w:pPr>
       <w:r>
-        <w:t xml:space="preserve">9.</w:t>
+        <w:t xml:space="preserve">16.</w:t>
       </w:r>
       <w:r>
         <w:t xml:space="preserve"> </w:t>
@@ -9383,17 +9545,7 @@
         <w:t xml:space="preserve">	</w:t>
       </w:r>
       <w:r>
-        <w:rPr>
-          <w:b/>
-          <w:bCs/>
-        </w:rPr>
-        <w:t xml:space="preserve">A design framework and exemplar metrics for FAIRness</w:t>
-      </w:r>
-      <w:r>
-        <w:t xml:space="preserve"> </w:t>
-      </w:r>
-      <w:r>
-        <w:t xml:space="preserve">Mark D Wilkinson, Susanna-Assunta Sansone, Erik Schultes, Peter Doorn, Luiz Olavo Bonino da Silva Santos, Michel Dumontier</w:t>
+        <w:t xml:space="preserve">Tenopir, C.</w:t>
       </w:r>
       <w:r>
         <w:t xml:space="preserve"> </w:t>
@@ -9403,30 +9555,13 @@
           <w:i/>
           <w:iCs/>
         </w:rPr>
-        <w:t xml:space="preserve">Scientific Data</w:t>
-      </w:r>
-      <w:r>
-        <w:t xml:space="preserve"> </w:t>
-      </w:r>
-      <w:r>
-        <w:t xml:space="preserve">(2018-06-26)</w:t>
-      </w:r>
-      <w:r>
-        <w:t xml:space="preserve"> </w:t>
-      </w:r>
-      <w:hyperlink r:id="rId64">
-        <w:r>
-          <w:rPr>
-            <w:rStyle w:val="Hyperlink"/>
-          </w:rPr>
-          <w:t xml:space="preserve">https://doi.org/gfkrrt</w:t>
-        </w:r>
-      </w:hyperlink>
-      <w:r>
-        <w:t xml:space="preserve"> </w:t>
-      </w:r>
-      <w:r>
-        <w:t xml:space="preserve">DOI:</w:t>
+        <w:t xml:space="preserve">et al.</w:t>
+      </w:r>
+      <w:r>
+        <w:t xml:space="preserve"> </w:t>
+      </w:r>
+      <w:r>
+        <w:t xml:space="preserve">(2020)</w:t>
       </w:r>
       <w:r>
         <w:t xml:space="preserve"> </w:t>
@@ -9436,31 +9571,62 @@
           <w:rPr>
             <w:rStyle w:val="Hyperlink"/>
           </w:rPr>
-          <w:t xml:space="preserve">10.1038/sdata.2018.118</w:t>
+          <w:t xml:space="preserve">Data sharing, management, use, and reuse: Practices and perceptions of scientists worldwide</w:t>
         </w:r>
       </w:hyperlink>
       <w:r>
-        <w:t xml:space="preserve"> </w:t>
-      </w:r>
-      <w:r>
-        <w:t xml:space="preserve">· PMID:</w:t>
-      </w:r>
-      <w:r>
-        <w:t xml:space="preserve"> </w:t>
-      </w:r>
-      <w:hyperlink r:id="rId66">
-        <w:r>
-          <w:rPr>
-            <w:rStyle w:val="Hyperlink"/>
-          </w:rPr>
-          <w:t xml:space="preserve">29944145</w:t>
-        </w:r>
-      </w:hyperlink>
-      <w:r>
-        <w:t xml:space="preserve"> </w:t>
-      </w:r>
-      <w:r>
-        <w:t xml:space="preserve">· PMCID:</w:t>
+        <w:t xml:space="preserve">.</w:t>
+      </w:r>
+      <w:r>
+        <w:t xml:space="preserve"> </w:t>
+      </w:r>
+      <w:r>
+        <w:rPr>
+          <w:i/>
+          <w:iCs/>
+        </w:rPr>
+        <w:t xml:space="preserve">PLoS ONE</w:t>
+      </w:r>
+      <w:r>
+        <w:t xml:space="preserve"> </w:t>
+      </w:r>
+      <w:r>
+        <w:t xml:space="preserve">15, e0229003</w:t>
+      </w:r>
+    </w:p>
+    <w:bookmarkEnd w:id="66"/>
+    <w:bookmarkStart w:id="68" w:name="ref-doi:10.15585/mmwr.su7303a1"/>
+    <w:p>
+      <w:pPr>
+        <w:pStyle w:val="Bibliography"/>
+      </w:pPr>
+      <w:r>
+        <w:t xml:space="preserve">17.</w:t>
+      </w:r>
+      <w:r>
+        <w:t xml:space="preserve"> </w:t>
+      </w:r>
+      <w:r>
+        <w:t xml:space="preserve">	</w:t>
+      </w:r>
+      <w:r>
+        <w:t xml:space="preserve">El Burai Felix, S.</w:t>
+      </w:r>
+      <w:r>
+        <w:t xml:space="preserve"> </w:t>
+      </w:r>
+      <w:r>
+        <w:rPr>
+          <w:i/>
+          <w:iCs/>
+        </w:rPr>
+        <w:t xml:space="preserve">et al.</w:t>
+      </w:r>
+      <w:r>
+        <w:t xml:space="preserve"> </w:t>
+      </w:r>
+      <w:r>
+        <w:t xml:space="preserve">(2024)</w:t>
       </w:r>
       <w:r>
         <w:t xml:space="preserve"> </w:t>
@@ -9470,18 +9636,37 @@
           <w:rPr>
             <w:rStyle w:val="Hyperlink"/>
           </w:rPr>
-          <w:t xml:space="preserve">PMC6018520</w:t>
+          <w:t xml:space="preserve">A Standard Framework for Evaluating Large Health Care Data and Related Resources</w:t>
         </w:r>
       </w:hyperlink>
+      <w:r>
+        <w:t xml:space="preserve">.</w:t>
+      </w:r>
+      <w:r>
+        <w:t xml:space="preserve"> </w:t>
+      </w:r>
+      <w:r>
+        <w:rPr>
+          <w:i/>
+          <w:iCs/>
+        </w:rPr>
+        <w:t xml:space="preserve">MMWR Suppl.</w:t>
+      </w:r>
+      <w:r>
+        <w:t xml:space="preserve"> </w:t>
+      </w:r>
+      <w:r>
+        <w:t xml:space="preserve">73, 1–13</w:t>
+      </w:r>
     </w:p>
     <w:bookmarkEnd w:id="68"/>
-    <w:bookmarkStart w:id="73" w:name="ref-doi:10.1371/journal.pone.0311493"/>
+    <w:bookmarkStart w:id="70" w:name="ref-doi:10.1038/nbt.3780"/>
     <w:p>
       <w:pPr>
         <w:pStyle w:val="Bibliography"/>
       </w:pPr>
       <w:r>
-        <w:t xml:space="preserve">10.</w:t>
+        <w:t xml:space="preserve">18.</w:t>
       </w:r>
       <w:r>
         <w:t xml:space="preserve"> </w:t>
@@ -9490,33 +9675,7 @@
         <w:t xml:space="preserve">	</w:t>
       </w:r>
       <w:r>
-        <w:rPr>
-          <w:b/>
-          <w:bCs/>
-        </w:rPr>
-        <w:t xml:space="preserve">An analysis of the effects of sharing research data, code, and preprints on citations</w:t>
-      </w:r>
-      <w:r>
-        <w:t xml:space="preserve"> </w:t>
-      </w:r>
-      <w:r>
-        <w:t xml:space="preserve">Giovanni Colavizza, Lauren Cadwallader, Marcel LaFlamme, Grégory Dozot, Stéphane Lecorney, Daniel Rappo, Iain Hrynaszkiewicz</w:t>
-      </w:r>
-      <w:r>
-        <w:t xml:space="preserve"> </w:t>
-      </w:r>
-      <w:r>
-        <w:rPr>
-          <w:i/>
-          <w:iCs/>
-        </w:rPr>
-        <w:t xml:space="preserve">PLOS ONE</w:t>
-      </w:r>
-      <w:r>
-        <w:t xml:space="preserve"> </w:t>
-      </w:r>
-      <w:r>
-        <w:t xml:space="preserve">(2024-10-30)</w:t>
+        <w:t xml:space="preserve">Beaulieu-Jones, B.K. and Greene, C.S. (2017)</w:t>
       </w:r>
       <w:r>
         <w:t xml:space="preserve"> </w:t>
@@ -9526,31 +9685,62 @@
           <w:rPr>
             <w:rStyle w:val="Hyperlink"/>
           </w:rPr>
-          <w:t xml:space="preserve">https://doi.org/g8p57w</w:t>
+          <w:t xml:space="preserve">Reproducibility of computational workflows is automated using continuous analysis</w:t>
         </w:r>
       </w:hyperlink>
       <w:r>
-        <w:t xml:space="preserve"> </w:t>
-      </w:r>
-      <w:r>
-        <w:t xml:space="preserve">DOI:</w:t>
-      </w:r>
-      <w:r>
-        <w:t xml:space="preserve"> </w:t>
-      </w:r>
-      <w:hyperlink r:id="rId70">
-        <w:r>
-          <w:rPr>
-            <w:rStyle w:val="Hyperlink"/>
-          </w:rPr>
-          <w:t xml:space="preserve">10.1371/journal.pone.0311493</w:t>
-        </w:r>
-      </w:hyperlink>
-      <w:r>
-        <w:t xml:space="preserve"> </w:t>
-      </w:r>
-      <w:r>
-        <w:t xml:space="preserve">· PMID:</w:t>
+        <w:t xml:space="preserve">.</w:t>
+      </w:r>
+      <w:r>
+        <w:t xml:space="preserve"> </w:t>
+      </w:r>
+      <w:r>
+        <w:rPr>
+          <w:i/>
+          <w:iCs/>
+        </w:rPr>
+        <w:t xml:space="preserve">Nat Biotechnol</w:t>
+      </w:r>
+      <w:r>
+        <w:t xml:space="preserve"> </w:t>
+      </w:r>
+      <w:r>
+        <w:t xml:space="preserve">35, 342–346</w:t>
+      </w:r>
+    </w:p>
+    <w:bookmarkEnd w:id="70"/>
+    <w:bookmarkStart w:id="72" w:name="ref-doi:10.1186/gb-2004-5-10-r80"/>
+    <w:p>
+      <w:pPr>
+        <w:pStyle w:val="Bibliography"/>
+      </w:pPr>
+      <w:r>
+        <w:t xml:space="preserve">19.</w:t>
+      </w:r>
+      <w:r>
+        <w:t xml:space="preserve"> </w:t>
+      </w:r>
+      <w:r>
+        <w:t xml:space="preserve">	</w:t>
+      </w:r>
+      <w:r>
+        <w:t xml:space="preserve">Gentleman, R.C.</w:t>
+      </w:r>
+      <w:r>
+        <w:t xml:space="preserve"> </w:t>
+      </w:r>
+      <w:r>
+        <w:rPr>
+          <w:i/>
+          <w:iCs/>
+        </w:rPr>
+        <w:t xml:space="preserve">et al.</w:t>
+      </w:r>
+      <w:r>
+        <w:t xml:space="preserve"> </w:t>
+      </w:r>
+      <w:r>
+        <w:t xml:space="preserve">(2004)</w:t>
       </w:r>
       <w:r>
         <w:t xml:space="preserve"> </w:t>
@@ -9560,35 +9750,102 @@
           <w:rPr>
             <w:rStyle w:val="Hyperlink"/>
           </w:rPr>
-          <w:t xml:space="preserve">39475849</w:t>
+          <w:t xml:space="preserve">Bioconductor: open software development for computational biology and bioinformatics</w:t>
         </w:r>
       </w:hyperlink>
       <w:r>
-        <w:t xml:space="preserve"> </w:t>
-      </w:r>
-      <w:r>
-        <w:t xml:space="preserve">· PMCID:</w:t>
-      </w:r>
-      <w:r>
-        <w:t xml:space="preserve"> </w:t>
-      </w:r>
-      <w:hyperlink r:id="rId72">
+        <w:t xml:space="preserve">.</w:t>
+      </w:r>
+      <w:r>
+        <w:t xml:space="preserve"> </w:t>
+      </w:r>
+      <w:r>
+        <w:rPr>
+          <w:i/>
+          <w:iCs/>
+        </w:rPr>
+        <w:t xml:space="preserve">Genome Biol</w:t>
+      </w:r>
+      <w:r>
+        <w:t xml:space="preserve"> </w:t>
+      </w:r>
+      <w:r>
+        <w:t xml:space="preserve">5</w:t>
+      </w:r>
+    </w:p>
+    <w:bookmarkEnd w:id="72"/>
+    <w:bookmarkStart w:id="74" w:name="ref-doi:10.12688/f1000research.9206.1"/>
+    <w:p>
+      <w:pPr>
+        <w:pStyle w:val="Bibliography"/>
+      </w:pPr>
+      <w:r>
+        <w:t xml:space="preserve">20.</w:t>
+      </w:r>
+      <w:r>
+        <w:t xml:space="preserve"> </w:t>
+      </w:r>
+      <w:r>
+        <w:t xml:space="preserve">	</w:t>
+      </w:r>
+      <w:r>
+        <w:t xml:space="preserve">Artaza, H.</w:t>
+      </w:r>
+      <w:r>
+        <w:t xml:space="preserve"> </w:t>
+      </w:r>
+      <w:r>
+        <w:rPr>
+          <w:i/>
+          <w:iCs/>
+        </w:rPr>
+        <w:t xml:space="preserve">et al.</w:t>
+      </w:r>
+      <w:r>
+        <w:t xml:space="preserve"> </w:t>
+      </w:r>
+      <w:r>
+        <w:t xml:space="preserve">(2016)</w:t>
+      </w:r>
+      <w:r>
+        <w:t xml:space="preserve"> </w:t>
+      </w:r>
+      <w:hyperlink r:id="rId73">
         <w:r>
           <w:rPr>
             <w:rStyle w:val="Hyperlink"/>
           </w:rPr>
-          <w:t xml:space="preserve">PMC11524460</w:t>
+          <w:t xml:space="preserve">Top 10 metrics for life science software good practices</w:t>
         </w:r>
       </w:hyperlink>
+      <w:r>
+        <w:t xml:space="preserve">.</w:t>
+      </w:r>
+      <w:r>
+        <w:t xml:space="preserve"> </w:t>
+      </w:r>
+      <w:r>
+        <w:rPr>
+          <w:i/>
+          <w:iCs/>
+        </w:rPr>
+        <w:t xml:space="preserve">F1000Res</w:t>
+      </w:r>
+      <w:r>
+        <w:t xml:space="preserve"> </w:t>
+      </w:r>
+      <w:r>
+        <w:t xml:space="preserve">5, 2000</w:t>
+      </w:r>
     </w:p>
-    <w:bookmarkEnd w:id="73"/>
-    <w:bookmarkStart w:id="77" w:name="ref-doi:10.1038/520429a"/>
+    <w:bookmarkEnd w:id="74"/>
+    <w:bookmarkStart w:id="76" w:name="X2b10f9b9a4270be0d96aba4cc529b1548cdbabe"/>
     <w:p>
       <w:pPr>
         <w:pStyle w:val="Bibliography"/>
       </w:pPr>
       <w:r>
-        <w:t xml:space="preserve">11.</w:t>
+        <w:t xml:space="preserve">21.</w:t>
       </w:r>
       <w:r>
         <w:t xml:space="preserve"> </w:t>
@@ -9597,17 +9854,7 @@
         <w:t xml:space="preserve">	</w:t>
       </w:r>
       <w:r>
-        <w:rPr>
-          <w:b/>
-          <w:bCs/>
-        </w:rPr>
-        <w:t xml:space="preserve">Bibliometrics: The Leiden Manifesto for research metrics</w:t>
-      </w:r>
-      <w:r>
-        <w:t xml:space="preserve"> </w:t>
-      </w:r>
-      <w:r>
-        <w:t xml:space="preserve">Diana Hicks, Paul Wouters, Ludo Waltman, Sarah de Rijcke, Ismael Rafols</w:t>
+        <w:t xml:space="preserve">Indicators.</w:t>
       </w:r>
       <w:r>
         <w:t xml:space="preserve"> </w:t>
@@ -9617,1021 +9864,15 @@
           <w:i/>
           <w:iCs/>
         </w:rPr>
-        <w:t xml:space="preserve">Nature</w:t>
-      </w:r>
-      <w:r>
-        <w:t xml:space="preserve"> </w:t>
-      </w:r>
-      <w:r>
-        <w:t xml:space="preserve">(2015-04-22)</w:t>
-      </w:r>
-      <w:r>
-        <w:t xml:space="preserve"> </w:t>
-      </w:r>
-      <w:hyperlink r:id="rId74">
-        <w:r>
-          <w:rPr>
-            <w:rStyle w:val="Hyperlink"/>
-          </w:rPr>
-          <w:t xml:space="preserve">https://doi.org/gdg44f</w:t>
-        </w:r>
-      </w:hyperlink>
-      <w:r>
-        <w:t xml:space="preserve"> </w:t>
-      </w:r>
-      <w:r>
-        <w:t xml:space="preserve">DOI:</w:t>
+        <w:t xml:space="preserve">FAIRplus Data Maturity</w:t>
+      </w:r>
+      <w:r>
+        <w:t xml:space="preserve">. [Online]. Available:</w:t>
       </w:r>
       <w:r>
         <w:t xml:space="preserve"> </w:t>
       </w:r>
       <w:hyperlink r:id="rId75">
-        <w:r>
-          <w:rPr>
-            <w:rStyle w:val="Hyperlink"/>
-          </w:rPr>
-          <w:t xml:space="preserve">10.1038/520429a</w:t>
-        </w:r>
-      </w:hyperlink>
-      <w:r>
-        <w:t xml:space="preserve"> </w:t>
-      </w:r>
-      <w:r>
-        <w:t xml:space="preserve">· PMID:</w:t>
-      </w:r>
-      <w:r>
-        <w:t xml:space="preserve"> </w:t>
-      </w:r>
-      <w:hyperlink r:id="rId76">
-        <w:r>
-          <w:rPr>
-            <w:rStyle w:val="Hyperlink"/>
-          </w:rPr>
-          <w:t xml:space="preserve">25903611</w:t>
-        </w:r>
-      </w:hyperlink>
-    </w:p>
-    <w:bookmarkEnd w:id="77"/>
-    <w:bookmarkStart w:id="81" w:name="ref-doi:10.4103/1008-682X.171582"/>
-    <w:p>
-      <w:pPr>
-        <w:pStyle w:val="Bibliography"/>
-      </w:pPr>
-      <w:r>
-        <w:t xml:space="preserve">12.</w:t>
-      </w:r>
-      <w:r>
-        <w:t xml:space="preserve"> </w:t>
-      </w:r>
-      <w:r>
-        <w:t xml:space="preserve">	</w:t>
-      </w:r>
-      <w:r>
-        <w:rPr>
-          <w:b/>
-          <w:bCs/>
-        </w:rPr>
-        <w:t xml:space="preserve">Bibliometrics: tracking research impact by selecting the appropriate metrics</w:t>
-      </w:r>
-      <w:r>
-        <w:t xml:space="preserve"> </w:t>
-      </w:r>
-      <w:r>
-        <w:t xml:space="preserve">Ashok Agarwal, Damayanthi Durairajanayagam, Sindhuja Tatagari, SandroC Esteves, Avi Harlev, Ralf Henkel, Shubhadeep Roychoudhury, Sheryl Homa, NicolásGarrido Puchalt, Ranjith Ramasamy, … Asher Bashiri</w:t>
-      </w:r>
-      <w:r>
-        <w:t xml:space="preserve"> </w:t>
-      </w:r>
-      <w:r>
-        <w:rPr>
-          <w:i/>
-          <w:iCs/>
-        </w:rPr>
-        <w:t xml:space="preserve">Asian Journal of Andrology</w:t>
-      </w:r>
-      <w:r>
-        <w:t xml:space="preserve"> </w:t>
-      </w:r>
-      <w:r>
-        <w:t xml:space="preserve">(2016)</w:t>
-      </w:r>
-      <w:r>
-        <w:t xml:space="preserve"> </w:t>
-      </w:r>
-      <w:hyperlink r:id="rId78">
-        <w:r>
-          <w:rPr>
-            <w:rStyle w:val="Hyperlink"/>
-          </w:rPr>
-          <w:t xml:space="preserve">https://doi.org/f877jx</w:t>
-        </w:r>
-      </w:hyperlink>
-      <w:r>
-        <w:t xml:space="preserve"> </w:t>
-      </w:r>
-      <w:r>
-        <w:t xml:space="preserve">DOI:</w:t>
-      </w:r>
-      <w:r>
-        <w:t xml:space="preserve"> </w:t>
-      </w:r>
-      <w:hyperlink r:id="rId79">
-        <w:r>
-          <w:rPr>
-            <w:rStyle w:val="Hyperlink"/>
-          </w:rPr>
-          <w:t xml:space="preserve">10.4103/1008-682x.171582</w:t>
-        </w:r>
-      </w:hyperlink>
-      <w:r>
-        <w:t xml:space="preserve"> </w:t>
-      </w:r>
-      <w:r>
-        <w:t xml:space="preserve">· PMID:</w:t>
-      </w:r>
-      <w:r>
-        <w:t xml:space="preserve"> </w:t>
-      </w:r>
-      <w:hyperlink r:id="rId80">
-        <w:r>
-          <w:rPr>
-            <w:rStyle w:val="Hyperlink"/>
-          </w:rPr>
-          <w:t xml:space="preserve">26806079</w:t>
-        </w:r>
-      </w:hyperlink>
-    </w:p>
-    <w:bookmarkEnd w:id="81"/>
-    <w:bookmarkStart w:id="86" w:name="ref-doi:10.1101/2023.09.12.557386"/>
-    <w:p>
-      <w:pPr>
-        <w:pStyle w:val="Bibliography"/>
-      </w:pPr>
-      <w:r>
-        <w:t xml:space="preserve">13.</w:t>
-      </w:r>
-      <w:r>
-        <w:t xml:space="preserve"> </w:t>
-      </w:r>
-      <w:r>
-        <w:t xml:space="preserve">	</w:t>
-      </w:r>
-      <w:r>
-        <w:rPr>
-          <w:b/>
-          <w:bCs/>
-        </w:rPr>
-        <w:t xml:space="preserve">Bibliometric analysis of neuroscience publications quantifies the impact of data sharing</w:t>
-      </w:r>
-      <w:r>
-        <w:t xml:space="preserve"> </w:t>
-      </w:r>
-      <w:r>
-        <w:t xml:space="preserve">Herve Emissah, Bengt Ljungquist, Giorgio A Ascoli</w:t>
-      </w:r>
-      <w:r>
-        <w:t xml:space="preserve"> </w:t>
-      </w:r>
-      <w:r>
-        <w:rPr>
-          <w:i/>
-          <w:iCs/>
-        </w:rPr>
-        <w:t xml:space="preserve">openRxiv</w:t>
-      </w:r>
-      <w:r>
-        <w:t xml:space="preserve"> </w:t>
-      </w:r>
-      <w:r>
-        <w:t xml:space="preserve">(2023-09-13)</w:t>
-      </w:r>
-      <w:r>
-        <w:t xml:space="preserve"> </w:t>
-      </w:r>
-      <w:hyperlink r:id="rId82">
-        <w:r>
-          <w:rPr>
-            <w:rStyle w:val="Hyperlink"/>
-          </w:rPr>
-          <w:t xml:space="preserve">https://doi.org/hbsw6q</w:t>
-        </w:r>
-      </w:hyperlink>
-      <w:r>
-        <w:t xml:space="preserve"> </w:t>
-      </w:r>
-      <w:r>
-        <w:t xml:space="preserve">DOI:</w:t>
-      </w:r>
-      <w:r>
-        <w:t xml:space="preserve"> </w:t>
-      </w:r>
-      <w:hyperlink r:id="rId83">
-        <w:r>
-          <w:rPr>
-            <w:rStyle w:val="Hyperlink"/>
-          </w:rPr>
-          <w:t xml:space="preserve">10.1101/2023.09.12.557386</w:t>
-        </w:r>
-      </w:hyperlink>
-      <w:r>
-        <w:t xml:space="preserve"> </w:t>
-      </w:r>
-      <w:r>
-        <w:t xml:space="preserve">· PMID:</w:t>
-      </w:r>
-      <w:r>
-        <w:t xml:space="preserve"> </w:t>
-      </w:r>
-      <w:hyperlink r:id="rId84">
-        <w:r>
-          <w:rPr>
-            <w:rStyle w:val="Hyperlink"/>
-          </w:rPr>
-          <w:t xml:space="preserve">37745378</w:t>
-        </w:r>
-      </w:hyperlink>
-      <w:r>
-        <w:t xml:space="preserve"> </w:t>
-      </w:r>
-      <w:r>
-        <w:t xml:space="preserve">· PMCID:</w:t>
-      </w:r>
-      <w:r>
-        <w:t xml:space="preserve"> </w:t>
-      </w:r>
-      <w:hyperlink r:id="rId85">
-        <w:r>
-          <w:rPr>
-            <w:rStyle w:val="Hyperlink"/>
-          </w:rPr>
-          <w:t xml:space="preserve">PMC10515804</w:t>
-        </w:r>
-      </w:hyperlink>
-    </w:p>
-    <w:bookmarkEnd w:id="86"/>
-    <w:bookmarkStart w:id="91" w:name="ref-doi:10.2196/63544"/>
-    <w:p>
-      <w:pPr>
-        <w:pStyle w:val="Bibliography"/>
-      </w:pPr>
-      <w:r>
-        <w:t xml:space="preserve">14.</w:t>
-      </w:r>
-      <w:r>
-        <w:t xml:space="preserve"> </w:t>
-      </w:r>
-      <w:r>
-        <w:t xml:space="preserve">	</w:t>
-      </w:r>
-      <w:r>
-        <w:rPr>
-          <w:b/>
-          <w:bCs/>
-        </w:rPr>
-        <w:t xml:space="preserve">Medical Science Data Value Evaluation Model: Mixed Methods Study</w:t>
-      </w:r>
-      <w:r>
-        <w:t xml:space="preserve"> </w:t>
-      </w:r>
-      <w:r>
-        <w:t xml:space="preserve">Dandan Wang, Yaning Liu</w:t>
-      </w:r>
-      <w:r>
-        <w:t xml:space="preserve"> </w:t>
-      </w:r>
-      <w:r>
-        <w:rPr>
-          <w:i/>
-          <w:iCs/>
-        </w:rPr>
-        <w:t xml:space="preserve">JMIR Medical Informatics</w:t>
-      </w:r>
-      <w:r>
-        <w:t xml:space="preserve"> </w:t>
-      </w:r>
-      <w:r>
-        <w:t xml:space="preserve">(2025-08-21)</w:t>
-      </w:r>
-      <w:r>
-        <w:t xml:space="preserve"> </w:t>
-      </w:r>
-      <w:hyperlink r:id="rId87">
-        <w:r>
-          <w:rPr>
-            <w:rStyle w:val="Hyperlink"/>
-          </w:rPr>
-          <w:t xml:space="preserve">https://doi.org/hbsw6s</w:t>
-        </w:r>
-      </w:hyperlink>
-      <w:r>
-        <w:t xml:space="preserve"> </w:t>
-      </w:r>
-      <w:r>
-        <w:t xml:space="preserve">DOI:</w:t>
-      </w:r>
-      <w:r>
-        <w:t xml:space="preserve"> </w:t>
-      </w:r>
-      <w:hyperlink r:id="rId88">
-        <w:r>
-          <w:rPr>
-            <w:rStyle w:val="Hyperlink"/>
-          </w:rPr>
-          <w:t xml:space="preserve">10.2196/63544</w:t>
-        </w:r>
-      </w:hyperlink>
-      <w:r>
-        <w:t xml:space="preserve"> </w:t>
-      </w:r>
-      <w:r>
-        <w:t xml:space="preserve">· PMID:</w:t>
-      </w:r>
-      <w:r>
-        <w:t xml:space="preserve"> </w:t>
-      </w:r>
-      <w:hyperlink r:id="rId89">
-        <w:r>
-          <w:rPr>
-            <w:rStyle w:val="Hyperlink"/>
-          </w:rPr>
-          <w:t xml:space="preserve">40839787</w:t>
-        </w:r>
-      </w:hyperlink>
-      <w:r>
-        <w:t xml:space="preserve"> </w:t>
-      </w:r>
-      <w:r>
-        <w:t xml:space="preserve">· PMCID:</w:t>
-      </w:r>
-      <w:r>
-        <w:t xml:space="preserve"> </w:t>
-      </w:r>
-      <w:hyperlink r:id="rId90">
-        <w:r>
-          <w:rPr>
-            <w:rStyle w:val="Hyperlink"/>
-          </w:rPr>
-          <w:t xml:space="preserve">PMC12369987</w:t>
-        </w:r>
-      </w:hyperlink>
-    </w:p>
-    <w:bookmarkEnd w:id="91"/>
-    <w:bookmarkStart w:id="95" w:name="ref-doi:10.15265/IY-2014-0020"/>
-    <w:p>
-      <w:pPr>
-        <w:pStyle w:val="Bibliography"/>
-      </w:pPr>
-      <w:r>
-        <w:t xml:space="preserve">15.</w:t>
-      </w:r>
-      <w:r>
-        <w:t xml:space="preserve"> </w:t>
-      </w:r>
-      <w:r>
-        <w:t xml:space="preserve">	</w:t>
-      </w:r>
-      <w:r>
-        <w:rPr>
-          <w:b/>
-          <w:bCs/>
-        </w:rPr>
-        <w:t xml:space="preserve">Big Data in Medicine Is Driving Big Changes</w:t>
-      </w:r>
-      <w:r>
-        <w:t xml:space="preserve"> </w:t>
-      </w:r>
-      <w:r>
-        <w:t xml:space="preserve">K Verspoor, F Martin-Sanchez</w:t>
-      </w:r>
-      <w:r>
-        <w:t xml:space="preserve"> </w:t>
-      </w:r>
-      <w:r>
-        <w:rPr>
-          <w:i/>
-          <w:iCs/>
-        </w:rPr>
-        <w:t xml:space="preserve">Yearbook of Medical Informatics</w:t>
-      </w:r>
-      <w:r>
-        <w:t xml:space="preserve"> </w:t>
-      </w:r>
-      <w:r>
-        <w:t xml:space="preserve">(2014-08)</w:t>
-      </w:r>
-      <w:r>
-        <w:t xml:space="preserve"> </w:t>
-      </w:r>
-      <w:hyperlink r:id="rId92">
-        <w:r>
-          <w:rPr>
-            <w:rStyle w:val="Hyperlink"/>
-          </w:rPr>
-          <w:t xml:space="preserve">https://doi.org/gtwq2b</w:t>
-        </w:r>
-      </w:hyperlink>
-      <w:r>
-        <w:t xml:space="preserve"> </w:t>
-      </w:r>
-      <w:r>
-        <w:t xml:space="preserve">DOI:</w:t>
-      </w:r>
-      <w:r>
-        <w:t xml:space="preserve"> </w:t>
-      </w:r>
-      <w:hyperlink r:id="rId93">
-        <w:r>
-          <w:rPr>
-            <w:rStyle w:val="Hyperlink"/>
-          </w:rPr>
-          <w:t xml:space="preserve">10.15265/iy-2014-0020</w:t>
-        </w:r>
-      </w:hyperlink>
-      <w:r>
-        <w:t xml:space="preserve"> </w:t>
-      </w:r>
-      <w:r>
-        <w:t xml:space="preserve">· PMID:</w:t>
-      </w:r>
-      <w:r>
-        <w:t xml:space="preserve"> </w:t>
-      </w:r>
-      <w:hyperlink r:id="rId94">
-        <w:r>
-          <w:rPr>
-            <w:rStyle w:val="Hyperlink"/>
-          </w:rPr>
-          <w:t xml:space="preserve">25123716</w:t>
-        </w:r>
-      </w:hyperlink>
-    </w:p>
-    <w:bookmarkEnd w:id="95"/>
-    <w:bookmarkStart w:id="100" w:name="ref-doi:10.1371/journal.pone.0229003"/>
-    <w:p>
-      <w:pPr>
-        <w:pStyle w:val="Bibliography"/>
-      </w:pPr>
-      <w:r>
-        <w:t xml:space="preserve">16.</w:t>
-      </w:r>
-      <w:r>
-        <w:t xml:space="preserve"> </w:t>
-      </w:r>
-      <w:r>
-        <w:t xml:space="preserve">	</w:t>
-      </w:r>
-      <w:r>
-        <w:rPr>
-          <w:b/>
-          <w:bCs/>
-        </w:rPr>
-        <w:t xml:space="preserve">Data sharing, management, use, and reuse: Practices and perceptions of scientists worldwide</w:t>
-      </w:r>
-      <w:r>
-        <w:t xml:space="preserve"> </w:t>
-      </w:r>
-      <w:r>
-        <w:t xml:space="preserve">Carol Tenopir, Natalie M Rice, Suzie Allard, Lynn Baird, Josh Borycz, Lisa Christian, Bruce Grant, Robert Olendorf, Robert J Sandusky</w:t>
-      </w:r>
-      <w:r>
-        <w:t xml:space="preserve"> </w:t>
-      </w:r>
-      <w:r>
-        <w:rPr>
-          <w:i/>
-          <w:iCs/>
-        </w:rPr>
-        <w:t xml:space="preserve">PLOS ONE</w:t>
-      </w:r>
-      <w:r>
-        <w:t xml:space="preserve"> </w:t>
-      </w:r>
-      <w:r>
-        <w:t xml:space="preserve">(2020-03-11)</w:t>
-      </w:r>
-      <w:r>
-        <w:t xml:space="preserve"> </w:t>
-      </w:r>
-      <w:hyperlink r:id="rId96">
-        <w:r>
-          <w:rPr>
-            <w:rStyle w:val="Hyperlink"/>
-          </w:rPr>
-          <w:t xml:space="preserve">https://doi.org/gnm52c</w:t>
-        </w:r>
-      </w:hyperlink>
-      <w:r>
-        <w:t xml:space="preserve"> </w:t>
-      </w:r>
-      <w:r>
-        <w:t xml:space="preserve">DOI:</w:t>
-      </w:r>
-      <w:r>
-        <w:t xml:space="preserve"> </w:t>
-      </w:r>
-      <w:hyperlink r:id="rId97">
-        <w:r>
-          <w:rPr>
-            <w:rStyle w:val="Hyperlink"/>
-          </w:rPr>
-          <w:t xml:space="preserve">10.1371/journal.pone.0229003</w:t>
-        </w:r>
-      </w:hyperlink>
-      <w:r>
-        <w:t xml:space="preserve"> </w:t>
-      </w:r>
-      <w:r>
-        <w:t xml:space="preserve">· PMID:</w:t>
-      </w:r>
-      <w:r>
-        <w:t xml:space="preserve"> </w:t>
-      </w:r>
-      <w:hyperlink r:id="rId98">
-        <w:r>
-          <w:rPr>
-            <w:rStyle w:val="Hyperlink"/>
-          </w:rPr>
-          <w:t xml:space="preserve">32160189</w:t>
-        </w:r>
-      </w:hyperlink>
-      <w:r>
-        <w:t xml:space="preserve"> </w:t>
-      </w:r>
-      <w:r>
-        <w:t xml:space="preserve">· PMCID:</w:t>
-      </w:r>
-      <w:r>
-        <w:t xml:space="preserve"> </w:t>
-      </w:r>
-      <w:hyperlink r:id="rId99">
-        <w:r>
-          <w:rPr>
-            <w:rStyle w:val="Hyperlink"/>
-          </w:rPr>
-          <w:t xml:space="preserve">PMC7065823</w:t>
-        </w:r>
-      </w:hyperlink>
-    </w:p>
-    <w:bookmarkEnd w:id="100"/>
-    <w:bookmarkStart w:id="105" w:name="ref-doi:10.15585/mmwr.su7303a1"/>
-    <w:p>
-      <w:pPr>
-        <w:pStyle w:val="Bibliography"/>
-      </w:pPr>
-      <w:r>
-        <w:t xml:space="preserve">17.</w:t>
-      </w:r>
-      <w:r>
-        <w:t xml:space="preserve"> </w:t>
-      </w:r>
-      <w:r>
-        <w:t xml:space="preserve">	</w:t>
-      </w:r>
-      <w:r>
-        <w:rPr>
-          <w:b/>
-          <w:bCs/>
-        </w:rPr>
-        <w:t xml:space="preserve">A Standard Framework for Evaluating Large Health Care Data and Related Resources</w:t>
-      </w:r>
-      <w:r>
-        <w:t xml:space="preserve"> </w:t>
-      </w:r>
-      <w:r>
-        <w:t xml:space="preserve">Suad El Burai Felix, Hussain Yusuf, Matthew Ritchey, Sebastian Romano, Gonza Namulanda, Natalie Wilkins, Tegan K Boehmer</w:t>
-      </w:r>
-      <w:r>
-        <w:t xml:space="preserve"> </w:t>
-      </w:r>
-      <w:r>
-        <w:rPr>
-          <w:i/>
-          <w:iCs/>
-        </w:rPr>
-        <w:t xml:space="preserve">MMWR Supplements</w:t>
-      </w:r>
-      <w:r>
-        <w:t xml:space="preserve"> </w:t>
-      </w:r>
-      <w:r>
-        <w:t xml:space="preserve">(2024-05-09)</w:t>
-      </w:r>
-      <w:r>
-        <w:t xml:space="preserve"> </w:t>
-      </w:r>
-      <w:hyperlink r:id="rId101">
-        <w:r>
-          <w:rPr>
-            <w:rStyle w:val="Hyperlink"/>
-          </w:rPr>
-          <w:t xml:space="preserve">https://doi.org/hbsw6r</w:t>
-        </w:r>
-      </w:hyperlink>
-      <w:r>
-        <w:t xml:space="preserve"> </w:t>
-      </w:r>
-      <w:r>
-        <w:t xml:space="preserve">DOI:</w:t>
-      </w:r>
-      <w:r>
-        <w:t xml:space="preserve"> </w:t>
-      </w:r>
-      <w:hyperlink r:id="rId102">
-        <w:r>
-          <w:rPr>
-            <w:rStyle w:val="Hyperlink"/>
-          </w:rPr>
-          <w:t xml:space="preserve">10.15585/mmwr.su7303a1</w:t>
-        </w:r>
-      </w:hyperlink>
-      <w:r>
-        <w:t xml:space="preserve"> </w:t>
-      </w:r>
-      <w:r>
-        <w:t xml:space="preserve">· PMID:</w:t>
-      </w:r>
-      <w:r>
-        <w:t xml:space="preserve"> </w:t>
-      </w:r>
-      <w:hyperlink r:id="rId103">
-        <w:r>
-          <w:rPr>
-            <w:rStyle w:val="Hyperlink"/>
-          </w:rPr>
-          <w:t xml:space="preserve">38713639</w:t>
-        </w:r>
-      </w:hyperlink>
-      <w:r>
-        <w:t xml:space="preserve"> </w:t>
-      </w:r>
-      <w:r>
-        <w:t xml:space="preserve">· PMCID:</w:t>
-      </w:r>
-      <w:r>
-        <w:t xml:space="preserve"> </w:t>
-      </w:r>
-      <w:hyperlink r:id="rId104">
-        <w:r>
-          <w:rPr>
-            <w:rStyle w:val="Hyperlink"/>
-          </w:rPr>
-          <w:t xml:space="preserve">PMC11078514</w:t>
-        </w:r>
-      </w:hyperlink>
-    </w:p>
-    <w:bookmarkEnd w:id="105"/>
-    <w:bookmarkStart w:id="110" w:name="ref-doi:10.1038/nbt.3780"/>
-    <w:p>
-      <w:pPr>
-        <w:pStyle w:val="Bibliography"/>
-      </w:pPr>
-      <w:r>
-        <w:t xml:space="preserve">18.</w:t>
-      </w:r>
-      <w:r>
-        <w:t xml:space="preserve"> </w:t>
-      </w:r>
-      <w:r>
-        <w:t xml:space="preserve">	</w:t>
-      </w:r>
-      <w:r>
-        <w:rPr>
-          <w:b/>
-          <w:bCs/>
-        </w:rPr>
-        <w:t xml:space="preserve">Reproducibility of computational workflows is automated using continuous analysis</w:t>
-      </w:r>
-      <w:r>
-        <w:t xml:space="preserve"> </w:t>
-      </w:r>
-      <w:r>
-        <w:t xml:space="preserve">Brett K Beaulieu-Jones, Casey S Greene</w:t>
-      </w:r>
-      <w:r>
-        <w:t xml:space="preserve"> </w:t>
-      </w:r>
-      <w:r>
-        <w:rPr>
-          <w:i/>
-          <w:iCs/>
-        </w:rPr>
-        <w:t xml:space="preserve">Nature Biotechnology</w:t>
-      </w:r>
-      <w:r>
-        <w:t xml:space="preserve"> </w:t>
-      </w:r>
-      <w:r>
-        <w:t xml:space="preserve">(2017-03-13)</w:t>
-      </w:r>
-      <w:r>
-        <w:t xml:space="preserve"> </w:t>
-      </w:r>
-      <w:hyperlink r:id="rId106">
-        <w:r>
-          <w:rPr>
-            <w:rStyle w:val="Hyperlink"/>
-          </w:rPr>
-          <w:t xml:space="preserve">https://doi.org/f9ttx6</w:t>
-        </w:r>
-      </w:hyperlink>
-      <w:r>
-        <w:t xml:space="preserve"> </w:t>
-      </w:r>
-      <w:r>
-        <w:t xml:space="preserve">DOI:</w:t>
-      </w:r>
-      <w:r>
-        <w:t xml:space="preserve"> </w:t>
-      </w:r>
-      <w:hyperlink r:id="rId107">
-        <w:r>
-          <w:rPr>
-            <w:rStyle w:val="Hyperlink"/>
-          </w:rPr>
-          <w:t xml:space="preserve">10.1038/nbt.3780</w:t>
-        </w:r>
-      </w:hyperlink>
-      <w:r>
-        <w:t xml:space="preserve"> </w:t>
-      </w:r>
-      <w:r>
-        <w:t xml:space="preserve">· PMID:</w:t>
-      </w:r>
-      <w:r>
-        <w:t xml:space="preserve"> </w:t>
-      </w:r>
-      <w:hyperlink r:id="rId108">
-        <w:r>
-          <w:rPr>
-            <w:rStyle w:val="Hyperlink"/>
-          </w:rPr>
-          <w:t xml:space="preserve">28288103</w:t>
-        </w:r>
-      </w:hyperlink>
-      <w:r>
-        <w:t xml:space="preserve"> </w:t>
-      </w:r>
-      <w:r>
-        <w:t xml:space="preserve">· PMCID:</w:t>
-      </w:r>
-      <w:r>
-        <w:t xml:space="preserve"> </w:t>
-      </w:r>
-      <w:hyperlink r:id="rId109">
-        <w:r>
-          <w:rPr>
-            <w:rStyle w:val="Hyperlink"/>
-          </w:rPr>
-          <w:t xml:space="preserve">PMC6103790</w:t>
-        </w:r>
-      </w:hyperlink>
-    </w:p>
-    <w:bookmarkEnd w:id="110"/>
-    <w:bookmarkStart w:id="115" w:name="ref-doi:10.1186/gb-2004-5-10-r80"/>
-    <w:p>
-      <w:pPr>
-        <w:pStyle w:val="Bibliography"/>
-      </w:pPr>
-      <w:r>
-        <w:t xml:space="preserve">19.</w:t>
-      </w:r>
-      <w:r>
-        <w:t xml:space="preserve"> </w:t>
-      </w:r>
-      <w:r>
-        <w:t xml:space="preserve">	</w:t>
-      </w:r>
-      <w:r>
-        <w:rPr>
-          <w:b/>
-          <w:bCs/>
-        </w:rPr>
-        <w:t xml:space="preserve">Bioconductor: open software development for computational biology and bioinformatics</w:t>
-      </w:r>
-      <w:r>
-        <w:t xml:space="preserve"> </w:t>
-      </w:r>
-      <w:r>
-        <w:t xml:space="preserve">Robert C Gentleman, Vincent J Carey, Douglas M Bates, Ben Bolstad, Marcel Dettling, Sandrine Dudoit, Byron Ellis, Laurent Gautier, Yongchao Ge, Jeff Gentry, … Jianhua Zhang</w:t>
-      </w:r>
-      <w:r>
-        <w:t xml:space="preserve"> </w:t>
-      </w:r>
-      <w:r>
-        <w:rPr>
-          <w:i/>
-          <w:iCs/>
-        </w:rPr>
-        <w:t xml:space="preserve">Genome Biology</w:t>
-      </w:r>
-      <w:r>
-        <w:t xml:space="preserve"> </w:t>
-      </w:r>
-      <w:r>
-        <w:t xml:space="preserve">(2004-09-15)</w:t>
-      </w:r>
-      <w:r>
-        <w:t xml:space="preserve"> </w:t>
-      </w:r>
-      <w:hyperlink r:id="rId111">
-        <w:r>
-          <w:rPr>
-            <w:rStyle w:val="Hyperlink"/>
-          </w:rPr>
-          <w:t xml:space="preserve">https://doi.org/c2xm5v</w:t>
-        </w:r>
-      </w:hyperlink>
-      <w:r>
-        <w:t xml:space="preserve"> </w:t>
-      </w:r>
-      <w:r>
-        <w:t xml:space="preserve">DOI:</w:t>
-      </w:r>
-      <w:r>
-        <w:t xml:space="preserve"> </w:t>
-      </w:r>
-      <w:hyperlink r:id="rId112">
-        <w:r>
-          <w:rPr>
-            <w:rStyle w:val="Hyperlink"/>
-          </w:rPr>
-          <w:t xml:space="preserve">10.1186/gb-2004-5-10-r80</w:t>
-        </w:r>
-      </w:hyperlink>
-      <w:r>
-        <w:t xml:space="preserve"> </w:t>
-      </w:r>
-      <w:r>
-        <w:t xml:space="preserve">· PMID:</w:t>
-      </w:r>
-      <w:r>
-        <w:t xml:space="preserve"> </w:t>
-      </w:r>
-      <w:hyperlink r:id="rId113">
-        <w:r>
-          <w:rPr>
-            <w:rStyle w:val="Hyperlink"/>
-          </w:rPr>
-          <w:t xml:space="preserve">15461798</w:t>
-        </w:r>
-      </w:hyperlink>
-      <w:r>
-        <w:t xml:space="preserve"> </w:t>
-      </w:r>
-      <w:r>
-        <w:t xml:space="preserve">· PMCID:</w:t>
-      </w:r>
-      <w:r>
-        <w:t xml:space="preserve"> </w:t>
-      </w:r>
-      <w:hyperlink r:id="rId114">
-        <w:r>
-          <w:rPr>
-            <w:rStyle w:val="Hyperlink"/>
-          </w:rPr>
-          <w:t xml:space="preserve">PMC545600</w:t>
-        </w:r>
-      </w:hyperlink>
-    </w:p>
-    <w:bookmarkEnd w:id="115"/>
-    <w:bookmarkStart w:id="120" w:name="ref-doi:10.12688/f1000research.9206.1"/>
-    <w:p>
-      <w:pPr>
-        <w:pStyle w:val="Bibliography"/>
-      </w:pPr>
-      <w:r>
-        <w:t xml:space="preserve">20.</w:t>
-      </w:r>
-      <w:r>
-        <w:t xml:space="preserve"> </w:t>
-      </w:r>
-      <w:r>
-        <w:t xml:space="preserve">	</w:t>
-      </w:r>
-      <w:r>
-        <w:rPr>
-          <w:b/>
-          <w:bCs/>
-        </w:rPr>
-        <w:t xml:space="preserve">Top 10 metrics for life science software good practices</w:t>
-      </w:r>
-      <w:r>
-        <w:t xml:space="preserve"> </w:t>
-      </w:r>
-      <w:r>
-        <w:t xml:space="preserve">Haydee Artaza, Neil Chue Hong, Manuel Corpas, Angel Corpuz, Rob WW Hooft, Rafael C Jiménez, Brane Leskošek, Brett G Olivier, Jan Stourac, Radka Svobodová Vařeková, … Daniel Vaughan</w:t>
-      </w:r>
-      <w:r>
-        <w:t xml:space="preserve"> </w:t>
-      </w:r>
-      <w:r>
-        <w:rPr>
-          <w:i/>
-          <w:iCs/>
-        </w:rPr>
-        <w:t xml:space="preserve">F1000Research</w:t>
-      </w:r>
-      <w:r>
-        <w:t xml:space="preserve"> </w:t>
-      </w:r>
-      <w:r>
-        <w:t xml:space="preserve">(2016-08-16)</w:t>
-      </w:r>
-      <w:r>
-        <w:t xml:space="preserve"> </w:t>
-      </w:r>
-      <w:hyperlink r:id="rId116">
-        <w:r>
-          <w:rPr>
-            <w:rStyle w:val="Hyperlink"/>
-          </w:rPr>
-          <w:t xml:space="preserve">https://doi.org/gfvpq7</w:t>
-        </w:r>
-      </w:hyperlink>
-      <w:r>
-        <w:t xml:space="preserve"> </w:t>
-      </w:r>
-      <w:r>
-        <w:t xml:space="preserve">DOI:</w:t>
-      </w:r>
-      <w:r>
-        <w:t xml:space="preserve"> </w:t>
-      </w:r>
-      <w:hyperlink r:id="rId117">
-        <w:r>
-          <w:rPr>
-            <w:rStyle w:val="Hyperlink"/>
-          </w:rPr>
-          <w:t xml:space="preserve">10.12688/f1000research.9206.1</w:t>
-        </w:r>
-      </w:hyperlink>
-      <w:r>
-        <w:t xml:space="preserve"> </w:t>
-      </w:r>
-      <w:r>
-        <w:t xml:space="preserve">· PMID:</w:t>
-      </w:r>
-      <w:r>
-        <w:t xml:space="preserve"> </w:t>
-      </w:r>
-      <w:hyperlink r:id="rId118">
-        <w:r>
-          <w:rPr>
-            <w:rStyle w:val="Hyperlink"/>
-          </w:rPr>
-          <w:t xml:space="preserve">27635232</w:t>
-        </w:r>
-      </w:hyperlink>
-      <w:r>
-        <w:t xml:space="preserve"> </w:t>
-      </w:r>
-      <w:r>
-        <w:t xml:space="preserve">· PMCID:</w:t>
-      </w:r>
-      <w:r>
-        <w:t xml:space="preserve"> </w:t>
-      </w:r>
-      <w:hyperlink r:id="rId119">
-        <w:r>
-          <w:rPr>
-            <w:rStyle w:val="Hyperlink"/>
-          </w:rPr>
-          <w:t xml:space="preserve">PMC5007752</w:t>
-        </w:r>
-      </w:hyperlink>
-    </w:p>
-    <w:bookmarkEnd w:id="120"/>
-    <w:bookmarkStart w:id="122" w:name="X2b10f9b9a4270be0d96aba4cc529b1548cdbabe"/>
-    <w:p>
-      <w:pPr>
-        <w:pStyle w:val="Bibliography"/>
-      </w:pPr>
-      <w:r>
-        <w:t xml:space="preserve">21.</w:t>
-      </w:r>
-      <w:r>
-        <w:t xml:space="preserve"> </w:t>
-      </w:r>
-      <w:r>
-        <w:t xml:space="preserve">	</w:t>
-      </w:r>
-      <w:r>
-        <w:rPr>
-          <w:b/>
-          <w:bCs/>
-        </w:rPr>
-        <w:t xml:space="preserve">Indicators</w:t>
-      </w:r>
-      <w:r>
-        <w:t xml:space="preserve"> </w:t>
-      </w:r>
-      <w:r>
-        <w:t xml:space="preserve">FAIRplus Data Maturity</w:t>
-      </w:r>
-      <w:r>
-        <w:t xml:space="preserve"> </w:t>
-      </w:r>
-      <w:hyperlink r:id="rId121">
         <w:r>
           <w:rPr>
             <w:rStyle w:val="Hyperlink"/>
@@ -10639,9 +9880,12 @@
           <w:t xml:space="preserve">https://fairplus.github.io/Data-Maturity/docs/Indicators/</w:t>
         </w:r>
       </w:hyperlink>
+      <w:r>
+        <w:t xml:space="preserve">. [Accessed: 16-May-2026]</w:t>
+      </w:r>
     </w:p>
-    <w:bookmarkEnd w:id="122"/>
-    <w:bookmarkStart w:id="124" w:name="X7ad42e4ba87689c7356ff47da0c3a62acb6be13"/>
+    <w:bookmarkEnd w:id="76"/>
+    <w:bookmarkStart w:id="78" w:name="X7ad42e4ba87689c7356ff47da0c3a62acb6be13"/>
     <w:p>
       <w:pPr>
         <w:pStyle w:val="Bibliography"/>
@@ -10656,17 +9900,37 @@
         <w:t xml:space="preserve">	</w:t>
       </w:r>
       <w:r>
+        <w:t xml:space="preserve">National Academies of Sciences, E.</w:t>
+      </w:r>
+      <w:r>
+        <w:t xml:space="preserve"> </w:t>
+      </w:r>
+      <w:r>
         <w:rPr>
-          <w:b/>
-          <w:bCs/>
+          <w:i/>
+          <w:iCs/>
         </w:rPr>
-        <w:t xml:space="preserve">The Cost-Forecasting Framework: Identifying Cost Drivers in the Biomedical Data Life Cycle</w:t>
-      </w:r>
-      <w:r>
-        <w:t xml:space="preserve"> </w:t>
-      </w:r>
-      <w:r>
-        <w:t xml:space="preserve">Engineering National Academies of Sciences, Policy and Global Affairs, Division on Earth and Life Studies, Division on Engineering and Physical Sciences, Board on Research Data and Information, Board on Life Sciences, Computer Science and Telecommunications Board, Committee on Applied and Theoretical Statistics, Board on Mathematical Sciences and Analytics, Committee on Forecasting Costs for Preserving and Promoting Access to Biomedical Data</w:t>
+        <w:t xml:space="preserve">et al.</w:t>
+      </w:r>
+      <w:r>
+        <w:t xml:space="preserve"> </w:t>
+      </w:r>
+      <w:r>
+        <w:t xml:space="preserve">(2020)</w:t>
+      </w:r>
+      <w:r>
+        <w:t xml:space="preserve"> </w:t>
+      </w:r>
+      <w:hyperlink r:id="rId77">
+        <w:r>
+          <w:rPr>
+            <w:rStyle w:val="Hyperlink"/>
+          </w:rPr>
+          <w:t xml:space="preserve">The Cost-Forecasting Framework: Identifying Cost Drivers in the Biomedical Data Life Cycle</w:t>
+        </w:r>
+      </w:hyperlink>
+      <w:r>
+        <w:t xml:space="preserve">. In</w:t>
       </w:r>
       <w:r>
         <w:t xml:space="preserve"> </w:t>
@@ -10679,50 +9943,56 @@
         <w:t xml:space="preserve">Life-Cycle Decisions for Biomedical Data: The Challenge of Forecasting Costs</w:t>
       </w:r>
       <w:r>
-        <w:t xml:space="preserve"> </w:t>
-      </w:r>
-      <w:r>
-        <w:t xml:space="preserve">(2020-06-08)</w:t>
-      </w:r>
-      <w:r>
-        <w:t xml:space="preserve"> </w:t>
-      </w:r>
-      <w:hyperlink r:id="rId123">
+        <w:t xml:space="preserve">, National Academies Press (US)</w:t>
+      </w:r>
+    </w:p>
+    <w:bookmarkEnd w:id="78"/>
+    <w:bookmarkStart w:id="80" w:name="ref-doi:10.1093/jamia/ocab278"/>
+    <w:p>
+      <w:pPr>
+        <w:pStyle w:val="Bibliography"/>
+      </w:pPr>
+      <w:r>
+        <w:t xml:space="preserve">23.</w:t>
+      </w:r>
+      <w:r>
+        <w:t xml:space="preserve"> </w:t>
+      </w:r>
+      <w:r>
+        <w:t xml:space="preserve">	</w:t>
+      </w:r>
+      <w:r>
+        <w:t xml:space="preserve">Kahn, M.G.</w:t>
+      </w:r>
+      <w:r>
+        <w:t xml:space="preserve"> </w:t>
+      </w:r>
+      <w:r>
+        <w:rPr>
+          <w:i/>
+          <w:iCs/>
+        </w:rPr>
+        <w:t xml:space="preserve">et al.</w:t>
+      </w:r>
+      <w:r>
+        <w:t xml:space="preserve"> </w:t>
+      </w:r>
+      <w:r>
+        <w:t xml:space="preserve">(2021)</w:t>
+      </w:r>
+      <w:r>
+        <w:t xml:space="preserve"> </w:t>
+      </w:r>
+      <w:hyperlink r:id="rId79">
         <w:r>
           <w:rPr>
             <w:rStyle w:val="Hyperlink"/>
           </w:rPr>
-          <w:t xml:space="preserve">https://www.ncbi.nlm.nih.gov/books/NBK562708/</w:t>
+          <w:t xml:space="preserve">Migrating a research data warehouse to a public cloud: challenges and opportunities</w:t>
         </w:r>
       </w:hyperlink>
-    </w:p>
-    <w:bookmarkEnd w:id="124"/>
-    <w:bookmarkStart w:id="129" w:name="ref-doi:10.1093/jamia/ocab278"/>
-    <w:p>
-      <w:pPr>
-        <w:pStyle w:val="Bibliography"/>
-      </w:pPr>
-      <w:r>
-        <w:t xml:space="preserve">23.</w:t>
-      </w:r>
-      <w:r>
-        <w:t xml:space="preserve"> </w:t>
-      </w:r>
-      <w:r>
-        <w:t xml:space="preserve">	</w:t>
-      </w:r>
-      <w:r>
-        <w:rPr>
-          <w:b/>
-          <w:bCs/>
-        </w:rPr>
-        <w:t xml:space="preserve">Migrating a research data warehouse to a public cloud: challenges and opportunities</w:t>
-      </w:r>
-      <w:r>
-        <w:t xml:space="preserve"> </w:t>
-      </w:r>
-      <w:r>
-        <w:t xml:space="preserve">Michael G Kahn, Joyce Y Mui, Michael J Ames, Anoop K Yamsani, Nikita Pozdeyev, Nicholas Rafaels, Ian M Brooks</w:t>
+      <w:r>
+        <w:t xml:space="preserve">.</w:t>
       </w:r>
       <w:r>
         <w:t xml:space="preserve"> </w:t>
@@ -10738,79 +10008,66 @@
         <w:t xml:space="preserve"> </w:t>
       </w:r>
       <w:r>
-        <w:t xml:space="preserve">(2021-12-17)</w:t>
-      </w:r>
-      <w:r>
-        <w:t xml:space="preserve"> </w:t>
-      </w:r>
-      <w:hyperlink r:id="rId125">
+        <w:t xml:space="preserve">29, 592–600</w:t>
+      </w:r>
+    </w:p>
+    <w:bookmarkEnd w:id="80"/>
+    <w:bookmarkStart w:id="82" w:name="ref-doi:10.48550/arXiv.2509.12709"/>
+    <w:p>
+      <w:pPr>
+        <w:pStyle w:val="Bibliography"/>
+      </w:pPr>
+      <w:r>
+        <w:t xml:space="preserve">24.</w:t>
+      </w:r>
+      <w:r>
+        <w:t xml:space="preserve"> </w:t>
+      </w:r>
+      <w:r>
+        <w:t xml:space="preserve">	</w:t>
+      </w:r>
+      <w:r>
+        <w:t xml:space="preserve">Zhang, H.</w:t>
+      </w:r>
+      <w:r>
+        <w:t xml:space="preserve"> </w:t>
+      </w:r>
+      <w:r>
+        <w:rPr>
+          <w:i/>
+          <w:iCs/>
+        </w:rPr>
+        <w:t xml:space="preserve">et al.</w:t>
+      </w:r>
+      <w:r>
+        <w:t xml:space="preserve"> </w:t>
+      </w:r>
+      <w:r>
+        <w:t xml:space="preserve">(2025)</w:t>
+      </w:r>
+      <w:r>
+        <w:t xml:space="preserve"> </w:t>
+      </w:r>
+      <w:hyperlink r:id="rId81">
         <w:r>
           <w:rPr>
             <w:rStyle w:val="Hyperlink"/>
           </w:rPr>
-          <w:t xml:space="preserve">https://doi.org/hbs2bg</w:t>
+          <w:t xml:space="preserve">Harnessing the Power of AI in Qualitative Research: Role Assignment, Engagement, and User Perceptions of AI-Generated Follow-Up Questions in Semi-Structured Interviews</w:t>
         </w:r>
       </w:hyperlink>
       <w:r>
-        <w:t xml:space="preserve"> </w:t>
-      </w:r>
-      <w:r>
-        <w:t xml:space="preserve">DOI:</w:t>
-      </w:r>
-      <w:r>
-        <w:t xml:space="preserve"> </w:t>
-      </w:r>
-      <w:hyperlink r:id="rId126">
-        <w:r>
-          <w:rPr>
-            <w:rStyle w:val="Hyperlink"/>
-          </w:rPr>
-          <w:t xml:space="preserve">10.1093/jamia/ocab278</w:t>
-        </w:r>
-      </w:hyperlink>
-      <w:r>
-        <w:t xml:space="preserve"> </w:t>
-      </w:r>
-      <w:r>
-        <w:t xml:space="preserve">· PMID:</w:t>
-      </w:r>
-      <w:r>
-        <w:t xml:space="preserve"> </w:t>
-      </w:r>
-      <w:hyperlink r:id="rId127">
-        <w:r>
-          <w:rPr>
-            <w:rStyle w:val="Hyperlink"/>
-          </w:rPr>
-          <w:t xml:space="preserve">34919694</w:t>
-        </w:r>
-      </w:hyperlink>
-      <w:r>
-        <w:t xml:space="preserve"> </w:t>
-      </w:r>
-      <w:r>
-        <w:t xml:space="preserve">· PMCID:</w:t>
-      </w:r>
-      <w:r>
-        <w:t xml:space="preserve"> </w:t>
-      </w:r>
-      <w:hyperlink r:id="rId128">
-        <w:r>
-          <w:rPr>
-            <w:rStyle w:val="Hyperlink"/>
-          </w:rPr>
-          <w:t xml:space="preserve">PMC8922165</w:t>
-        </w:r>
-      </w:hyperlink>
+        <w:t xml:space="preserve">arXiv</w:t>
+      </w:r>
     </w:p>
-    <w:bookmarkEnd w:id="129"/>
-    <w:bookmarkStart w:id="132" w:name="ref-doi:10.48550/arXiv.2509.12709"/>
+    <w:bookmarkEnd w:id="82"/>
+    <w:bookmarkStart w:id="84" w:name="Xc1554ee4988a5c64dd2a8bc05a8ce444d54a496"/>
     <w:p>
       <w:pPr>
         <w:pStyle w:val="Bibliography"/>
       </w:pPr>
       <w:r>
-        <w:t xml:space="preserve">24.</w:t>
+        <w:t xml:space="preserve">25.</w:t>
       </w:r>
       <w:r>
         <w:t xml:space="preserve"> </w:t>
@@ -10819,89 +10076,12 @@
         <w:t xml:space="preserve">	</w:t>
       </w:r>
       <w:r>
-        <w:rPr>
-          <w:b/>
-          <w:bCs/>
-        </w:rPr>
-        <w:t xml:space="preserve">Harnessing the Power of AI in Qualitative Research: Role Assignment, Engagement, and User Perceptions of AI-Generated Follow-Up Questions in Semi-Structured Interviews</w:t>
-      </w:r>
-      <w:r>
-        <w:t xml:space="preserve"> </w:t>
-      </w:r>
-      <w:r>
-        <w:t xml:space="preserve">He Zhang, Yueyan Liu, Xin Guan, Jie Cai, John M Carroll</w:t>
-      </w:r>
-      <w:r>
-        <w:t xml:space="preserve"> </w:t>
-      </w:r>
-      <w:r>
-        <w:rPr>
-          <w:i/>
-          <w:iCs/>
-        </w:rPr>
-        <w:t xml:space="preserve">arXiv</w:t>
-      </w:r>
-      <w:r>
-        <w:t xml:space="preserve"> </w:t>
-      </w:r>
-      <w:r>
-        <w:t xml:space="preserve">(2025)</w:t>
-      </w:r>
-      <w:r>
-        <w:t xml:space="preserve"> </w:t>
-      </w:r>
-      <w:hyperlink r:id="rId130">
-        <w:r>
-          <w:rPr>
-            <w:rStyle w:val="Hyperlink"/>
-          </w:rPr>
-          <w:t xml:space="preserve">https://doi.org/hbs2fv</w:t>
-        </w:r>
-      </w:hyperlink>
-      <w:r>
-        <w:t xml:space="preserve"> </w:t>
-      </w:r>
-      <w:r>
-        <w:t xml:space="preserve">DOI:</w:t>
-      </w:r>
-      <w:r>
-        <w:t xml:space="preserve"> </w:t>
-      </w:r>
-      <w:hyperlink r:id="rId131">
-        <w:r>
-          <w:rPr>
-            <w:rStyle w:val="Hyperlink"/>
-          </w:rPr>
-          <w:t xml:space="preserve">10.48550/arxiv.2509.12709</w:t>
-        </w:r>
-      </w:hyperlink>
-    </w:p>
-    <w:bookmarkEnd w:id="132"/>
-    <w:bookmarkStart w:id="134" w:name="Xc1554ee4988a5c64dd2a8bc05a8ce444d54a496"/>
-    <w:p>
-      <w:pPr>
-        <w:pStyle w:val="Bibliography"/>
-      </w:pPr>
-      <w:r>
-        <w:t xml:space="preserve">25.</w:t>
-      </w:r>
-      <w:r>
-        <w:t xml:space="preserve"> </w:t>
-      </w:r>
-      <w:r>
-        <w:t xml:space="preserve">	</w:t>
-      </w:r>
-      <w:r>
-        <w:rPr>
-          <w:b/>
-          <w:bCs/>
-        </w:rPr>
-        <w:t xml:space="preserve">Common Fund Data Ecosystem (CFDE) | NIH Common Fund</w:t>
-      </w:r>
-      <w:r>
-        <w:t xml:space="preserve"> </w:t>
-      </w:r>
-      <w:hyperlink r:id="rId133">
+        <w:t xml:space="preserve">Common Fund Data Ecosystem (CFDE) | NIH Common Fund[Online]. Available:</w:t>
+      </w:r>
+      <w:r>
+        <w:t xml:space="preserve"> </w:t>
+      </w:r>
+      <w:hyperlink r:id="rId83">
         <w:r>
           <w:rPr>
             <w:rStyle w:val="Hyperlink"/>
@@ -10909,9 +10089,12 @@
           <w:t xml:space="preserve">https://commonfund.nih.gov/dataecosystem</w:t>
         </w:r>
       </w:hyperlink>
+      <w:r>
+        <w:t xml:space="preserve">. [Accessed: 16-May-2026]</w:t>
+      </w:r>
     </w:p>
-    <w:bookmarkEnd w:id="134"/>
-    <w:bookmarkStart w:id="139" w:name="ref-doi:10.1007/s10488-013-0528-y"/>
+    <w:bookmarkEnd w:id="84"/>
+    <w:bookmarkStart w:id="86" w:name="ref-doi:10.1007/s10488-013-0528-y"/>
     <w:p>
       <w:pPr>
         <w:pStyle w:val="Bibliography"/>
@@ -10926,17 +10109,7 @@
         <w:t xml:space="preserve">	</w:t>
       </w:r>
       <w:r>
-        <w:rPr>
-          <w:b/>
-          <w:bCs/>
-        </w:rPr>
-        <w:t xml:space="preserve">Purposeful Sampling for Qualitative Data Collection and Analysis in Mixed Method Implementation Research</w:t>
-      </w:r>
-      <w:r>
-        <w:t xml:space="preserve"> </w:t>
-      </w:r>
-      <w:r>
-        <w:t xml:space="preserve">Lawrence A Palinkas, Sarah M Horwitz, Carla A Green, Jennifer P Wisdom, Naihua Duan, Kimberly Hoagwood</w:t>
+        <w:t xml:space="preserve">Palinkas, L.A.</w:t>
       </w:r>
       <w:r>
         <w:t xml:space="preserve"> </w:t>
@@ -10946,85 +10119,102 @@
           <w:i/>
           <w:iCs/>
         </w:rPr>
-        <w:t xml:space="preserve">Administration and Policy in Mental Health and Mental Health Services Research</w:t>
-      </w:r>
-      <w:r>
-        <w:t xml:space="preserve"> </w:t>
-      </w:r>
-      <w:r>
-        <w:t xml:space="preserve">(2013-11-06)</w:t>
-      </w:r>
-      <w:r>
-        <w:t xml:space="preserve"> </w:t>
-      </w:r>
-      <w:hyperlink r:id="rId135">
+        <w:t xml:space="preserve">et al.</w:t>
+      </w:r>
+      <w:r>
+        <w:t xml:space="preserve"> </w:t>
+      </w:r>
+      <w:r>
+        <w:t xml:space="preserve">(2013)</w:t>
+      </w:r>
+      <w:r>
+        <w:t xml:space="preserve"> </w:t>
+      </w:r>
+      <w:hyperlink r:id="rId85">
         <w:r>
           <w:rPr>
             <w:rStyle w:val="Hyperlink"/>
           </w:rPr>
-          <w:t xml:space="preserve">https://doi.org/f7nxzd</w:t>
+          <w:t xml:space="preserve">Purposeful Sampling for Qualitative Data Collection and Analysis in Mixed Method Implementation Research</w:t>
         </w:r>
       </w:hyperlink>
       <w:r>
-        <w:t xml:space="preserve"> </w:t>
-      </w:r>
-      <w:r>
-        <w:t xml:space="preserve">DOI:</w:t>
-      </w:r>
-      <w:r>
-        <w:t xml:space="preserve"> </w:t>
-      </w:r>
-      <w:hyperlink r:id="rId136">
+        <w:t xml:space="preserve">.</w:t>
+      </w:r>
+      <w:r>
+        <w:t xml:space="preserve"> </w:t>
+      </w:r>
+      <w:r>
+        <w:rPr>
+          <w:i/>
+          <w:iCs/>
+        </w:rPr>
+        <w:t xml:space="preserve">Adm Policy Ment Health</w:t>
+      </w:r>
+      <w:r>
+        <w:t xml:space="preserve"> </w:t>
+      </w:r>
+      <w:r>
+        <w:t xml:space="preserve">42, 533–544</w:t>
+      </w:r>
+    </w:p>
+    <w:bookmarkEnd w:id="86"/>
+    <w:bookmarkStart w:id="88" w:name="ref-doi:10.1002/jgf2.736"/>
+    <w:p>
+      <w:pPr>
+        <w:pStyle w:val="Bibliography"/>
+      </w:pPr>
+      <w:r>
+        <w:t xml:space="preserve">27.</w:t>
+      </w:r>
+      <w:r>
+        <w:t xml:space="preserve"> </w:t>
+      </w:r>
+      <w:r>
+        <w:t xml:space="preserve">	</w:t>
+      </w:r>
+      <w:r>
+        <w:t xml:space="preserve">Creswell, J.W. and Inoue, M. (2024)</w:t>
+      </w:r>
+      <w:r>
+        <w:t xml:space="preserve"> </w:t>
+      </w:r>
+      <w:hyperlink r:id="rId87">
         <w:r>
           <w:rPr>
             <w:rStyle w:val="Hyperlink"/>
           </w:rPr>
-          <w:t xml:space="preserve">10.1007/s10488-013-0528-y</w:t>
+          <w:t xml:space="preserve">A process for conducting mixed methods data analysis</w:t>
         </w:r>
       </w:hyperlink>
       <w:r>
-        <w:t xml:space="preserve"> </w:t>
-      </w:r>
-      <w:r>
-        <w:t xml:space="preserve">· PMID:</w:t>
-      </w:r>
-      <w:r>
-        <w:t xml:space="preserve"> </w:t>
-      </w:r>
-      <w:hyperlink r:id="rId137">
-        <w:r>
-          <w:rPr>
-            <w:rStyle w:val="Hyperlink"/>
-          </w:rPr>
-          <w:t xml:space="preserve">24193818</w:t>
-        </w:r>
-      </w:hyperlink>
-      <w:r>
-        <w:t xml:space="preserve"> </w:t>
-      </w:r>
-      <w:r>
-        <w:t xml:space="preserve">· PMCID:</w:t>
-      </w:r>
-      <w:r>
-        <w:t xml:space="preserve"> </w:t>
-      </w:r>
-      <w:hyperlink r:id="rId138">
-        <w:r>
-          <w:rPr>
-            <w:rStyle w:val="Hyperlink"/>
-          </w:rPr>
-          <w:t xml:space="preserve">PMC4012002</w:t>
-        </w:r>
-      </w:hyperlink>
+        <w:t xml:space="preserve">.</w:t>
+      </w:r>
+      <w:r>
+        <w:t xml:space="preserve"> </w:t>
+      </w:r>
+      <w:r>
+        <w:rPr>
+          <w:i/>
+          <w:iCs/>
+        </w:rPr>
+        <w:t xml:space="preserve">J of Gen and Family Med</w:t>
+      </w:r>
+      <w:r>
+        <w:t xml:space="preserve"> </w:t>
+      </w:r>
+      <w:r>
+        <w:t xml:space="preserve">26, 4–11</w:t>
+      </w:r>
     </w:p>
-    <w:bookmarkEnd w:id="139"/>
-    <w:bookmarkStart w:id="144" w:name="ref-doi:10.1002/jgf2.736"/>
+    <w:bookmarkEnd w:id="88"/>
+    <w:bookmarkStart w:id="90" w:name="X76ee81cf61288aec0f48b9d17d5a06038eee18d"/>
     <w:p>
       <w:pPr>
         <w:pStyle w:val="Bibliography"/>
       </w:pPr>
       <w:r>
-        <w:t xml:space="preserve">27.</w:t>
+        <w:t xml:space="preserve">28.</w:t>
       </w:r>
       <w:r>
         <w:t xml:space="preserve"> </w:t>
@@ -11033,113 +10223,12 @@
         <w:t xml:space="preserve">	</w:t>
       </w:r>
       <w:r>
-        <w:rPr>
-          <w:b/>
-          <w:bCs/>
-        </w:rPr>
-        <w:t xml:space="preserve">A process for conducting mixed methods data analysis</w:t>
-      </w:r>
-      <w:r>
-        <w:t xml:space="preserve"> </w:t>
-      </w:r>
-      <w:r>
-        <w:t xml:space="preserve">John W Creswell, Machiko Inoue</w:t>
-      </w:r>
-      <w:r>
-        <w:t xml:space="preserve"> </w:t>
-      </w:r>
-      <w:r>
-        <w:rPr>
-          <w:i/>
-          <w:iCs/>
-        </w:rPr>
-        <w:t xml:space="preserve">Journal of General and Family Medicine</w:t>
-      </w:r>
-      <w:r>
-        <w:t xml:space="preserve"> </w:t>
-      </w:r>
-      <w:r>
-        <w:t xml:space="preserve">(2024-10-03)</w:t>
-      </w:r>
-      <w:r>
-        <w:t xml:space="preserve"> </w:t>
-      </w:r>
-      <w:hyperlink r:id="rId140">
-        <w:r>
-          <w:rPr>
-            <w:rStyle w:val="Hyperlink"/>
-          </w:rPr>
-          <w:t xml:space="preserve">https://doi.org/hbs2bf</w:t>
-        </w:r>
-      </w:hyperlink>
-      <w:r>
-        <w:t xml:space="preserve"> </w:t>
-      </w:r>
-      <w:r>
-        <w:t xml:space="preserve">DOI:</w:t>
-      </w:r>
-      <w:r>
-        <w:t xml:space="preserve"> </w:t>
-      </w:r>
-      <w:hyperlink r:id="rId141">
-        <w:r>
-          <w:rPr>
-            <w:rStyle w:val="Hyperlink"/>
-          </w:rPr>
-          <w:t xml:space="preserve">10.1002/jgf2.736</w:t>
-        </w:r>
-      </w:hyperlink>
-      <w:r>
-        <w:t xml:space="preserve"> </w:t>
-      </w:r>
-      <w:r>
-        <w:t xml:space="preserve">· PMID:</w:t>
-      </w:r>
-      <w:r>
-        <w:t xml:space="preserve"> </w:t>
-      </w:r>
-      <w:hyperlink r:id="rId142">
-        <w:r>
-          <w:rPr>
-            <w:rStyle w:val="Hyperlink"/>
-          </w:rPr>
-          <w:t xml:space="preserve">39776872</w:t>
-        </w:r>
-      </w:hyperlink>
-      <w:r>
-        <w:t xml:space="preserve"> </w:t>
-      </w:r>
-      <w:r>
-        <w:t xml:space="preserve">· PMCID:</w:t>
-      </w:r>
-      <w:r>
-        <w:t xml:space="preserve"> </w:t>
-      </w:r>
-      <w:hyperlink r:id="rId143">
-        <w:r>
-          <w:rPr>
-            <w:rStyle w:val="Hyperlink"/>
-          </w:rPr>
-          <w:t xml:space="preserve">PMC11702478</w:t>
-        </w:r>
-      </w:hyperlink>
-    </w:p>
-    <w:bookmarkEnd w:id="144"/>
-    <w:bookmarkStart w:id="146" w:name="X76ee81cf61288aec0f48b9d17d5a06038eee18d"/>
-    <w:p>
-      <w:pPr>
-        <w:pStyle w:val="Bibliography"/>
-      </w:pPr>
-      <w:r>
-        <w:t xml:space="preserve">28.</w:t>
-      </w:r>
-      <w:r>
-        <w:t xml:space="preserve"> </w:t>
-      </w:r>
-      <w:r>
-        <w:t xml:space="preserve">	</w:t>
-      </w:r>
-      <w:hyperlink r:id="rId145">
+        <w:t xml:space="preserve">[Online]. Available:</w:t>
+      </w:r>
+      <w:r>
+        <w:t xml:space="preserve"> </w:t>
+      </w:r>
+      <w:hyperlink r:id="rId89">
         <w:r>
           <w:rPr>
             <w:rStyle w:val="Hyperlink"/>
@@ -11148,8 +10237,8 @@
         </w:r>
       </w:hyperlink>
     </w:p>
-    <w:bookmarkEnd w:id="146"/>
-    <w:bookmarkStart w:id="149" w:name="ref-pmid:30861395"/>
+    <w:bookmarkEnd w:id="90"/>
+    <w:bookmarkStart w:id="92" w:name="ref-pmid:30861395"/>
     <w:p>
       <w:pPr>
         <w:pStyle w:val="Bibliography"/>
@@ -11164,17 +10253,7 @@
         <w:t xml:space="preserve">	</w:t>
       </w:r>
       <w:r>
-        <w:rPr>
-          <w:b/>
-          <w:bCs/>
-        </w:rPr>
-        <w:t xml:space="preserve">Using logic model and visualization to conduct portfolio evaluation.</w:t>
-      </w:r>
-      <w:r>
-        <w:t xml:space="preserve"> </w:t>
-      </w:r>
-      <w:r>
-        <w:t xml:space="preserve">Huang Wu, Jianping Shen, Jeffrey Jones, Xingyuan Gao, Yunzheng Zheng, Huilan Y Krenn</w:t>
+        <w:t xml:space="preserve">Wu, H.</w:t>
       </w:r>
       <w:r>
         <w:t xml:space="preserve"> </w:t>
@@ -11184,87 +10263,73 @@
           <w:i/>
           <w:iCs/>
         </w:rPr>
-        <w:t xml:space="preserve">Evaluation and program planning</w:t>
-      </w:r>
-      <w:r>
-        <w:t xml:space="preserve"> </w:t>
-      </w:r>
-      <w:r>
-        <w:t xml:space="preserve">(2019-02-26)</w:t>
-      </w:r>
-      <w:r>
-        <w:t xml:space="preserve"> </w:t>
-      </w:r>
-      <w:hyperlink r:id="rId147">
+        <w:t xml:space="preserve">et al.</w:t>
+      </w:r>
+      <w:r>
+        <w:t xml:space="preserve"> </w:t>
+      </w:r>
+      <w:r>
+        <w:t xml:space="preserve">(2019)</w:t>
+      </w:r>
+      <w:r>
+        <w:t xml:space="preserve"> </w:t>
+      </w:r>
+      <w:hyperlink r:id="rId91">
         <w:r>
           <w:rPr>
             <w:rStyle w:val="Hyperlink"/>
           </w:rPr>
-          <w:t xml:space="preserve">https://www.ncbi.nlm.nih.gov/pubmed/30861395</w:t>
+          <w:t xml:space="preserve">Using logic model and visualization to conduct portfolio evaluation.</w:t>
         </w:r>
       </w:hyperlink>
       <w:r>
         <w:t xml:space="preserve"> </w:t>
       </w:r>
       <w:r>
-        <w:t xml:space="preserve">DOI:</w:t>
-      </w:r>
-      <w:r>
-        <w:t xml:space="preserve"> </w:t>
-      </w:r>
-      <w:hyperlink r:id="rId148">
+        <w:rPr>
+          <w:i/>
+          <w:iCs/>
+        </w:rPr>
+        <w:t xml:space="preserve">Eval Program Plann</w:t>
+      </w:r>
+      <w:r>
+        <w:t xml:space="preserve"> </w:t>
+      </w:r>
+      <w:r>
+        <w:t xml:space="preserve">74, 69–75</w:t>
+      </w:r>
+    </w:p>
+    <w:bookmarkEnd w:id="92"/>
+    <w:bookmarkStart w:id="94" w:name="ref-doi:10.1016/j.socscimed.2017.03.041"/>
+    <w:p>
+      <w:pPr>
+        <w:pStyle w:val="Bibliography"/>
+      </w:pPr>
+      <w:r>
+        <w:t xml:space="preserve">30.</w:t>
+      </w:r>
+      <w:r>
+        <w:t xml:space="preserve"> </w:t>
+      </w:r>
+      <w:r>
+        <w:t xml:space="preserve">	</w:t>
+      </w:r>
+      <w:r>
+        <w:t xml:space="preserve">Leonard, K.L. and Masatu, M.C. (2017)</w:t>
+      </w:r>
+      <w:r>
+        <w:t xml:space="preserve"> </w:t>
+      </w:r>
+      <w:hyperlink r:id="rId93">
         <w:r>
           <w:rPr>
             <w:rStyle w:val="Hyperlink"/>
           </w:rPr>
-          <w:t xml:space="preserve">10.1016/j.evalprogplan.2019.02.011</w:t>
+          <w:t xml:space="preserve">Changing health care provider performance through measurement</w:t>
         </w:r>
       </w:hyperlink>
       <w:r>
-        <w:t xml:space="preserve"> </w:t>
-      </w:r>
-      <w:r>
-        <w:t xml:space="preserve">· PMID:</w:t>
-      </w:r>
-      <w:r>
-        <w:t xml:space="preserve"> </w:t>
-      </w:r>
-      <w:hyperlink r:id="rId147">
-        <w:r>
-          <w:rPr>
-            <w:rStyle w:val="Hyperlink"/>
-          </w:rPr>
-          <w:t xml:space="preserve">30861395</w:t>
-        </w:r>
-      </w:hyperlink>
-    </w:p>
-    <w:bookmarkEnd w:id="149"/>
-    <w:bookmarkStart w:id="154" w:name="ref-doi:10.1016/j.socscimed.2017.03.041"/>
-    <w:p>
-      <w:pPr>
-        <w:pStyle w:val="Bibliography"/>
-      </w:pPr>
-      <w:r>
-        <w:t xml:space="preserve">30.</w:t>
-      </w:r>
-      <w:r>
-        <w:t xml:space="preserve"> </w:t>
-      </w:r>
-      <w:r>
-        <w:t xml:space="preserve">	</w:t>
-      </w:r>
-      <w:r>
-        <w:rPr>
-          <w:b/>
-          <w:bCs/>
-        </w:rPr>
-        <w:t xml:space="preserve">Changing health care provider performance through measurement</w:t>
-      </w:r>
-      <w:r>
-        <w:t xml:space="preserve"> </w:t>
-      </w:r>
-      <w:r>
-        <w:t xml:space="preserve">Kenneth L Leonard, Melkiory C Masatu</w:t>
+        <w:t xml:space="preserve">.</w:t>
       </w:r>
       <w:r>
         <w:t xml:space="preserve"> </w:t>
@@ -11280,73 +10345,11 @@
         <w:t xml:space="preserve"> </w:t>
       </w:r>
       <w:r>
-        <w:t xml:space="preserve">(2017-05)</w:t>
-      </w:r>
-      <w:r>
-        <w:t xml:space="preserve"> </w:t>
-      </w:r>
-      <w:hyperlink r:id="rId150">
-        <w:r>
-          <w:rPr>
-            <w:rStyle w:val="Hyperlink"/>
-          </w:rPr>
-          <w:t xml:space="preserve">https://doi.org/f98fz3</w:t>
-        </w:r>
-      </w:hyperlink>
-      <w:r>
-        <w:t xml:space="preserve"> </w:t>
-      </w:r>
-      <w:r>
-        <w:t xml:space="preserve">DOI:</w:t>
-      </w:r>
-      <w:r>
-        <w:t xml:space="preserve"> </w:t>
-      </w:r>
-      <w:hyperlink r:id="rId151">
-        <w:r>
-          <w:rPr>
-            <w:rStyle w:val="Hyperlink"/>
-          </w:rPr>
-          <w:t xml:space="preserve">10.1016/j.socscimed.2017.03.041</w:t>
-        </w:r>
-      </w:hyperlink>
-      <w:r>
-        <w:t xml:space="preserve"> </w:t>
-      </w:r>
-      <w:r>
-        <w:t xml:space="preserve">· PMID:</w:t>
-      </w:r>
-      <w:r>
-        <w:t xml:space="preserve"> </w:t>
-      </w:r>
-      <w:hyperlink r:id="rId152">
-        <w:r>
-          <w:rPr>
-            <w:rStyle w:val="Hyperlink"/>
-          </w:rPr>
-          <w:t xml:space="preserve">28371629</w:t>
-        </w:r>
-      </w:hyperlink>
-      <w:r>
-        <w:t xml:space="preserve"> </w:t>
-      </w:r>
-      <w:r>
-        <w:t xml:space="preserve">· PMCID:</w:t>
-      </w:r>
-      <w:r>
-        <w:t xml:space="preserve"> </w:t>
-      </w:r>
-      <w:hyperlink r:id="rId153">
-        <w:r>
-          <w:rPr>
-            <w:rStyle w:val="Hyperlink"/>
-          </w:rPr>
-          <w:t xml:space="preserve">PMC5616207</w:t>
-        </w:r>
-      </w:hyperlink>
+        <w:t xml:space="preserve">181, 54–65</w:t>
+      </w:r>
     </w:p>
-    <w:bookmarkEnd w:id="154"/>
-    <w:bookmarkStart w:id="156" w:name="X95f22a201431050b3e5367321fb4ecc35cbc91c"/>
+    <w:bookmarkEnd w:id="94"/>
+    <w:bookmarkStart w:id="96" w:name="X95f22a201431050b3e5367321fb4ecc35cbc91c"/>
     <w:p>
       <w:pPr>
         <w:pStyle w:val="Bibliography"/>
@@ -11361,16 +10364,12 @@
         <w:t xml:space="preserve">	</w:t>
       </w:r>
       <w:r>
-        <w:rPr>
-          <w:b/>
-          <w:bCs/>
-        </w:rPr>
-        <w:t xml:space="preserve">NOT-OD-21-013: Final NIH Policy for Data Management and Sharing</w:t>
-      </w:r>
-      <w:r>
-        <w:t xml:space="preserve"> </w:t>
-      </w:r>
-      <w:hyperlink r:id="rId155">
+        <w:t xml:space="preserve">NOT-OD-21-013: Final NIH Policy for Data Management and Sharing[Online]. Available:</w:t>
+      </w:r>
+      <w:r>
+        <w:t xml:space="preserve"> </w:t>
+      </w:r>
+      <w:hyperlink r:id="rId95">
         <w:r>
           <w:rPr>
             <w:rStyle w:val="Hyperlink"/>
@@ -11378,9 +10377,12 @@
           <w:t xml:space="preserve">https://grants.nih.gov/grants/guide/notice-files/NOT-OD-21-013.html</w:t>
         </w:r>
       </w:hyperlink>
+      <w:r>
+        <w:t xml:space="preserve">. [Accessed: 16-May-2026]</w:t>
+      </w:r>
     </w:p>
-    <w:bookmarkEnd w:id="156"/>
-    <w:bookmarkStart w:id="158" w:name="X999055200295ead81fddf881b6ef724ff612aa1"/>
+    <w:bookmarkEnd w:id="96"/>
+    <w:bookmarkStart w:id="98" w:name="X999055200295ead81fddf881b6ef724ff612aa1"/>
     <w:p>
       <w:pPr>
         <w:pStyle w:val="Bibliography"/>
@@ -11395,16 +10397,12 @@
         <w:t xml:space="preserve">	</w:t>
       </w:r>
       <w:r>
-        <w:rPr>
-          <w:b/>
-          <w:bCs/>
-        </w:rPr>
-        <w:t xml:space="preserve">Strategic Road Map</w:t>
-      </w:r>
-      <w:r>
-        <w:t xml:space="preserve"> </w:t>
-      </w:r>
-      <w:hyperlink r:id="rId157">
+        <w:t xml:space="preserve">Strategic Road Map[Online]. Available:</w:t>
+      </w:r>
+      <w:r>
+        <w:t xml:space="preserve"> </w:t>
+      </w:r>
+      <w:hyperlink r:id="rId97">
         <w:r>
           <w:rPr>
             <w:rStyle w:val="Hyperlink"/>
@@ -11412,10 +10410,13 @@
           <w:t xml:space="preserve">https://www.ga4gh.org/about-us/strategic-road-map/</w:t>
         </w:r>
       </w:hyperlink>
+      <w:r>
+        <w:t xml:space="preserve">. [Accessed: 16-May-2026]</w:t>
+      </w:r>
     </w:p>
-    <w:bookmarkEnd w:id="158"/>
-    <w:bookmarkEnd w:id="159"/>
-    <w:bookmarkEnd w:id="160"/>
+    <w:bookmarkEnd w:id="98"/>
+    <w:bookmarkEnd w:id="99"/>
+    <w:bookmarkEnd w:id="100"/>
     <w:sectPr>
       <w:footnotePr>
         <w:numRestart w:val="eachSect"/>

</xml_diff>

<commit_message>
Render push a476a2629a18127c91808807e8e5e63c10d6284a Merge pull request #32 from seandavi/issue-19-section-numbers
Disable section numbering (#19) a476a2629a18127c91808807e8e5e63c10d6284a
</commit_message>
<xml_diff>
--- a/manuscript.docx
+++ b/manuscript.docx
@@ -404,7 +404,7 @@
         <w:pStyle w:val="Heading3"/>
       </w:pPr>
       <w:r>
-        <w:t xml:space="preserve">0.0.1 Three frameworks, one lifecycle</w:t>
+        <w:t xml:space="preserve">Three frameworks, one lifecycle</w:t>
       </w:r>
     </w:p>
     <w:p>
@@ -774,7 +774,7 @@
         <w:pStyle w:val="Heading3"/>
       </w:pPr>
       <w:r>
-        <w:t xml:space="preserve">0.0.2 Public value</w:t>
+        <w:t xml:space="preserve">Public value</w:t>
       </w:r>
     </w:p>
     <w:p>
@@ -1210,7 +1210,7 @@
         <w:pStyle w:val="Heading3"/>
       </w:pPr>
       <w:r>
-        <w:t xml:space="preserve">0.0.3 Scientific quality</w:t>
+        <w:t xml:space="preserve">Scientific quality</w:t>
       </w:r>
     </w:p>
     <w:p>
@@ -1576,7 +1576,7 @@
         <w:pStyle w:val="Heading3"/>
       </w:pPr>
       <w:r>
-        <w:t xml:space="preserve">0.0.4 Operations and finance</w:t>
+        <w:t xml:space="preserve">Operations and finance</w:t>
       </w:r>
     </w:p>
     <w:p>
@@ -6846,7 +6846,7 @@
         <w:pStyle w:val="Heading2"/>
       </w:pPr>
       <w:r>
-        <w:t xml:space="preserve">0.1 Implementation in practice</w:t>
+        <w:t xml:space="preserve">Implementation in practice</w:t>
       </w:r>
     </w:p>
     <w:p>
@@ -7399,7 +7399,7 @@
         <w:pStyle w:val="Heading2"/>
       </w:pPr>
       <w:r>
-        <w:t xml:space="preserve">0.2 Concluding remarks</w:t>
+        <w:t xml:space="preserve">Concluding remarks</w:t>
       </w:r>
     </w:p>
     <w:p>
@@ -7702,7 +7702,7 @@
         <w:pStyle w:val="Heading2"/>
       </w:pPr>
       <w:r>
-        <w:t xml:space="preserve">0.3 Acknowledgments</w:t>
+        <w:t xml:space="preserve">Acknowledgments</w:t>
       </w:r>
     </w:p>
     <w:p>
@@ -7732,7 +7732,7 @@
         <w:pStyle w:val="Heading2"/>
       </w:pPr>
       <w:r>
-        <w:t xml:space="preserve">0.4 Author contributions</w:t>
+        <w:t xml:space="preserve">Author contributions</w:t>
       </w:r>
     </w:p>
     <w:p>
@@ -7756,7 +7756,7 @@
         <w:pStyle w:val="Heading2"/>
       </w:pPr>
       <w:r>
-        <w:t xml:space="preserve">0.5 Declaration of generative AI and AI-assisted technologies in the writing process</w:t>
+        <w:t xml:space="preserve">Declaration of generative AI and AI-assisted technologies in the writing process</w:t>
       </w:r>
     </w:p>
     <w:p>

</xml_diff>

<commit_message>
Render push 9082d01e902304907fded83498e64b7fd72a9565 Merge pull request #33 from seandavi/issue-20-21-22-front-matter
Front-matter polish: title, abstract, keywords (#20 #21 #22) 9082d01e902304907fded83498e64b7fd72a9565
</commit_message>
<xml_diff>
--- a/manuscript.docx
+++ b/manuscript.docx
@@ -7,7 +7,7 @@
         <w:pStyle w:val="Title"/>
       </w:pPr>
       <w:r>
-        <w:t xml:space="preserve">Metrics across the lifecycle: a framework for evaluating NIH biomedical data ecosystems</w:t>
+        <w:t xml:space="preserve">Lifecycle-aware evaluation of biomedical data ecosystems</w:t>
       </w:r>
     </w:p>
     <w:p>
@@ -95,37 +95,37 @@
         <w:pStyle w:val="Abstract"/>
       </w:pPr>
       <w:r>
-        <w:t xml:space="preserve">The U.S. National Institutes of Health has invested billions of dollars in</w:t>
-      </w:r>
-      <w:r>
-        <w:t xml:space="preserve"> </w:t>
-      </w:r>
-      <w:r>
-        <w:t xml:space="preserve">large-scale biomedical data resources, yet evaluation of these investments</w:t>
-      </w:r>
-      <w:r>
-        <w:t xml:space="preserve"> </w:t>
-      </w:r>
-      <w:r>
-        <w:t xml:space="preserve">has historically been fragmented — each program tracks different metrics in</w:t>
-      </w:r>
-      <w:r>
-        <w:t xml:space="preserve"> </w:t>
-      </w:r>
-      <w:r>
-        <w:t xml:space="preserve">different ways, preventing portfolio-level comparison and informed</w:t>
-      </w:r>
-      <w:r>
-        <w:t xml:space="preserve"> </w:t>
-      </w:r>
-      <w:r>
-        <w:t xml:space="preserve">decision-making. We construct a structured approach built on three</w:t>
-      </w:r>
-      <w:r>
-        <w:t xml:space="preserve"> </w:t>
-      </w:r>
-      <w:r>
-        <w:t xml:space="preserve">complementary prioritization frameworks:</w:t>
+        <w:t xml:space="preserve">Public biomedical data resources have become central scientific</w:t>
+      </w:r>
+      <w:r>
+        <w:t xml:space="preserve"> </w:t>
+      </w:r>
+      <w:r>
+        <w:t xml:space="preserve">infrastructure, but evaluation of these investments is fragmented: each</w:t>
+      </w:r>
+      <w:r>
+        <w:t xml:space="preserve"> </w:t>
+      </w:r>
+      <w:r>
+        <w:t xml:space="preserve">funded program tracks different metrics in different ways, preventing</w:t>
+      </w:r>
+      <w:r>
+        <w:t xml:space="preserve"> </w:t>
+      </w:r>
+      <w:r>
+        <w:t xml:space="preserve">portfolio-level comparison and evidence-driven funding decisions. We</w:t>
+      </w:r>
+      <w:r>
+        <w:t xml:space="preserve"> </w:t>
+      </w:r>
+      <w:r>
+        <w:t xml:space="preserve">construct a structured approach built on three complementary</w:t>
+      </w:r>
+      <w:r>
+        <w:t xml:space="preserve"> </w:t>
+      </w:r>
+      <w:r>
+        <w:t xml:space="preserve">prioritization frameworks:</w:t>
       </w:r>
       <w:r>
         <w:t xml:space="preserve"> </w:t>
@@ -141,13 +141,13 @@
         <w:t xml:space="preserve"> </w:t>
       </w:r>
       <w:r>
-        <w:t xml:space="preserve">(user engagement,</w:t>
-      </w:r>
-      <w:r>
-        <w:t xml:space="preserve"> </w:t>
-      </w:r>
-      <w:r>
-        <w:t xml:space="preserve">citations, funded grants),</w:t>
+        <w:t xml:space="preserve">(user engagement, citations,</w:t>
+      </w:r>
+      <w:r>
+        <w:t xml:space="preserve"> </w:t>
+      </w:r>
+      <w:r>
+        <w:t xml:space="preserve">funded grants),</w:t>
       </w:r>
       <w:r>
         <w:t xml:space="preserve"> </w:t>
@@ -163,13 +163,13 @@
         <w:t xml:space="preserve"> </w:t>
       </w:r>
       <w:r>
-        <w:t xml:space="preserve">(metadata completeness,</w:t>
-      </w:r>
-      <w:r>
-        <w:t xml:space="preserve"> </w:t>
-      </w:r>
-      <w:r>
-        <w:t xml:space="preserve">FAIR compliance, data dictionaries), and</w:t>
+        <w:t xml:space="preserve">(metadata completeness, FAIR</w:t>
+      </w:r>
+      <w:r>
+        <w:t xml:space="preserve"> </w:t>
+      </w:r>
+      <w:r>
+        <w:t xml:space="preserve">compliance, data dictionaries), and</w:t>
       </w:r>
       <w:r>
         <w:t xml:space="preserve"> </w:t>
@@ -185,49 +185,37 @@
         <w:t xml:space="preserve"> </w:t>
       </w:r>
       <w:r>
-        <w:t xml:space="preserve">(infrastructure reliability, cost sustainability). Critically, we note that</w:t>
-      </w:r>
-      <w:r>
-        <w:t xml:space="preserve"> </w:t>
-      </w:r>
-      <w:r>
-        <w:t xml:space="preserve">the relative importance of each framework shifts predictably across a data</w:t>
-      </w:r>
-      <w:r>
-        <w:t xml:space="preserve"> </w:t>
-      </w:r>
-      <w:r>
-        <w:t xml:space="preserve">resource’s lifecycle — from early infrastructure-building, through active</w:t>
-      </w:r>
-      <w:r>
-        <w:t xml:space="preserve"> </w:t>
-      </w:r>
-      <w:r>
-        <w:t xml:space="preserve">use and impact, to long-term sustainability. Drawing on data from the NIH</w:t>
-      </w:r>
-      <w:r>
-        <w:t xml:space="preserve"> </w:t>
-      </w:r>
-      <w:r>
-        <w:t xml:space="preserve">Common Fund Data Ecosystem (CFDE), we identify gaps in current measurement</w:t>
-      </w:r>
-      <w:r>
-        <w:t xml:space="preserve"> </w:t>
-      </w:r>
-      <w:r>
-        <w:t xml:space="preserve">practice and describe the ICC’s ongoing effort to close them through a</w:t>
-      </w:r>
-      <w:r>
-        <w:t xml:space="preserve"> </w:t>
-      </w:r>
-      <w:r>
-        <w:t xml:space="preserve">centralized dashboard that integrates publication, citation, GitHub, and</w:t>
-      </w:r>
-      <w:r>
-        <w:t xml:space="preserve"> </w:t>
-      </w:r>
-      <w:r>
-        <w:t xml:space="preserve">web analytics data across the portfolio.</w:t>
+        <w:t xml:space="preserve">(infrastructure reliability, cost sustainability). The relative weight of</w:t>
+      </w:r>
+      <w:r>
+        <w:t xml:space="preserve"> </w:t>
+      </w:r>
+      <w:r>
+        <w:t xml:space="preserve">each framework shifts predictably across a resource’s lifecycle, and</w:t>
+      </w:r>
+      <w:r>
+        <w:t xml:space="preserve"> </w:t>
+      </w:r>
+      <w:r>
+        <w:t xml:space="preserve">uniform metric panels across phases misallocate funding as a result.</w:t>
+      </w:r>
+      <w:r>
+        <w:t xml:space="preserve"> </w:t>
+      </w:r>
+      <w:r>
+        <w:t xml:space="preserve">Drawing on the NIH Common Fund Data Ecosystem, we describe a</w:t>
+      </w:r>
+      <w:r>
+        <w:t xml:space="preserve"> </w:t>
+      </w:r>
+      <w:r>
+        <w:t xml:space="preserve">portfolio-wide dashboard that operationalizes the framework across 19</w:t>
+      </w:r>
+      <w:r>
+        <w:t xml:space="preserve"> </w:t>
+      </w:r>
+      <w:r>
+        <w:t xml:space="preserve">programs in near real time.</w:t>
       </w:r>
     </w:p>
     <w:p>

</xml_diff>

<commit_message>
Render push a19bdaf87c1aa8d641efc3db6f0109ef4f9317b6 Merge pull request #34 from seandavi/issue-25-resources-list
Replace URL citations with Roman-numeral Resources list (#25) a19bdaf87c1aa8d641efc3db6f0109ef4f9317b6
</commit_message>
<xml_diff>
--- a/manuscript.docx
+++ b/manuscript.docx
@@ -374,7 +374,10 @@
         <w:t xml:space="preserve"> </w:t>
       </w:r>
       <w:r>
-        <w:t xml:space="preserve">[5]</w:t>
+        <w:rPr>
+          <w:vertAlign w:val="superscript"/>
+        </w:rPr>
+        <w:t xml:space="preserve">i</w:t>
       </w:r>
       <w:r>
         <w:t xml:space="preserve">.</w:t>
@@ -422,7 +425,7 @@
         <w:t xml:space="preserve"> </w:t>
       </w:r>
       <w:r>
-        <w:t xml:space="preserve">[6,7]</w:t>
+        <w:t xml:space="preserve">[5,6]</w:t>
       </w:r>
       <w:r>
         <w:t xml:space="preserve">.</w:t>
@@ -727,7 +730,7 @@
         <w:t xml:space="preserve"> </w:t>
       </w:r>
       <w:r>
-        <w:t xml:space="preserve">[8,9]</w:t>
+        <w:t xml:space="preserve">[7,8]</w:t>
       </w:r>
       <w:r>
         <w:t xml:space="preserve">.</w:t>
@@ -971,25 +974,40 @@
         <w:t xml:space="preserve"> </w:t>
       </w:r>
       <w:r>
+        <w:t xml:space="preserve">[9]</w:t>
+      </w:r>
+      <w:r>
+        <w:t xml:space="preserve">.</w:t>
+      </w:r>
+      <w:r>
+        <w:t xml:space="preserve"> </w:t>
+      </w:r>
+      <w:r>
+        <w:t xml:space="preserve">Citation counts lag actual use by months to years</w:t>
+      </w:r>
+      <w:r>
+        <w:t xml:space="preserve"> </w:t>
+      </w:r>
+      <w:r>
         <w:t xml:space="preserve">[10]</w:t>
       </w:r>
       <w:r>
+        <w:t xml:space="preserve">, and journal-scoring alternatives that weight by citing-paper properties better capture subject-specific repository impact than raw counts</w:t>
+      </w:r>
+      <w:r>
+        <w:t xml:space="preserve"> </w:t>
+      </w:r>
+      <w:r>
+        <w:t xml:space="preserve">[11]</w:t>
+      </w:r>
+      <w:r>
         <w:t xml:space="preserve">.</w:t>
       </w:r>
       <w:r>
         <w:t xml:space="preserve"> </w:t>
       </w:r>
       <w:r>
-        <w:t xml:space="preserve">Citation counts lag actual use by months to years</w:t>
-      </w:r>
-      <w:r>
-        <w:t xml:space="preserve"> </w:t>
-      </w:r>
-      <w:r>
-        <w:t xml:space="preserve">[11]</w:t>
-      </w:r>
-      <w:r>
-        <w:t xml:space="preserve">, and journal-scoring alternatives that weight by citing-paper properties better capture subject-specific repository impact than raw counts</w:t>
+        <w:t xml:space="preserve">The deeper problem is the citation gap: fewer than 30% of secondary analyses formally cite their source data</w:t>
       </w:r>
       <w:r>
         <w:t xml:space="preserve"> </w:t>
@@ -1004,21 +1022,6 @@
         <w:t xml:space="preserve"> </w:t>
       </w:r>
       <w:r>
-        <w:t xml:space="preserve">The deeper problem is the citation gap: fewer than 30% of secondary analyses formally cite their source data</w:t>
-      </w:r>
-      <w:r>
-        <w:t xml:space="preserve"> </w:t>
-      </w:r>
-      <w:r>
-        <w:t xml:space="preserve">[13]</w:t>
-      </w:r>
-      <w:r>
-        <w:t xml:space="preserve">.</w:t>
-      </w:r>
-      <w:r>
-        <w:t xml:space="preserve"> </w:t>
-      </w:r>
-      <w:r>
         <w:t xml:space="preserve">Standard bibliometrics therefore systematically understate reuse.</w:t>
       </w:r>
       <w:r>
@@ -1037,7 +1040,7 @@
         <w:t xml:space="preserve"> </w:t>
       </w:r>
       <w:r>
-        <w:t xml:space="preserve">[13]</w:t>
+        <w:t xml:space="preserve">[12]</w:t>
       </w:r>
       <w:r>
         <w:t xml:space="preserve">.</w:t>
@@ -1140,7 +1143,7 @@
         <w:t xml:space="preserve"> </w:t>
       </w:r>
       <w:r>
-        <w:t xml:space="preserve">[14]</w:t>
+        <w:t xml:space="preserve">[13]</w:t>
       </w:r>
       <w:r>
         <w:t xml:space="preserve">.</w:t>
@@ -1179,7 +1182,7 @@
         <w:t xml:space="preserve"> </w:t>
       </w:r>
       <w:r>
-        <w:t xml:space="preserve">[15]</w:t>
+        <w:t xml:space="preserve">[14]</w:t>
       </w:r>
       <w:r>
         <w:t xml:space="preserve">.</w:t>
@@ -1234,7 +1237,7 @@
         <w:t xml:space="preserve"> </w:t>
       </w:r>
       <w:r>
-        <w:t xml:space="preserve">[16]</w:t>
+        <w:t xml:space="preserve">[15]</w:t>
       </w:r>
       <w:r>
         <w:t xml:space="preserve">.</w:t>
@@ -1329,7 +1332,7 @@
         <w:t xml:space="preserve"> </w:t>
       </w:r>
       <w:r>
-        <w:t xml:space="preserve">[17]</w:t>
+        <w:t xml:space="preserve">[16]</w:t>
       </w:r>
       <w:r>
         <w:t xml:space="preserve">.</w:t>
@@ -1410,10 +1413,37 @@
         <w:t xml:space="preserve"> </w:t>
       </w:r>
       <w:r>
+        <w:t xml:space="preserve">[17]</w:t>
+      </w:r>
+      <w:r>
+        <w:t xml:space="preserve">, and inclusion in curated ecosystems like Bioconductor</w:t>
+      </w:r>
+      <w:r>
+        <w:t xml:space="preserve"> </w:t>
+      </w:r>
+      <w:r>
         <w:t xml:space="preserve">[18]</w:t>
       </w:r>
       <w:r>
-        <w:t xml:space="preserve">, and inclusion in curated ecosystems like Bioconductor</w:t>
+        <w:t xml:space="preserve">.</w:t>
+      </w:r>
+      <w:r>
+        <w:t xml:space="preserve"> </w:t>
+      </w:r>
+      <w:r>
+        <w:t xml:space="preserve">The ELIXIR</w:t>
+      </w:r>
+      <w:r>
+        <w:t xml:space="preserve"> </w:t>
+      </w:r>
+      <w:r>
+        <w:t xml:space="preserve">“Top 10 Metrics for Life Science Software Good Practices”</w:t>
+      </w:r>
+      <w:r>
+        <w:t xml:space="preserve"> </w:t>
+      </w:r>
+      <w:r>
+        <w:t xml:space="preserve">provides a prioritized scorecard spanning version control, discoverability, automated builds, test data, and documentation</w:t>
       </w:r>
       <w:r>
         <w:t xml:space="preserve"> </w:t>
@@ -1428,33 +1458,6 @@
         <w:t xml:space="preserve"> </w:t>
       </w:r>
       <w:r>
-        <w:t xml:space="preserve">The ELIXIR</w:t>
-      </w:r>
-      <w:r>
-        <w:t xml:space="preserve"> </w:t>
-      </w:r>
-      <w:r>
-        <w:t xml:space="preserve">“Top 10 Metrics for Life Science Software Good Practices”</w:t>
-      </w:r>
-      <w:r>
-        <w:t xml:space="preserve"> </w:t>
-      </w:r>
-      <w:r>
-        <w:t xml:space="preserve">provides a prioritized scorecard spanning version control, discoverability, automated builds, test data, and documentation</w:t>
-      </w:r>
-      <w:r>
-        <w:t xml:space="preserve"> </w:t>
-      </w:r>
-      <w:r>
-        <w:t xml:space="preserve">[20]</w:t>
-      </w:r>
-      <w:r>
-        <w:t xml:space="preserve">.</w:t>
-      </w:r>
-      <w:r>
-        <w:t xml:space="preserve"> </w:t>
-      </w:r>
-      <w:r>
         <w:t xml:space="preserve">“Minimal Reimplementation”</w:t>
       </w:r>
       <w:r>
@@ -1473,7 +1476,7 @@
         <w:t xml:space="preserve"> </w:t>
       </w:r>
       <w:r>
-        <w:t xml:space="preserve">[20]</w:t>
+        <w:t xml:space="preserve">[19]</w:t>
       </w:r>
       <w:r>
         <w:t xml:space="preserve">.</w:t>
@@ -1496,7 +1499,7 @@
         <w:t xml:space="preserve"> </w:t>
       </w:r>
       <w:r>
-        <w:t xml:space="preserve">[9]</w:t>
+        <w:t xml:space="preserve">[8]</w:t>
       </w:r>
       <w:r>
         <w:t xml:space="preserve"> </w:t>
@@ -1514,7 +1517,10 @@
         <w:t xml:space="preserve"> </w:t>
       </w:r>
       <w:r>
-        <w:t xml:space="preserve">[21]</w:t>
+        <w:rPr>
+          <w:vertAlign w:val="superscript"/>
+        </w:rPr>
+        <w:t xml:space="preserve">ii</w:t>
       </w:r>
       <w:r>
         <w:t xml:space="preserve">, developed for the life sciences, defines six levels: Level 0 (no identifiers, local storage) through Level 5 (provenance in cross-community languages, enterprise-grade lifecycle management), with intermediate levels covering persistent identifiers, indexed metadata, community reporting standards such as MIAME, and linked-data semantic representation.</w:t>
@@ -1551,7 +1557,7 @@
         <w:t xml:space="preserve"> </w:t>
       </w:r>
       <w:r>
-        <w:t xml:space="preserve">[9]</w:t>
+        <w:t xml:space="preserve">[8]</w:t>
       </w:r>
       <w:r>
         <w:t xml:space="preserve">.</w:t>
@@ -1762,7 +1768,10 @@
         <w:t xml:space="preserve"> </w:t>
       </w:r>
       <w:r>
-        <w:t xml:space="preserve">[5]</w:t>
+        <w:rPr>
+          <w:vertAlign w:val="superscript"/>
+        </w:rPr>
+        <w:t xml:space="preserve">i</w:t>
       </w:r>
       <w:r>
         <w:t xml:space="preserve">.</w:t>
@@ -1913,7 +1922,10 @@
         <w:t xml:space="preserve"> </w:t>
       </w:r>
       <w:r>
-        <w:t xml:space="preserve">[22]</w:t>
+        <w:rPr>
+          <w:vertAlign w:val="superscript"/>
+        </w:rPr>
+        <w:t xml:space="preserve">iii</w:t>
       </w:r>
       <w:r>
         <w:t xml:space="preserve">.</w:t>
@@ -1928,7 +1940,7 @@
         <w:t xml:space="preserve"> </w:t>
       </w:r>
       <w:r>
-        <w:t xml:space="preserve">[23]</w:t>
+        <w:t xml:space="preserve">[20]</w:t>
       </w:r>
       <w:r>
         <w:t xml:space="preserve">.</w:t>
@@ -7365,7 +7377,7 @@
         <w:t xml:space="preserve"> </w:t>
       </w:r>
       <w:r>
-        <w:t xml:space="preserve">[24]</w:t>
+        <w:t xml:space="preserve">[21]</w:t>
       </w:r>
       <w:r>
         <w:t xml:space="preserve"> </w:t>
@@ -7419,7 +7431,10 @@
         <w:t xml:space="preserve"> </w:t>
       </w:r>
       <w:r>
-        <w:t xml:space="preserve">[25]</w:t>
+        <w:rPr>
+          <w:vertAlign w:val="superscript"/>
+        </w:rPr>
+        <w:t xml:space="preserve">iv</w:t>
       </w:r>
       <w:r>
         <w:t xml:space="preserve">.</w:t>
@@ -7466,7 +7481,7 @@
         <w:t xml:space="preserve"> </w:t>
       </w:r>
       <w:r>
-        <w:t xml:space="preserve">[26]</w:t>
+        <w:t xml:space="preserve">[22]</w:t>
       </w:r>
       <w:r>
         <w:t xml:space="preserve">.</w:t>
@@ -7513,7 +7528,7 @@
         <w:t xml:space="preserve"> </w:t>
       </w:r>
       <w:r>
-        <w:t xml:space="preserve">[27]</w:t>
+        <w:t xml:space="preserve">[23]</w:t>
       </w:r>
       <w:r>
         <w:t xml:space="preserve">.</w:t>
@@ -7536,7 +7551,10 @@
         <w:t xml:space="preserve"> </w:t>
       </w:r>
       <w:r>
-        <w:t xml:space="preserve">[28]</w:t>
+        <w:rPr>
+          <w:vertAlign w:val="superscript"/>
+        </w:rPr>
+        <w:t xml:space="preserve">v</w:t>
       </w:r>
       <w:r>
         <w:t xml:space="preserve"> </w:t>
@@ -7580,7 +7598,7 @@
         <w:t xml:space="preserve"> </w:t>
       </w:r>
       <w:r>
-        <w:t xml:space="preserve">[29]</w:t>
+        <w:t xml:space="preserve">[24]</w:t>
       </w:r>
       <w:r>
         <w:t xml:space="preserve">.</w:t>
@@ -7621,7 +7639,7 @@
         <w:t xml:space="preserve"> </w:t>
       </w:r>
       <w:r>
-        <w:t xml:space="preserve">[30]</w:t>
+        <w:t xml:space="preserve">[25]</w:t>
       </w:r>
       <w:r>
         <w:t xml:space="preserve">.</w:t>
@@ -7642,7 +7660,10 @@
         <w:t xml:space="preserve"> </w:t>
       </w:r>
       <w:r>
-        <w:t xml:space="preserve">[31]</w:t>
+        <w:rPr>
+          <w:vertAlign w:val="superscript"/>
+        </w:rPr>
+        <w:t xml:space="preserve">vi</w:t>
       </w:r>
       <w:r>
         <w:t xml:space="preserve">, and the 2023 Data Management and Sharing Policy creates a structural opportunity to establish pre-policy baselines for sharing and reuse — a rare chance to test rigorously whether mandates translate into measurable ecosystem improvements.</w:t>
@@ -7671,7 +7692,10 @@
         <w:t xml:space="preserve"> </w:t>
       </w:r>
       <w:r>
-        <w:t xml:space="preserve">[32]</w:t>
+        <w:rPr>
+          <w:vertAlign w:val="superscript"/>
+        </w:rPr>
+        <w:t xml:space="preserve">vii</w:t>
       </w:r>
       <w:r>
         <w:t xml:space="preserve">: iterating on a small priority set of metrics with NIH program staff and cross-center representatives before expanding portfolio-wide.</w:t>
@@ -7714,13 +7738,13 @@
       </w:r>
     </w:p>
     <w:bookmarkEnd w:id="25"/>
-    <w:bookmarkStart w:id="26" w:name="author-contributions"/>
+    <w:bookmarkStart w:id="33" w:name="resources"/>
     <w:p>
       <w:pPr>
         <w:pStyle w:val="Heading2"/>
       </w:pPr>
       <w:r>
-        <w:t xml:space="preserve">Author contributions</w:t>
+        <w:t xml:space="preserve">Resources</w:t>
       </w:r>
     </w:p>
     <w:p>
@@ -7728,6 +7752,212 @@
         <w:pStyle w:val="FirstParagraph"/>
       </w:pPr>
       <w:r>
+        <w:rPr>
+          <w:vertAlign w:val="superscript"/>
+        </w:rPr>
+        <w:t xml:space="preserve">i</w:t>
+      </w:r>
+      <w:r>
+        <w:t xml:space="preserve"> </w:t>
+      </w:r>
+      <w:r>
+        <w:t xml:space="preserve">Council of Councils CFDE Working Group, Final Report:</w:t>
+      </w:r>
+      <w:r>
+        <w:t xml:space="preserve"> </w:t>
+      </w:r>
+      <w:hyperlink r:id="rId26">
+        <w:r>
+          <w:rPr>
+            <w:rStyle w:val="Hyperlink"/>
+          </w:rPr>
+          <w:t xml:space="preserve">https://dpcpsi.nih.gov/sites/default/files/Day2-1225PM-Final-Report-CFDE-CoC-WG-HorwitzWilder_.pdf</w:t>
+        </w:r>
+      </w:hyperlink>
+    </w:p>
+    <w:p>
+      <w:pPr>
+        <w:pStyle w:val="BodyText"/>
+      </w:pPr>
+      <w:r>
+        <w:rPr>
+          <w:vertAlign w:val="superscript"/>
+        </w:rPr>
+        <w:t xml:space="preserve">ii</w:t>
+      </w:r>
+      <w:r>
+        <w:t xml:space="preserve"> </w:t>
+      </w:r>
+      <w:r>
+        <w:t xml:space="preserve">FAIRplus Dataset Maturity (FAIRplus-DSM) Indicators:</w:t>
+      </w:r>
+      <w:r>
+        <w:t xml:space="preserve"> </w:t>
+      </w:r>
+      <w:hyperlink r:id="rId27">
+        <w:r>
+          <w:rPr>
+            <w:rStyle w:val="Hyperlink"/>
+          </w:rPr>
+          <w:t xml:space="preserve">https://fairplus.github.io/Data-Maturity/docs/Indicators</w:t>
+        </w:r>
+      </w:hyperlink>
+    </w:p>
+    <w:p>
+      <w:pPr>
+        <w:pStyle w:val="BodyText"/>
+      </w:pPr>
+      <w:r>
+        <w:rPr>
+          <w:vertAlign w:val="superscript"/>
+        </w:rPr>
+        <w:t xml:space="preserve">iii</w:t>
+      </w:r>
+      <w:r>
+        <w:t xml:space="preserve"> </w:t>
+      </w:r>
+      <w:r>
+        <w:t xml:space="preserve">National Academies, Open Science by Design: Realizing a Vision for 21st Century Research:</w:t>
+      </w:r>
+      <w:r>
+        <w:t xml:space="preserve"> </w:t>
+      </w:r>
+      <w:hyperlink r:id="rId28">
+        <w:r>
+          <w:rPr>
+            <w:rStyle w:val="Hyperlink"/>
+          </w:rPr>
+          <w:t xml:space="preserve">https://www.ncbi.nlm.nih.gov/books/NBK562708</w:t>
+        </w:r>
+      </w:hyperlink>
+    </w:p>
+    <w:p>
+      <w:pPr>
+        <w:pStyle w:val="BodyText"/>
+      </w:pPr>
+      <w:r>
+        <w:rPr>
+          <w:vertAlign w:val="superscript"/>
+        </w:rPr>
+        <w:t xml:space="preserve">iv</w:t>
+      </w:r>
+      <w:r>
+        <w:t xml:space="preserve"> </w:t>
+      </w:r>
+      <w:r>
+        <w:t xml:space="preserve">NIH Common Fund Data Ecosystem:</w:t>
+      </w:r>
+      <w:r>
+        <w:t xml:space="preserve"> </w:t>
+      </w:r>
+      <w:hyperlink r:id="rId29">
+        <w:r>
+          <w:rPr>
+            <w:rStyle w:val="Hyperlink"/>
+          </w:rPr>
+          <w:t xml:space="preserve">https://commonfund.nih.gov/dataecosystem</w:t>
+        </w:r>
+      </w:hyperlink>
+    </w:p>
+    <w:p>
+      <w:pPr>
+        <w:pStyle w:val="BodyText"/>
+      </w:pPr>
+      <w:r>
+        <w:rPr>
+          <w:vertAlign w:val="superscript"/>
+        </w:rPr>
+        <w:t xml:space="preserve">v</w:t>
+      </w:r>
+      <w:r>
+        <w:t xml:space="preserve"> </w:t>
+      </w:r>
+      <w:r>
+        <w:t xml:space="preserve">W. K. Kellogg Foundation, Logic Model Development Guide:</w:t>
+      </w:r>
+      <w:r>
+        <w:t xml:space="preserve"> </w:t>
+      </w:r>
+      <w:hyperlink r:id="rId30">
+        <w:r>
+          <w:rPr>
+            <w:rStyle w:val="Hyperlink"/>
+          </w:rPr>
+          <w:t xml:space="preserve">https://www.wkkf.org/resource-directory/resources/2004/01/logic-model-development-guide</w:t>
+        </w:r>
+      </w:hyperlink>
+    </w:p>
+    <w:p>
+      <w:pPr>
+        <w:pStyle w:val="BodyText"/>
+      </w:pPr>
+      <w:r>
+        <w:rPr>
+          <w:vertAlign w:val="superscript"/>
+        </w:rPr>
+        <w:t xml:space="preserve">vi</w:t>
+      </w:r>
+      <w:r>
+        <w:t xml:space="preserve"> </w:t>
+      </w:r>
+      <w:r>
+        <w:t xml:space="preserve">NIH NOT-OD-21-013 (Final NIH Policy for Data Management and Sharing):</w:t>
+      </w:r>
+      <w:r>
+        <w:t xml:space="preserve"> </w:t>
+      </w:r>
+      <w:hyperlink r:id="rId31">
+        <w:r>
+          <w:rPr>
+            <w:rStyle w:val="Hyperlink"/>
+          </w:rPr>
+          <w:t xml:space="preserve">https://grants.nih.gov/grants/guide/notice-files/NOT-OD-21-013.html</w:t>
+        </w:r>
+      </w:hyperlink>
+    </w:p>
+    <w:p>
+      <w:pPr>
+        <w:pStyle w:val="BodyText"/>
+      </w:pPr>
+      <w:r>
+        <w:rPr>
+          <w:vertAlign w:val="superscript"/>
+        </w:rPr>
+        <w:t xml:space="preserve">vii</w:t>
+      </w:r>
+      <w:r>
+        <w:t xml:space="preserve"> </w:t>
+      </w:r>
+      <w:r>
+        <w:t xml:space="preserve">GA4GH Strategic Roadmap:</w:t>
+      </w:r>
+      <w:r>
+        <w:t xml:space="preserve"> </w:t>
+      </w:r>
+      <w:hyperlink r:id="rId32">
+        <w:r>
+          <w:rPr>
+            <w:rStyle w:val="Hyperlink"/>
+          </w:rPr>
+          <w:t xml:space="preserve">https://www.ga4gh.org/about-us/strategic-road-map</w:t>
+        </w:r>
+      </w:hyperlink>
+    </w:p>
+    <w:bookmarkEnd w:id="33"/>
+    <w:bookmarkStart w:id="34" w:name="author-contributions"/>
+    <w:p>
+      <w:pPr>
+        <w:pStyle w:val="Heading2"/>
+      </w:pPr>
+      <w:r>
+        <w:t xml:space="preserve">Author contributions</w:t>
+      </w:r>
+    </w:p>
+    <w:p>
+      <w:pPr>
+        <w:pStyle w:val="FirstParagraph"/>
+      </w:pPr>
+      <w:r>
         <w:t xml:space="preserve">All authors meet the International Committee of Medical Journal Editors (ICMJE) criteria for authorship.</w:t>
       </w:r>
       <w:r>
@@ -7737,8 +7967,8 @@
         <w:t xml:space="preserve">Ethan M. Lange, Vikram Adithya Ganesh, Faisal Alquaddoomi, David Mayer, Adriana Ivich, Vince Rubinetti, Casey Greene, and Sean Davis each made substantial contributions to the conception or design of the work and to the acquisition, analysis, or interpretation of data; participated in drafting the manuscript or revising it critically for important intellectual content; approved the final version for publication; and agreed to be accountable for all aspects of the work.</w:t>
       </w:r>
     </w:p>
-    <w:bookmarkEnd w:id="26"/>
-    <w:bookmarkStart w:id="36" w:name="X071796dd6bc546c91e96cca1cf5ff96599de61f"/>
+    <w:bookmarkEnd w:id="34"/>
+    <w:bookmarkStart w:id="44" w:name="X071796dd6bc546c91e96cca1cf5ff96599de61f"/>
     <w:p>
       <w:pPr>
         <w:pStyle w:val="Heading2"/>
@@ -7802,18 +8032,18 @@
                 <wp:inline>
                   <wp:extent cx="152400" cy="152400"/>
                   <wp:effectExtent b="0" l="0" r="0" t="0"/>
-                  <wp:docPr descr="" title="" id="28" name="Picture"/>
+                  <wp:docPr descr="" title="" id="36" name="Picture"/>
                   <a:graphic>
                     <a:graphicData uri="http://schemas.openxmlformats.org/drawingml/2006/picture">
                       <pic:pic>
                         <pic:nvPicPr>
-                          <pic:cNvPr descr="/opt/quarto/share/formats/docx/note.png" id="29" name="Picture"/>
+                          <pic:cNvPr descr="/opt/quarto/share/formats/docx/note.png" id="37" name="Picture"/>
                           <pic:cNvPicPr>
                             <a:picLocks noChangeArrowheads="1" noChangeAspect="1"/>
                           </pic:cNvPicPr>
                         </pic:nvPicPr>
                         <pic:blipFill>
-                          <a:blip r:embed="rId27"/>
+                          <a:blip r:embed="rId35"/>
                           <a:stretch>
                             <a:fillRect/>
                           </a:stretch>
@@ -8180,18 +8410,18 @@
                 <wp:inline>
                   <wp:extent cx="152400" cy="152400"/>
                   <wp:effectExtent b="0" l="0" r="0" t="0"/>
-                  <wp:docPr descr="" title="" id="30" name="Picture"/>
+                  <wp:docPr descr="" title="" id="38" name="Picture"/>
                   <a:graphic>
                     <a:graphicData uri="http://schemas.openxmlformats.org/drawingml/2006/picture">
                       <pic:pic>
                         <pic:nvPicPr>
-                          <pic:cNvPr descr="/opt/quarto/share/formats/docx/note.png" id="31" name="Picture"/>
+                          <pic:cNvPr descr="/opt/quarto/share/formats/docx/note.png" id="39" name="Picture"/>
                           <pic:cNvPicPr>
                             <a:picLocks noChangeArrowheads="1" noChangeAspect="1"/>
                           </pic:cNvPicPr>
                         </pic:nvPicPr>
                         <pic:blipFill>
-                          <a:blip r:embed="rId27"/>
+                          <a:blip r:embed="rId35"/>
                           <a:stretch>
                             <a:fillRect/>
                           </a:stretch>
@@ -8308,18 +8538,18 @@
                 <wp:inline>
                   <wp:extent cx="152400" cy="152400"/>
                   <wp:effectExtent b="0" l="0" r="0" t="0"/>
-                  <wp:docPr descr="" title="" id="32" name="Picture"/>
+                  <wp:docPr descr="" title="" id="40" name="Picture"/>
                   <a:graphic>
                     <a:graphicData uri="http://schemas.openxmlformats.org/drawingml/2006/picture">
                       <pic:pic>
                         <pic:nvPicPr>
-                          <pic:cNvPr descr="/opt/quarto/share/formats/docx/note.png" id="33" name="Picture"/>
+                          <pic:cNvPr descr="/opt/quarto/share/formats/docx/note.png" id="41" name="Picture"/>
                           <pic:cNvPicPr>
                             <a:picLocks noChangeArrowheads="1" noChangeAspect="1"/>
                           </pic:cNvPicPr>
                         </pic:nvPicPr>
                         <pic:blipFill>
-                          <a:blip r:embed="rId27"/>
+                          <a:blip r:embed="rId35"/>
                           <a:stretch>
                             <a:fillRect/>
                           </a:stretch>
@@ -8479,18 +8709,18 @@
                 <wp:inline>
                   <wp:extent cx="152400" cy="152400"/>
                   <wp:effectExtent b="0" l="0" r="0" t="0"/>
-                  <wp:docPr descr="" title="" id="34" name="Picture"/>
+                  <wp:docPr descr="" title="" id="42" name="Picture"/>
                   <a:graphic>
                     <a:graphicData uri="http://schemas.openxmlformats.org/drawingml/2006/picture">
                       <pic:pic>
                         <pic:nvPicPr>
-                          <pic:cNvPr descr="/opt/quarto/share/formats/docx/note.png" id="35" name="Picture"/>
+                          <pic:cNvPr descr="/opt/quarto/share/formats/docx/note.png" id="43" name="Picture"/>
                           <pic:cNvPicPr>
                             <a:picLocks noChangeArrowheads="1" noChangeAspect="1"/>
                           </pic:cNvPicPr>
                         </pic:nvPicPr>
                         <pic:blipFill>
-                          <a:blip r:embed="rId27"/>
+                          <a:blip r:embed="rId35"/>
                           <a:stretch>
                             <a:fillRect/>
                           </a:stretch>
@@ -8566,7 +8796,7 @@
               <w:t xml:space="preserve"> </w:t>
             </w:r>
             <w:r>
-              <w:t xml:space="preserve">[8]</w:t>
+              <w:t xml:space="preserve">[7]</w:t>
             </w:r>
             <w:r>
               <w:t xml:space="preserve">. The foundational definition of the principles that anchor the scientific-quality framework throughout this paper.</w:t>
@@ -8599,7 +8829,7 @@
               <w:t xml:space="preserve"> </w:t>
             </w:r>
             <w:r>
-              <w:t xml:space="preserve">[9]</w:t>
+              <w:t xml:space="preserve">[8]</w:t>
             </w:r>
             <w:r>
               <w:t xml:space="preserve">. Operationalizes FAIR as machine-measurable indicators, which is what makes automated FAIR-compliance monitoring tractable at the portfolio scale we describe.</w:t>
@@ -8619,7 +8849,7 @@
               <w:t xml:space="preserve"> </w:t>
             </w:r>
             <w:r>
-              <w:t xml:space="preserve">[13]</w:t>
+              <w:t xml:space="preserve">[12]</w:t>
             </w:r>
             <w:r>
               <w:t xml:space="preserve">. Provides the bibliometric evidence that fewer than 30% of secondary analyses formally cite source data, the core empirical basis for our argument that citation-count KPIs systematically understate reuse.</w:t>
@@ -8672,7 +8902,7 @@
               <w:t xml:space="preserve"> </w:t>
             </w:r>
             <w:r>
-              <w:t xml:space="preserve">[17]</w:t>
+              <w:t xml:space="preserve">[16]</w:t>
             </w:r>
             <w:r>
               <w:t xml:space="preserve">. The 49-attribute fitness-for-purpose framework whose representativeness and linkability attributes are particularly load-bearing for federated ecosystems like the CFDE.</w:t>
@@ -8682,8 +8912,8 @@
         </w:tc>
       </w:tr>
     </w:tbl>
-    <w:bookmarkEnd w:id="36"/>
-    <w:bookmarkStart w:id="100" w:name="references"/>
+    <w:bookmarkEnd w:id="44"/>
+    <w:bookmarkStart w:id="94" w:name="references"/>
     <w:p>
       <w:pPr>
         <w:pStyle w:val="Heading1"/>
@@ -8692,8 +8922,8 @@
         <w:t xml:space="preserve">References</w:t>
       </w:r>
     </w:p>
-    <w:bookmarkStart w:id="99" w:name="refs"/>
-    <w:bookmarkStart w:id="38" w:name="ref-pmid:24071849"/>
+    <w:bookmarkStart w:id="93" w:name="refs"/>
+    <w:bookmarkStart w:id="46" w:name="ref-pmid:24071849"/>
     <w:p>
       <w:pPr>
         <w:pStyle w:val="Bibliography"/>
@@ -8723,7 +8953,7 @@
       <w:r>
         <w:t xml:space="preserve"> </w:t>
       </w:r>
-      <w:hyperlink r:id="rId37">
+      <w:hyperlink r:id="rId45">
         <w:r>
           <w:rPr>
             <w:rStyle w:val="Hyperlink"/>
@@ -8748,8 +8978,8 @@
         <w:t xml:space="preserve">45, 1113–20</w:t>
       </w:r>
     </w:p>
-    <w:bookmarkEnd w:id="38"/>
-    <w:bookmarkStart w:id="40" w:name="ref-doi:10.1038/ng.2653"/>
+    <w:bookmarkEnd w:id="46"/>
+    <w:bookmarkStart w:id="48" w:name="ref-doi:10.1038/ng.2653"/>
     <w:p>
       <w:pPr>
         <w:pStyle w:val="Bibliography"/>
@@ -8785,7 +9015,7 @@
       <w:r>
         <w:t xml:space="preserve"> </w:t>
       </w:r>
-      <w:hyperlink r:id="rId39">
+      <w:hyperlink r:id="rId47">
         <w:r>
           <w:rPr>
             <w:rStyle w:val="Hyperlink"/>
@@ -8813,8 +9043,8 @@
         <w:t xml:space="preserve">45, 580–585</w:t>
       </w:r>
     </w:p>
-    <w:bookmarkEnd w:id="40"/>
-    <w:bookmarkStart w:id="42" w:name="ref-doi:10.1056/NEJMsr1809937"/>
+    <w:bookmarkEnd w:id="48"/>
+    <w:bookmarkStart w:id="50" w:name="ref-doi:10.1056/NEJMsr1809937"/>
     <w:p>
       <w:pPr>
         <w:pStyle w:val="Bibliography"/>
@@ -8834,7 +9064,7 @@
       <w:r>
         <w:t xml:space="preserve"> </w:t>
       </w:r>
-      <w:hyperlink r:id="rId41">
+      <w:hyperlink r:id="rId49">
         <w:r>
           <w:rPr>
             <w:rStyle w:val="Hyperlink"/>
@@ -8886,8 +9116,8 @@
         <w:t xml:space="preserve">381, 668–676</w:t>
       </w:r>
     </w:p>
-    <w:bookmarkEnd w:id="42"/>
-    <w:bookmarkStart w:id="44" w:name="ref-doi:10.1093/gigascience/giac105"/>
+    <w:bookmarkEnd w:id="50"/>
+    <w:bookmarkStart w:id="52" w:name="ref-doi:10.1093/gigascience/giac105"/>
     <w:p>
       <w:pPr>
         <w:pStyle w:val="Bibliography"/>
@@ -8923,7 +9153,7 @@
       <w:r>
         <w:t xml:space="preserve"> </w:t>
       </w:r>
-      <w:hyperlink r:id="rId43">
+      <w:hyperlink r:id="rId51">
         <w:r>
           <w:rPr>
             <w:rStyle w:val="Hyperlink"/>
@@ -8951,8 +9181,8 @@
         <w:t xml:space="preserve">11</w:t>
       </w:r>
     </w:p>
-    <w:bookmarkEnd w:id="44"/>
-    <w:bookmarkStart w:id="46" w:name="X7a93631224c49a632e3119c84b1b3a6b629c733"/>
+    <w:bookmarkEnd w:id="52"/>
+    <w:bookmarkStart w:id="53" w:name="ref-isbn:9780471465102"/>
     <w:p>
       <w:pPr>
         <w:pStyle w:val="Bibliography"/>
@@ -8967,22 +9197,24 @@
         <w:t xml:space="preserve">	</w:t>
       </w:r>
       <w:r>
-        <w:t xml:space="preserve">[Online]. Available:</w:t>
-      </w:r>
-      <w:r>
-        <w:t xml:space="preserve"> </w:t>
-      </w:r>
-      <w:hyperlink r:id="rId45">
-        <w:r>
-          <w:rPr>
-            <w:rStyle w:val="Hyperlink"/>
-          </w:rPr>
-          <w:t xml:space="preserve">https://dpcpsi.nih.gov/sites/default/files/Day2-1225PM-Final-Report-CFDE-CoC-WG-HorwitzWilder_.pdf</w:t>
-        </w:r>
-      </w:hyperlink>
+        <w:t xml:space="preserve">Keeney, R.L. and Raiffa, H. (1976)</w:t>
+      </w:r>
+      <w:r>
+        <w:t xml:space="preserve"> </w:t>
+      </w:r>
+      <w:r>
+        <w:rPr>
+          <w:i/>
+          <w:iCs/>
+        </w:rPr>
+        <w:t xml:space="preserve">Decisions with multiple objectives: preferences and value tradeoffs</w:t>
+      </w:r>
+      <w:r>
+        <w:t xml:space="preserve">, Wiley</w:t>
+      </w:r>
     </w:p>
-    <w:bookmarkEnd w:id="46"/>
-    <w:bookmarkStart w:id="47" w:name="ref-isbn:9780471465102"/>
+    <w:bookmarkEnd w:id="53"/>
+    <w:bookmarkStart w:id="54" w:name="ref-isbn:9780792375067"/>
     <w:p>
       <w:pPr>
         <w:pStyle w:val="Bibliography"/>
@@ -8997,7 +9229,7 @@
         <w:t xml:space="preserve">	</w:t>
       </w:r>
       <w:r>
-        <w:t xml:space="preserve">Keeney, R.L. and Raiffa, H. (1976)</w:t>
+        <w:t xml:space="preserve">Eloff, J.H.P., ed. (2001)</w:t>
       </w:r>
       <w:r>
         <w:t xml:space="preserve"> </w:t>
@@ -9007,14 +9239,14 @@
           <w:i/>
           <w:iCs/>
         </w:rPr>
-        <w:t xml:space="preserve">Decisions with multiple objectives: preferences and value tradeoffs</w:t>
-      </w:r>
-      <w:r>
-        <w:t xml:space="preserve">, Wiley</w:t>
+        <w:t xml:space="preserve">Advances in information security management &amp; small systems security: IFIP TC11 WG11.1/WG11.2 Eighth Annual Working Conference on Information Security Management &amp; Small Systems Security, September 27-28, 2001, Las Vegas, Nevada, USA</w:t>
+      </w:r>
+      <w:r>
+        <w:t xml:space="preserve">, Kluwer Academic Publishers</w:t>
       </w:r>
     </w:p>
-    <w:bookmarkEnd w:id="47"/>
-    <w:bookmarkStart w:id="48" w:name="ref-isbn:9780792375067"/>
+    <w:bookmarkEnd w:id="54"/>
+    <w:bookmarkStart w:id="56" w:name="ref-doi:10.1038/sdata.2016.18"/>
     <w:p>
       <w:pPr>
         <w:pStyle w:val="Bibliography"/>
@@ -9029,7 +9261,7 @@
         <w:t xml:space="preserve">	</w:t>
       </w:r>
       <w:r>
-        <w:t xml:space="preserve">Eloff, J.H.P., ed. (2001)</w:t>
+        <w:t xml:space="preserve">Wilkinson, M.D.</w:t>
       </w:r>
       <w:r>
         <w:t xml:space="preserve"> </w:t>
@@ -9039,38 +9271,6 @@
           <w:i/>
           <w:iCs/>
         </w:rPr>
-        <w:t xml:space="preserve">Advances in information security management &amp; small systems security: IFIP TC11 WG11.1/WG11.2 Eighth Annual Working Conference on Information Security Management &amp; Small Systems Security, September 27-28, 2001, Las Vegas, Nevada, USA</w:t>
-      </w:r>
-      <w:r>
-        <w:t xml:space="preserve">, Kluwer Academic Publishers</w:t>
-      </w:r>
-    </w:p>
-    <w:bookmarkEnd w:id="48"/>
-    <w:bookmarkStart w:id="50" w:name="ref-doi:10.1038/sdata.2016.18"/>
-    <w:p>
-      <w:pPr>
-        <w:pStyle w:val="Bibliography"/>
-      </w:pPr>
-      <w:r>
-        <w:t xml:space="preserve">8.</w:t>
-      </w:r>
-      <w:r>
-        <w:t xml:space="preserve"> </w:t>
-      </w:r>
-      <w:r>
-        <w:t xml:space="preserve">	</w:t>
-      </w:r>
-      <w:r>
-        <w:t xml:space="preserve">Wilkinson, M.D.</w:t>
-      </w:r>
-      <w:r>
-        <w:t xml:space="preserve"> </w:t>
-      </w:r>
-      <w:r>
-        <w:rPr>
-          <w:i/>
-          <w:iCs/>
-        </w:rPr>
         <w:t xml:space="preserve">et al.</w:t>
       </w:r>
       <w:r>
@@ -9082,7 +9282,7 @@
       <w:r>
         <w:t xml:space="preserve"> </w:t>
       </w:r>
-      <w:hyperlink r:id="rId49">
+      <w:hyperlink r:id="rId55">
         <w:r>
           <w:rPr>
             <w:rStyle w:val="Hyperlink"/>
@@ -9110,14 +9310,14 @@
         <w:t xml:space="preserve">3</w:t>
       </w:r>
     </w:p>
-    <w:bookmarkEnd w:id="50"/>
-    <w:bookmarkStart w:id="52" w:name="ref-doi:10.1038/sdata.2018.118"/>
+    <w:bookmarkEnd w:id="56"/>
+    <w:bookmarkStart w:id="58" w:name="ref-doi:10.1038/sdata.2018.118"/>
     <w:p>
       <w:pPr>
         <w:pStyle w:val="Bibliography"/>
       </w:pPr>
       <w:r>
-        <w:t xml:space="preserve">9.</w:t>
+        <w:t xml:space="preserve">8.</w:t>
       </w:r>
       <w:r>
         <w:t xml:space="preserve"> </w:t>
@@ -9147,7 +9347,7 @@
       <w:r>
         <w:t xml:space="preserve"> </w:t>
       </w:r>
-      <w:hyperlink r:id="rId51">
+      <w:hyperlink r:id="rId57">
         <w:r>
           <w:rPr>
             <w:rStyle w:val="Hyperlink"/>
@@ -9175,14 +9375,14 @@
         <w:t xml:space="preserve">5</w:t>
       </w:r>
     </w:p>
-    <w:bookmarkEnd w:id="52"/>
-    <w:bookmarkStart w:id="54" w:name="ref-doi:10.1371/journal.pone.0311493"/>
+    <w:bookmarkEnd w:id="58"/>
+    <w:bookmarkStart w:id="60" w:name="ref-doi:10.1371/journal.pone.0311493"/>
     <w:p>
       <w:pPr>
         <w:pStyle w:val="Bibliography"/>
       </w:pPr>
       <w:r>
-        <w:t xml:space="preserve">10.</w:t>
+        <w:t xml:space="preserve">9.</w:t>
       </w:r>
       <w:r>
         <w:t xml:space="preserve"> </w:t>
@@ -9212,7 +9412,7 @@
       <w:r>
         <w:t xml:space="preserve"> </w:t>
       </w:r>
-      <w:hyperlink r:id="rId53">
+      <w:hyperlink r:id="rId59">
         <w:r>
           <w:rPr>
             <w:rStyle w:val="Hyperlink"/>
@@ -9240,14 +9440,14 @@
         <w:t xml:space="preserve">19, e0311493</w:t>
       </w:r>
     </w:p>
-    <w:bookmarkEnd w:id="54"/>
-    <w:bookmarkStart w:id="56" w:name="ref-doi:10.1038/520429a"/>
+    <w:bookmarkEnd w:id="60"/>
+    <w:bookmarkStart w:id="62" w:name="ref-doi:10.1038/520429a"/>
     <w:p>
       <w:pPr>
         <w:pStyle w:val="Bibliography"/>
       </w:pPr>
       <w:r>
-        <w:t xml:space="preserve">11.</w:t>
+        <w:t xml:space="preserve">10.</w:t>
       </w:r>
       <w:r>
         <w:t xml:space="preserve"> </w:t>
@@ -9277,7 +9477,7 @@
       <w:r>
         <w:t xml:space="preserve"> </w:t>
       </w:r>
-      <w:hyperlink r:id="rId55">
+      <w:hyperlink r:id="rId61">
         <w:r>
           <w:rPr>
             <w:rStyle w:val="Hyperlink"/>
@@ -9305,14 +9505,14 @@
         <w:t xml:space="preserve">520, 429–431</w:t>
       </w:r>
     </w:p>
-    <w:bookmarkEnd w:id="56"/>
-    <w:bookmarkStart w:id="58" w:name="ref-doi:10.4103/1008-682X.171582"/>
+    <w:bookmarkEnd w:id="62"/>
+    <w:bookmarkStart w:id="64" w:name="ref-doi:10.4103/1008-682X.171582"/>
     <w:p>
       <w:pPr>
         <w:pStyle w:val="Bibliography"/>
       </w:pPr>
       <w:r>
-        <w:t xml:space="preserve">12.</w:t>
+        <w:t xml:space="preserve">11.</w:t>
       </w:r>
       <w:r>
         <w:t xml:space="preserve"> </w:t>
@@ -9342,7 +9542,7 @@
       <w:r>
         <w:t xml:space="preserve"> </w:t>
       </w:r>
-      <w:hyperlink r:id="rId57">
+      <w:hyperlink r:id="rId63">
         <w:r>
           <w:rPr>
             <w:rStyle w:val="Hyperlink"/>
@@ -9370,14 +9570,14 @@
         <w:t xml:space="preserve">18, 296</w:t>
       </w:r>
     </w:p>
-    <w:bookmarkEnd w:id="58"/>
-    <w:bookmarkStart w:id="60" w:name="ref-doi:10.1101/2023.09.12.557386"/>
+    <w:bookmarkEnd w:id="64"/>
+    <w:bookmarkStart w:id="66" w:name="ref-doi:10.1101/2023.09.12.557386"/>
     <w:p>
       <w:pPr>
         <w:pStyle w:val="Bibliography"/>
       </w:pPr>
       <w:r>
-        <w:t xml:space="preserve">13.</w:t>
+        <w:t xml:space="preserve">12.</w:t>
       </w:r>
       <w:r>
         <w:t xml:space="preserve"> </w:t>
@@ -9407,7 +9607,7 @@
       <w:r>
         <w:t xml:space="preserve"> </w:t>
       </w:r>
-      <w:hyperlink r:id="rId59">
+      <w:hyperlink r:id="rId65">
         <w:r>
           <w:rPr>
             <w:rStyle w:val="Hyperlink"/>
@@ -9419,14 +9619,14 @@
         <w:t xml:space="preserve">openRxiv</w:t>
       </w:r>
     </w:p>
-    <w:bookmarkEnd w:id="60"/>
-    <w:bookmarkStart w:id="62" w:name="ref-doi:10.2196/63544"/>
+    <w:bookmarkEnd w:id="66"/>
+    <w:bookmarkStart w:id="68" w:name="ref-doi:10.2196/63544"/>
     <w:p>
       <w:pPr>
         <w:pStyle w:val="Bibliography"/>
       </w:pPr>
       <w:r>
-        <w:t xml:space="preserve">14.</w:t>
+        <w:t xml:space="preserve">13.</w:t>
       </w:r>
       <w:r>
         <w:t xml:space="preserve"> </w:t>
@@ -9440,7 +9640,7 @@
       <w:r>
         <w:t xml:space="preserve"> </w:t>
       </w:r>
-      <w:hyperlink r:id="rId61">
+      <w:hyperlink r:id="rId67">
         <w:r>
           <w:rPr>
             <w:rStyle w:val="Hyperlink"/>
@@ -9468,14 +9668,14 @@
         <w:t xml:space="preserve">13, e63544–e63544</w:t>
       </w:r>
     </w:p>
-    <w:bookmarkEnd w:id="62"/>
-    <w:bookmarkStart w:id="64" w:name="ref-doi:10.15265/IY-2014-0020"/>
+    <w:bookmarkEnd w:id="68"/>
+    <w:bookmarkStart w:id="70" w:name="ref-doi:10.15265/IY-2014-0020"/>
     <w:p>
       <w:pPr>
         <w:pStyle w:val="Bibliography"/>
       </w:pPr>
       <w:r>
-        <w:t xml:space="preserve">15.</w:t>
+        <w:t xml:space="preserve">14.</w:t>
       </w:r>
       <w:r>
         <w:t xml:space="preserve"> </w:t>
@@ -9489,7 +9689,7 @@
       <w:r>
         <w:t xml:space="preserve"> </w:t>
       </w:r>
-      <w:hyperlink r:id="rId63">
+      <w:hyperlink r:id="rId69">
         <w:r>
           <w:rPr>
             <w:rStyle w:val="Hyperlink"/>
@@ -9517,14 +9717,14 @@
         <w:t xml:space="preserve">23, 14–20</w:t>
       </w:r>
     </w:p>
-    <w:bookmarkEnd w:id="64"/>
-    <w:bookmarkStart w:id="66" w:name="ref-doi:10.1371/journal.pone.0229003"/>
+    <w:bookmarkEnd w:id="70"/>
+    <w:bookmarkStart w:id="72" w:name="ref-doi:10.1371/journal.pone.0229003"/>
     <w:p>
       <w:pPr>
         <w:pStyle w:val="Bibliography"/>
       </w:pPr>
       <w:r>
-        <w:t xml:space="preserve">16.</w:t>
+        <w:t xml:space="preserve">15.</w:t>
       </w:r>
       <w:r>
         <w:t xml:space="preserve"> </w:t>
@@ -9554,7 +9754,7 @@
       <w:r>
         <w:t xml:space="preserve"> </w:t>
       </w:r>
-      <w:hyperlink r:id="rId65">
+      <w:hyperlink r:id="rId71">
         <w:r>
           <w:rPr>
             <w:rStyle w:val="Hyperlink"/>
@@ -9582,14 +9782,14 @@
         <w:t xml:space="preserve">15, e0229003</w:t>
       </w:r>
     </w:p>
-    <w:bookmarkEnd w:id="66"/>
-    <w:bookmarkStart w:id="68" w:name="ref-doi:10.15585/mmwr.su7303a1"/>
+    <w:bookmarkEnd w:id="72"/>
+    <w:bookmarkStart w:id="74" w:name="ref-doi:10.15585/mmwr.su7303a1"/>
     <w:p>
       <w:pPr>
         <w:pStyle w:val="Bibliography"/>
       </w:pPr>
       <w:r>
-        <w:t xml:space="preserve">17.</w:t>
+        <w:t xml:space="preserve">16.</w:t>
       </w:r>
       <w:r>
         <w:t xml:space="preserve"> </w:t>
@@ -9619,7 +9819,7 @@
       <w:r>
         <w:t xml:space="preserve"> </w:t>
       </w:r>
-      <w:hyperlink r:id="rId67">
+      <w:hyperlink r:id="rId73">
         <w:r>
           <w:rPr>
             <w:rStyle w:val="Hyperlink"/>
@@ -9647,14 +9847,14 @@
         <w:t xml:space="preserve">73, 1–13</w:t>
       </w:r>
     </w:p>
-    <w:bookmarkEnd w:id="68"/>
-    <w:bookmarkStart w:id="70" w:name="ref-doi:10.1038/nbt.3780"/>
+    <w:bookmarkEnd w:id="74"/>
+    <w:bookmarkStart w:id="76" w:name="ref-doi:10.1038/nbt.3780"/>
     <w:p>
       <w:pPr>
         <w:pStyle w:val="Bibliography"/>
       </w:pPr>
       <w:r>
-        <w:t xml:space="preserve">18.</w:t>
+        <w:t xml:space="preserve">17.</w:t>
       </w:r>
       <w:r>
         <w:t xml:space="preserve"> </w:t>
@@ -9668,7 +9868,7 @@
       <w:r>
         <w:t xml:space="preserve"> </w:t>
       </w:r>
-      <w:hyperlink r:id="rId69">
+      <w:hyperlink r:id="rId75">
         <w:r>
           <w:rPr>
             <w:rStyle w:val="Hyperlink"/>
@@ -9696,14 +9896,14 @@
         <w:t xml:space="preserve">35, 342–346</w:t>
       </w:r>
     </w:p>
-    <w:bookmarkEnd w:id="70"/>
-    <w:bookmarkStart w:id="72" w:name="ref-doi:10.1186/gb-2004-5-10-r80"/>
+    <w:bookmarkEnd w:id="76"/>
+    <w:bookmarkStart w:id="78" w:name="ref-doi:10.1186/gb-2004-5-10-r80"/>
     <w:p>
       <w:pPr>
         <w:pStyle w:val="Bibliography"/>
       </w:pPr>
       <w:r>
-        <w:t xml:space="preserve">19.</w:t>
+        <w:t xml:space="preserve">18.</w:t>
       </w:r>
       <w:r>
         <w:t xml:space="preserve"> </w:t>
@@ -9733,7 +9933,7 @@
       <w:r>
         <w:t xml:space="preserve"> </w:t>
       </w:r>
-      <w:hyperlink r:id="rId71">
+      <w:hyperlink r:id="rId77">
         <w:r>
           <w:rPr>
             <w:rStyle w:val="Hyperlink"/>
@@ -9761,14 +9961,14 @@
         <w:t xml:space="preserve">5</w:t>
       </w:r>
     </w:p>
-    <w:bookmarkEnd w:id="72"/>
-    <w:bookmarkStart w:id="74" w:name="ref-doi:10.12688/f1000research.9206.1"/>
+    <w:bookmarkEnd w:id="78"/>
+    <w:bookmarkStart w:id="80" w:name="ref-doi:10.12688/f1000research.9206.1"/>
     <w:p>
       <w:pPr>
         <w:pStyle w:val="Bibliography"/>
       </w:pPr>
       <w:r>
-        <w:t xml:space="preserve">20.</w:t>
+        <w:t xml:space="preserve">19.</w:t>
       </w:r>
       <w:r>
         <w:t xml:space="preserve"> </w:t>
@@ -9798,7 +9998,7 @@
       <w:r>
         <w:t xml:space="preserve"> </w:t>
       </w:r>
-      <w:hyperlink r:id="rId73">
+      <w:hyperlink r:id="rId79">
         <w:r>
           <w:rPr>
             <w:rStyle w:val="Hyperlink"/>
@@ -9826,14 +10026,14 @@
         <w:t xml:space="preserve">5, 2000</w:t>
       </w:r>
     </w:p>
-    <w:bookmarkEnd w:id="74"/>
-    <w:bookmarkStart w:id="76" w:name="X2b10f9b9a4270be0d96aba4cc529b1548cdbabe"/>
+    <w:bookmarkEnd w:id="80"/>
+    <w:bookmarkStart w:id="82" w:name="ref-doi:10.1093/jamia/ocab278"/>
     <w:p>
       <w:pPr>
         <w:pStyle w:val="Bibliography"/>
       </w:pPr>
       <w:r>
-        <w:t xml:space="preserve">21.</w:t>
+        <w:t xml:space="preserve">20.</w:t>
       </w:r>
       <w:r>
         <w:t xml:space="preserve"> </w:t>
@@ -9842,7 +10042,7 @@
         <w:t xml:space="preserve">	</w:t>
       </w:r>
       <w:r>
-        <w:t xml:space="preserve">Indicators.</w:t>
+        <w:t xml:space="preserve">Kahn, M.G.</w:t>
       </w:r>
       <w:r>
         <w:t xml:space="preserve"> </w:t>
@@ -9852,126 +10052,18 @@
           <w:i/>
           <w:iCs/>
         </w:rPr>
-        <w:t xml:space="preserve">FAIRplus Data Maturity</w:t>
-      </w:r>
-      <w:r>
-        <w:t xml:space="preserve">. [Online]. Available:</w:t>
-      </w:r>
-      <w:r>
-        <w:t xml:space="preserve"> </w:t>
-      </w:r>
-      <w:hyperlink r:id="rId75">
-        <w:r>
-          <w:rPr>
-            <w:rStyle w:val="Hyperlink"/>
-          </w:rPr>
-          <w:t xml:space="preserve">https://fairplus.github.io/Data-Maturity/docs/Indicators/</w:t>
-        </w:r>
-      </w:hyperlink>
-      <w:r>
-        <w:t xml:space="preserve">. [Accessed: 16-May-2026]</w:t>
-      </w:r>
-    </w:p>
-    <w:bookmarkEnd w:id="76"/>
-    <w:bookmarkStart w:id="78" w:name="X7ad42e4ba87689c7356ff47da0c3a62acb6be13"/>
-    <w:p>
-      <w:pPr>
-        <w:pStyle w:val="Bibliography"/>
-      </w:pPr>
-      <w:r>
-        <w:t xml:space="preserve">22.</w:t>
-      </w:r>
-      <w:r>
-        <w:t xml:space="preserve"> </w:t>
-      </w:r>
-      <w:r>
-        <w:t xml:space="preserve">	</w:t>
-      </w:r>
-      <w:r>
-        <w:t xml:space="preserve">National Academies of Sciences, E.</w:t>
-      </w:r>
-      <w:r>
-        <w:t xml:space="preserve"> </w:t>
-      </w:r>
-      <w:r>
-        <w:rPr>
-          <w:i/>
-          <w:iCs/>
-        </w:rPr>
         <w:t xml:space="preserve">et al.</w:t>
       </w:r>
       <w:r>
         <w:t xml:space="preserve"> </w:t>
       </w:r>
       <w:r>
-        <w:t xml:space="preserve">(2020)</w:t>
-      </w:r>
-      <w:r>
-        <w:t xml:space="preserve"> </w:t>
-      </w:r>
-      <w:hyperlink r:id="rId77">
-        <w:r>
-          <w:rPr>
-            <w:rStyle w:val="Hyperlink"/>
-          </w:rPr>
-          <w:t xml:space="preserve">The Cost-Forecasting Framework: Identifying Cost Drivers in the Biomedical Data Life Cycle</w:t>
-        </w:r>
-      </w:hyperlink>
-      <w:r>
-        <w:t xml:space="preserve">. In</w:t>
-      </w:r>
-      <w:r>
-        <w:t xml:space="preserve"> </w:t>
-      </w:r>
-      <w:r>
-        <w:rPr>
-          <w:i/>
-          <w:iCs/>
-        </w:rPr>
-        <w:t xml:space="preserve">Life-Cycle Decisions for Biomedical Data: The Challenge of Forecasting Costs</w:t>
-      </w:r>
-      <w:r>
-        <w:t xml:space="preserve">, National Academies Press (US)</w:t>
-      </w:r>
-    </w:p>
-    <w:bookmarkEnd w:id="78"/>
-    <w:bookmarkStart w:id="80" w:name="ref-doi:10.1093/jamia/ocab278"/>
-    <w:p>
-      <w:pPr>
-        <w:pStyle w:val="Bibliography"/>
-      </w:pPr>
-      <w:r>
-        <w:t xml:space="preserve">23.</w:t>
-      </w:r>
-      <w:r>
-        <w:t xml:space="preserve"> </w:t>
-      </w:r>
-      <w:r>
-        <w:t xml:space="preserve">	</w:t>
-      </w:r>
-      <w:r>
-        <w:t xml:space="preserve">Kahn, M.G.</w:t>
-      </w:r>
-      <w:r>
-        <w:t xml:space="preserve"> </w:t>
-      </w:r>
-      <w:r>
-        <w:rPr>
-          <w:i/>
-          <w:iCs/>
-        </w:rPr>
-        <w:t xml:space="preserve">et al.</w:t>
-      </w:r>
-      <w:r>
-        <w:t xml:space="preserve"> </w:t>
-      </w:r>
-      <w:r>
         <w:t xml:space="preserve">(2021)</w:t>
       </w:r>
       <w:r>
         <w:t xml:space="preserve"> </w:t>
       </w:r>
-      <w:hyperlink r:id="rId79">
+      <w:hyperlink r:id="rId81">
         <w:r>
           <w:rPr>
             <w:rStyle w:val="Hyperlink"/>
@@ -9999,14 +10091,14 @@
         <w:t xml:space="preserve">29, 592–600</w:t>
       </w:r>
     </w:p>
-    <w:bookmarkEnd w:id="80"/>
-    <w:bookmarkStart w:id="82" w:name="ref-doi:10.48550/arXiv.2509.12709"/>
+    <w:bookmarkEnd w:id="82"/>
+    <w:bookmarkStart w:id="84" w:name="ref-doi:10.48550/arXiv.2509.12709"/>
     <w:p>
       <w:pPr>
         <w:pStyle w:val="Bibliography"/>
       </w:pPr>
       <w:r>
-        <w:t xml:space="preserve">24.</w:t>
+        <w:t xml:space="preserve">21.</w:t>
       </w:r>
       <w:r>
         <w:t xml:space="preserve"> </w:t>
@@ -10036,7 +10128,7 @@
       <w:r>
         <w:t xml:space="preserve"> </w:t>
       </w:r>
-      <w:hyperlink r:id="rId81">
+      <w:hyperlink r:id="rId83">
         <w:r>
           <w:rPr>
             <w:rStyle w:val="Hyperlink"/>
@@ -10048,39 +10140,6 @@
         <w:t xml:space="preserve">arXiv</w:t>
       </w:r>
     </w:p>
-    <w:bookmarkEnd w:id="82"/>
-    <w:bookmarkStart w:id="84" w:name="Xc1554ee4988a5c64dd2a8bc05a8ce444d54a496"/>
-    <w:p>
-      <w:pPr>
-        <w:pStyle w:val="Bibliography"/>
-      </w:pPr>
-      <w:r>
-        <w:t xml:space="preserve">25.</w:t>
-      </w:r>
-      <w:r>
-        <w:t xml:space="preserve"> </w:t>
-      </w:r>
-      <w:r>
-        <w:t xml:space="preserve">	</w:t>
-      </w:r>
-      <w:r>
-        <w:t xml:space="preserve">Common Fund Data Ecosystem (CFDE) | NIH Common Fund[Online]. Available:</w:t>
-      </w:r>
-      <w:r>
-        <w:t xml:space="preserve"> </w:t>
-      </w:r>
-      <w:hyperlink r:id="rId83">
-        <w:r>
-          <w:rPr>
-            <w:rStyle w:val="Hyperlink"/>
-          </w:rPr>
-          <w:t xml:space="preserve">https://commonfund.nih.gov/dataecosystem</w:t>
-        </w:r>
-      </w:hyperlink>
-      <w:r>
-        <w:t xml:space="preserve">. [Accessed: 16-May-2026]</w:t>
-      </w:r>
-    </w:p>
     <w:bookmarkEnd w:id="84"/>
     <w:bookmarkStart w:id="86" w:name="ref-doi:10.1007/s10488-013-0528-y"/>
     <w:p>
@@ -10088,7 +10147,7 @@
         <w:pStyle w:val="Bibliography"/>
       </w:pPr>
       <w:r>
-        <w:t xml:space="preserve">26.</w:t>
+        <w:t xml:space="preserve">22.</w:t>
       </w:r>
       <w:r>
         <w:t xml:space="preserve"> </w:t>
@@ -10153,7 +10212,7 @@
         <w:pStyle w:val="Bibliography"/>
       </w:pPr>
       <w:r>
-        <w:t xml:space="preserve">27.</w:t>
+        <w:t xml:space="preserve">23.</w:t>
       </w:r>
       <w:r>
         <w:t xml:space="preserve"> </w:t>
@@ -10196,43 +10255,13 @@
       </w:r>
     </w:p>
     <w:bookmarkEnd w:id="88"/>
-    <w:bookmarkStart w:id="90" w:name="X76ee81cf61288aec0f48b9d17d5a06038eee18d"/>
+    <w:bookmarkStart w:id="90" w:name="ref-pmid:30861395"/>
     <w:p>
       <w:pPr>
         <w:pStyle w:val="Bibliography"/>
       </w:pPr>
       <w:r>
-        <w:t xml:space="preserve">28.</w:t>
-      </w:r>
-      <w:r>
-        <w:t xml:space="preserve"> </w:t>
-      </w:r>
-      <w:r>
-        <w:t xml:space="preserve">	</w:t>
-      </w:r>
-      <w:r>
-        <w:t xml:space="preserve">[Online]. Available:</w:t>
-      </w:r>
-      <w:r>
-        <w:t xml:space="preserve"> </w:t>
-      </w:r>
-      <w:hyperlink r:id="rId89">
-        <w:r>
-          <w:rPr>
-            <w:rStyle w:val="Hyperlink"/>
-          </w:rPr>
-          <w:t xml:space="preserve">https://www.wkkf.org/resource-directory/resources/2004/01/logic-model-development-guide</w:t>
-        </w:r>
-      </w:hyperlink>
-    </w:p>
-    <w:bookmarkEnd w:id="90"/>
-    <w:bookmarkStart w:id="92" w:name="ref-pmid:30861395"/>
-    <w:p>
-      <w:pPr>
-        <w:pStyle w:val="Bibliography"/>
-      </w:pPr>
-      <w:r>
-        <w:t xml:space="preserve">29.</w:t>
+        <w:t xml:space="preserve">24.</w:t>
       </w:r>
       <w:r>
         <w:t xml:space="preserve"> </w:t>
@@ -10262,7 +10291,7 @@
       <w:r>
         <w:t xml:space="preserve"> </w:t>
       </w:r>
-      <w:hyperlink r:id="rId91">
+      <w:hyperlink r:id="rId89">
         <w:r>
           <w:rPr>
             <w:rStyle w:val="Hyperlink"/>
@@ -10287,14 +10316,14 @@
         <w:t xml:space="preserve">74, 69–75</w:t>
       </w:r>
     </w:p>
-    <w:bookmarkEnd w:id="92"/>
-    <w:bookmarkStart w:id="94" w:name="ref-doi:10.1016/j.socscimed.2017.03.041"/>
+    <w:bookmarkEnd w:id="90"/>
+    <w:bookmarkStart w:id="92" w:name="ref-doi:10.1016/j.socscimed.2017.03.041"/>
     <w:p>
       <w:pPr>
         <w:pStyle w:val="Bibliography"/>
       </w:pPr>
       <w:r>
-        <w:t xml:space="preserve">30.</w:t>
+        <w:t xml:space="preserve">25.</w:t>
       </w:r>
       <w:r>
         <w:t xml:space="preserve"> </w:t>
@@ -10308,7 +10337,7 @@
       <w:r>
         <w:t xml:space="preserve"> </w:t>
       </w:r>
-      <w:hyperlink r:id="rId93">
+      <w:hyperlink r:id="rId91">
         <w:r>
           <w:rPr>
             <w:rStyle w:val="Hyperlink"/>
@@ -10336,75 +10365,9 @@
         <w:t xml:space="preserve">181, 54–65</w:t>
       </w:r>
     </w:p>
+    <w:bookmarkEnd w:id="92"/>
+    <w:bookmarkEnd w:id="93"/>
     <w:bookmarkEnd w:id="94"/>
-    <w:bookmarkStart w:id="96" w:name="X95f22a201431050b3e5367321fb4ecc35cbc91c"/>
-    <w:p>
-      <w:pPr>
-        <w:pStyle w:val="Bibliography"/>
-      </w:pPr>
-      <w:r>
-        <w:t xml:space="preserve">31.</w:t>
-      </w:r>
-      <w:r>
-        <w:t xml:space="preserve"> </w:t>
-      </w:r>
-      <w:r>
-        <w:t xml:space="preserve">	</w:t>
-      </w:r>
-      <w:r>
-        <w:t xml:space="preserve">NOT-OD-21-013: Final NIH Policy for Data Management and Sharing[Online]. Available:</w:t>
-      </w:r>
-      <w:r>
-        <w:t xml:space="preserve"> </w:t>
-      </w:r>
-      <w:hyperlink r:id="rId95">
-        <w:r>
-          <w:rPr>
-            <w:rStyle w:val="Hyperlink"/>
-          </w:rPr>
-          <w:t xml:space="preserve">https://grants.nih.gov/grants/guide/notice-files/NOT-OD-21-013.html</w:t>
-        </w:r>
-      </w:hyperlink>
-      <w:r>
-        <w:t xml:space="preserve">. [Accessed: 16-May-2026]</w:t>
-      </w:r>
-    </w:p>
-    <w:bookmarkEnd w:id="96"/>
-    <w:bookmarkStart w:id="98" w:name="X999055200295ead81fddf881b6ef724ff612aa1"/>
-    <w:p>
-      <w:pPr>
-        <w:pStyle w:val="Bibliography"/>
-      </w:pPr>
-      <w:r>
-        <w:t xml:space="preserve">32.</w:t>
-      </w:r>
-      <w:r>
-        <w:t xml:space="preserve"> </w:t>
-      </w:r>
-      <w:r>
-        <w:t xml:space="preserve">	</w:t>
-      </w:r>
-      <w:r>
-        <w:t xml:space="preserve">Strategic Road Map[Online]. Available:</w:t>
-      </w:r>
-      <w:r>
-        <w:t xml:space="preserve"> </w:t>
-      </w:r>
-      <w:hyperlink r:id="rId97">
-        <w:r>
-          <w:rPr>
-            <w:rStyle w:val="Hyperlink"/>
-          </w:rPr>
-          <w:t xml:space="preserve">https://www.ga4gh.org/about-us/strategic-road-map/</w:t>
-        </w:r>
-      </w:hyperlink>
-      <w:r>
-        <w:t xml:space="preserve">. [Accessed: 16-May-2026]</w:t>
-      </w:r>
-    </w:p>
-    <w:bookmarkEnd w:id="98"/>
-    <w:bookmarkEnd w:id="99"/>
-    <w:bookmarkEnd w:id="100"/>
     <w:sectPr>
       <w:footnotePr>
         <w:numRestart w:val="eachSect"/>

</xml_diff>

<commit_message>
Render push 563e9688d512bd477bd376791bc81c716ca02e89 Merge pull request #35 from seandavi/issue-29-separate-deliverables
Split separate-file deliverables into their own render targets (#29) 563e9688d512bd477bd376791bc81c716ca02e89
</commit_message>
<xml_diff>
--- a/manuscript.docx
+++ b/manuscript.docx
@@ -7968,7 +7968,7 @@
       </w:r>
     </w:p>
     <w:bookmarkEnd w:id="34"/>
-    <w:bookmarkStart w:id="44" w:name="X071796dd6bc546c91e96cca1cf5ff96599de61f"/>
+    <w:bookmarkStart w:id="38" w:name="X071796dd6bc546c91e96cca1cf5ff96599de61f"/>
     <w:p>
       <w:pPr>
         <w:pStyle w:val="Heading2"/>
@@ -8369,551 +8369,8 @@
         </w:tc>
       </w:tr>
     </w:tbl>
-    <w:tbl>
-      <w:tblPr>
-        <w:tblStyle w:val="Table"/>
-        <w:tblLook w:firstRow="0" w:lastRow="0" w:firstColumn="0" w:lastColumn="0" w:noHBand="0" w:noVBand="0" w:val="0000"/>
-        <w:tblBorders>
-          <w:top w:val="single" w:sz="4" w:space="0" w:color="0758E5"/>
-          <w:left w:val="single" w:sz="24" w:space="0" w:color="0758E5"/>
-          <w:bottom w:val="single" w:sz="4" w:space="0" w:color="0758E5"/>
-          <w:right w:val="single" w:sz="4" w:space="0" w:color="0758E5"/>
-        </w:tblBorders>
-        <w:tblCellMar>
-          <w:left w:w="144" w:type="dxa"/>
-          <w:right w:w="144" w:type="dxa"/>
-        </w:tblCellMar>
-        <w:tblLook w:firstRow="0" w:lastRow="0" w:firstColumn="0" w:lastColumn="0" w:noHBand="0" w:noVBand="0" w:val="0000"/>
-      </w:tblPr>
-      <w:tr>
-        <w:trPr>
-          <w:cantSplit/>
-        </w:trPr>
-        <w:tc>
-          <w:tcPr>
-            <w:shd w:color="auto" w:fill="dae6fb" w:val="clear"/>
-            <w:tcMar>
-              <w:top w:w="92" w:type="dxa"/>
-              <w:bottom w:w="92" w:type="dxa"/>
-            </w:tcMar>
-          </w:tcPr>
-          <w:p>
-            <w:pPr>
-              <w:pStyle w:val="BodyText"/>
-            </w:pPr>
-            <w:pPr>
-              <w:spacing w:before="0" w:after="0"/>
-              <w:textAlignment w:val="center"/>
-            </w:pPr>
-            <w:r>
-              <w:drawing>
-                <wp:inline>
-                  <wp:extent cx="152400" cy="152400"/>
-                  <wp:effectExtent b="0" l="0" r="0" t="0"/>
-                  <wp:docPr descr="" title="" id="38" name="Picture"/>
-                  <a:graphic>
-                    <a:graphicData uri="http://schemas.openxmlformats.org/drawingml/2006/picture">
-                      <pic:pic>
-                        <pic:nvPicPr>
-                          <pic:cNvPr descr="/opt/quarto/share/formats/docx/note.png" id="39" name="Picture"/>
-                          <pic:cNvPicPr>
-                            <a:picLocks noChangeArrowheads="1" noChangeAspect="1"/>
-                          </pic:cNvPicPr>
-                        </pic:nvPicPr>
-                        <pic:blipFill>
-                          <a:blip r:embed="rId35"/>
-                          <a:stretch>
-                            <a:fillRect/>
-                          </a:stretch>
-                        </pic:blipFill>
-                        <pic:spPr bwMode="auto">
-                          <a:xfrm>
-                            <a:off x="0" y="0"/>
-                            <a:ext cx="152400" cy="152400"/>
-                          </a:xfrm>
-                          <a:prstGeom prst="rect">
-                            <a:avLst/>
-                          </a:prstGeom>
-                          <a:noFill/>
-                          <a:ln w="9525">
-                            <a:noFill/>
-                            <a:headEnd/>
-                            <a:tailEnd/>
-                          </a:ln>
-                        </pic:spPr>
-                      </pic:pic>
-                    </a:graphicData>
-                  </a:graphic>
-                </wp:inline>
-              </w:drawing>
-            </w:r>
-            <w:r>
-              <w:t xml:space="preserve"> </w:t>
-            </w:r>
-            <w:r>
-              <w:t xml:space="preserve"> </w:t>
-            </w:r>
-            <w:r>
-              <w:t xml:space="preserve">Significance statement</w:t>
-            </w:r>
-          </w:p>
-        </w:tc>
-      </w:tr>
-      <w:tr>
-        <w:trPr>
-          <w:cantSplit/>
-        </w:trPr>
-        <w:tc>
-          <w:tcPr>
-            <w:tcMar>
-              <w:top w:w="108" w:type="dxa"/>
-              <w:bottom w:w="108" w:type="dxa"/>
-            </w:tcMar>
-          </w:tcPr>
-          <w:p>
-            <w:pPr>
-              <w:pStyle w:val="BodyText"/>
-            </w:pPr>
-            <w:pPr>
-              <w:spacing w:before="16" w:after="16"/>
-            </w:pPr>
-            <w:r>
-              <w:t xml:space="preserve">Public biomedical data ecosystems are now core scientific infrastructure, but each funded program tracks its own metrics differently, so portfolio-level comparison is effectively impossible.</w:t>
-            </w:r>
-            <w:r>
-              <w:t xml:space="preserve"> </w:t>
-            </w:r>
-            <w:r>
-              <w:t xml:space="preserve">We argue that three product-strategy frameworks — public value, scientific quality, operations and finance — map onto research data resources, that their weight shifts predictably across a resource’s lifecycle, and that ignoring this shift misallocates funding.</w:t>
-            </w:r>
-            <w:r>
-              <w:t xml:space="preserve"> </w:t>
-            </w:r>
-            <w:r>
-              <w:t xml:space="preserve">The NIH Common Fund Data Ecosystem operationalizes the model across 19 programs in real time.</w:t>
-            </w:r>
-          </w:p>
-          <w:p/>
-        </w:tc>
-      </w:tr>
-    </w:tbl>
-    <w:tbl>
-      <w:tblPr>
-        <w:tblStyle w:val="Table"/>
-        <w:tblLook w:firstRow="0" w:lastRow="0" w:firstColumn="0" w:lastColumn="0" w:noHBand="0" w:noVBand="0" w:val="0000"/>
-        <w:tblBorders>
-          <w:top w:val="single" w:sz="4" w:space="0" w:color="0758E5"/>
-          <w:left w:val="single" w:sz="24" w:space="0" w:color="0758E5"/>
-          <w:bottom w:val="single" w:sz="4" w:space="0" w:color="0758E5"/>
-          <w:right w:val="single" w:sz="4" w:space="0" w:color="0758E5"/>
-        </w:tblBorders>
-        <w:tblCellMar>
-          <w:left w:w="144" w:type="dxa"/>
-          <w:right w:w="144" w:type="dxa"/>
-        </w:tblCellMar>
-        <w:tblLook w:firstRow="0" w:lastRow="0" w:firstColumn="0" w:lastColumn="0" w:noHBand="0" w:noVBand="0" w:val="0000"/>
-      </w:tblPr>
-      <w:tr>
-        <w:trPr>
-          <w:cantSplit/>
-        </w:trPr>
-        <w:tc>
-          <w:tcPr>
-            <w:shd w:color="auto" w:fill="dae6fb" w:val="clear"/>
-            <w:tcMar>
-              <w:top w:w="92" w:type="dxa"/>
-              <w:bottom w:w="92" w:type="dxa"/>
-            </w:tcMar>
-          </w:tcPr>
-          <w:p>
-            <w:pPr>
-              <w:pStyle w:val="BodyText"/>
-            </w:pPr>
-            <w:pPr>
-              <w:spacing w:before="0" w:after="0"/>
-              <w:textAlignment w:val="center"/>
-            </w:pPr>
-            <w:r>
-              <w:drawing>
-                <wp:inline>
-                  <wp:extent cx="152400" cy="152400"/>
-                  <wp:effectExtent b="0" l="0" r="0" t="0"/>
-                  <wp:docPr descr="" title="" id="40" name="Picture"/>
-                  <a:graphic>
-                    <a:graphicData uri="http://schemas.openxmlformats.org/drawingml/2006/picture">
-                      <pic:pic>
-                        <pic:nvPicPr>
-                          <pic:cNvPr descr="/opt/quarto/share/formats/docx/note.png" id="41" name="Picture"/>
-                          <pic:cNvPicPr>
-                            <a:picLocks noChangeArrowheads="1" noChangeAspect="1"/>
-                          </pic:cNvPicPr>
-                        </pic:nvPicPr>
-                        <pic:blipFill>
-                          <a:blip r:embed="rId35"/>
-                          <a:stretch>
-                            <a:fillRect/>
-                          </a:stretch>
-                        </pic:blipFill>
-                        <pic:spPr bwMode="auto">
-                          <a:xfrm>
-                            <a:off x="0" y="0"/>
-                            <a:ext cx="152400" cy="152400"/>
-                          </a:xfrm>
-                          <a:prstGeom prst="rect">
-                            <a:avLst/>
-                          </a:prstGeom>
-                          <a:noFill/>
-                          <a:ln w="9525">
-                            <a:noFill/>
-                            <a:headEnd/>
-                            <a:tailEnd/>
-                          </a:ln>
-                        </pic:spPr>
-                      </pic:pic>
-                    </a:graphicData>
-                  </a:graphic>
-                </wp:inline>
-              </w:drawing>
-            </w:r>
-            <w:r>
-              <w:t xml:space="preserve"> </w:t>
-            </w:r>
-            <w:r>
-              <w:t xml:space="preserve"> </w:t>
-            </w:r>
-            <w:r>
-              <w:t xml:space="preserve">Outstanding Questions</w:t>
-            </w:r>
-          </w:p>
-        </w:tc>
-      </w:tr>
-      <w:tr>
-        <w:trPr>
-          <w:cantSplit/>
-        </w:trPr>
-        <w:tc>
-          <w:tcPr>
-            <w:tcMar>
-              <w:top w:w="108" w:type="dxa"/>
-              <w:bottom w:w="108" w:type="dxa"/>
-            </w:tcMar>
-          </w:tcPr>
-          <w:p>
-            <w:pPr>
-              <w:numPr>
-                <w:ilvl w:val="0"/>
-                <w:numId w:val="1001"/>
-              </w:numPr>
-            </w:pPr>
-            <w:r>
-              <w:t xml:space="preserve">At what break-even point does the curation cost of a shared dataset get recovered by downstream reuse, and how should that point inform the decision to invest in further sharing versus letting a resource sunset?</w:t>
-            </w:r>
-          </w:p>
-          <w:p>
-            <w:pPr>
-              <w:numPr>
-                <w:ilvl w:val="0"/>
-                <w:numId w:val="1001"/>
-              </w:numPr>
-            </w:pPr>
-            <w:r>
-              <w:t xml:space="preserve">As the data-citation gap persists, what KPI should replace raw citation counts as the primary measure of data-resource impact, and how do we collect it at portfolio scale without burdening individual projects?</w:t>
-            </w:r>
-          </w:p>
-          <w:p>
-            <w:pPr>
-              <w:numPr>
-                <w:ilvl w:val="0"/>
-                <w:numId w:val="1001"/>
-              </w:numPr>
-            </w:pPr>
-            <w:r>
-              <w:t xml:space="preserve">How should cross-disciplinary co-authorship arising from a shared dataset be weighted relative to direct citation when evaluating a resource’s scientific influence?</w:t>
-            </w:r>
-          </w:p>
-          <w:p>
-            <w:pPr>
-              <w:numPr>
-                <w:ilvl w:val="0"/>
-                <w:numId w:val="1001"/>
-              </w:numPr>
-            </w:pPr>
-            <w:r>
-              <w:t xml:space="preserve">What is the right cadence for re-assessing the FAIR maturity of an active data resource, who owns the re-assessment, and how do we keep the process tractable as portfolios grow?</w:t>
-            </w:r>
-          </w:p>
-          <w:p>
-            <w:pPr>
-              <w:numPr>
-                <w:ilvl w:val="0"/>
-                <w:numId w:val="1001"/>
-              </w:numPr>
-            </w:pPr>
-            <w:r>
-              <w:t xml:space="preserve">As AI-driven and agent-based traffic on data portals continues to grow, how do we partition it into noise to remove versus signal to interpret as evidence of resource value?</w:t>
-            </w:r>
-          </w:p>
-          <w:p>
-            <w:pPr>
-              <w:numPr>
-                <w:ilvl w:val="0"/>
-                <w:numId w:val="1001"/>
-              </w:numPr>
-            </w:pPr>
-            <w:r>
-              <w:t xml:space="preserve">What governance structures keep federated evaluation frameworks honest as they evolve, so that metrics continue to serve funders’ strategic questions rather than drifting toward data managers’ reporting convenience?</w:t>
-            </w:r>
-          </w:p>
-          <w:p/>
-        </w:tc>
-      </w:tr>
-    </w:tbl>
-    <w:tbl>
-      <w:tblPr>
-        <w:tblStyle w:val="Table"/>
-        <w:tblLook w:firstRow="0" w:lastRow="0" w:firstColumn="0" w:lastColumn="0" w:noHBand="0" w:noVBand="0" w:val="0000"/>
-        <w:tblBorders>
-          <w:top w:val="single" w:sz="4" w:space="0" w:color="0758E5"/>
-          <w:left w:val="single" w:sz="24" w:space="0" w:color="0758E5"/>
-          <w:bottom w:val="single" w:sz="4" w:space="0" w:color="0758E5"/>
-          <w:right w:val="single" w:sz="4" w:space="0" w:color="0758E5"/>
-        </w:tblBorders>
-        <w:tblCellMar>
-          <w:left w:w="144" w:type="dxa"/>
-          <w:right w:w="144" w:type="dxa"/>
-        </w:tblCellMar>
-        <w:tblLook w:firstRow="0" w:lastRow="0" w:firstColumn="0" w:lastColumn="0" w:noHBand="0" w:noVBand="0" w:val="0000"/>
-      </w:tblPr>
-      <w:tr>
-        <w:trPr>
-          <w:cantSplit/>
-        </w:trPr>
-        <w:tc>
-          <w:tcPr>
-            <w:shd w:color="auto" w:fill="dae6fb" w:val="clear"/>
-            <w:tcMar>
-              <w:top w:w="92" w:type="dxa"/>
-              <w:bottom w:w="92" w:type="dxa"/>
-            </w:tcMar>
-          </w:tcPr>
-          <w:p>
-            <w:pPr>
-              <w:pStyle w:val="FirstParagraph"/>
-            </w:pPr>
-            <w:pPr>
-              <w:spacing w:before="0" w:after="0"/>
-              <w:textAlignment w:val="center"/>
-            </w:pPr>
-            <w:r>
-              <w:drawing>
-                <wp:inline>
-                  <wp:extent cx="152400" cy="152400"/>
-                  <wp:effectExtent b="0" l="0" r="0" t="0"/>
-                  <wp:docPr descr="" title="" id="42" name="Picture"/>
-                  <a:graphic>
-                    <a:graphicData uri="http://schemas.openxmlformats.org/drawingml/2006/picture">
-                      <pic:pic>
-                        <pic:nvPicPr>
-                          <pic:cNvPr descr="/opt/quarto/share/formats/docx/note.png" id="43" name="Picture"/>
-                          <pic:cNvPicPr>
-                            <a:picLocks noChangeArrowheads="1" noChangeAspect="1"/>
-                          </pic:cNvPicPr>
-                        </pic:nvPicPr>
-                        <pic:blipFill>
-                          <a:blip r:embed="rId35"/>
-                          <a:stretch>
-                            <a:fillRect/>
-                          </a:stretch>
-                        </pic:blipFill>
-                        <pic:spPr bwMode="auto">
-                          <a:xfrm>
-                            <a:off x="0" y="0"/>
-                            <a:ext cx="152400" cy="152400"/>
-                          </a:xfrm>
-                          <a:prstGeom prst="rect">
-                            <a:avLst/>
-                          </a:prstGeom>
-                          <a:noFill/>
-                          <a:ln w="9525">
-                            <a:noFill/>
-                            <a:headEnd/>
-                            <a:tailEnd/>
-                          </a:ln>
-                        </pic:spPr>
-                      </pic:pic>
-                    </a:graphicData>
-                  </a:graphic>
-                </wp:inline>
-              </w:drawing>
-            </w:r>
-            <w:r>
-              <w:t xml:space="preserve"> </w:t>
-            </w:r>
-            <w:r>
-              <w:t xml:space="preserve"> </w:t>
-            </w:r>
-            <w:r>
-              <w:t xml:space="preserve">Key References</w:t>
-            </w:r>
-          </w:p>
-        </w:tc>
-      </w:tr>
-      <w:tr>
-        <w:trPr>
-          <w:cantSplit/>
-        </w:trPr>
-        <w:tc>
-          <w:tcPr>
-            <w:tcMar>
-              <w:top w:w="108" w:type="dxa"/>
-              <w:bottom w:w="108" w:type="dxa"/>
-            </w:tcMar>
-          </w:tcPr>
-          <w:p>
-            <w:pPr>
-              <w:numPr>
-                <w:ilvl w:val="0"/>
-                <w:numId w:val="1002"/>
-              </w:numPr>
-            </w:pPr>
-            <w:r>
-              <w:t xml:space="preserve">Wilkinson MD et al. The FAIR Guiding Principles for scientific data management and stewardship.</w:t>
-            </w:r>
-            <w:r>
-              <w:t xml:space="preserve"> </w:t>
-            </w:r>
-            <w:r>
-              <w:rPr>
-                <w:i/>
-                <w:iCs/>
-              </w:rPr>
-              <w:t xml:space="preserve">Scientific Data</w:t>
-            </w:r>
-            <w:r>
-              <w:t xml:space="preserve">, 2016</w:t>
-            </w:r>
-            <w:r>
-              <w:t xml:space="preserve"> </w:t>
-            </w:r>
-            <w:r>
-              <w:t xml:space="preserve">[7]</w:t>
-            </w:r>
-            <w:r>
-              <w:t xml:space="preserve">. The foundational definition of the principles that anchor the scientific-quality framework throughout this paper.</w:t>
-            </w:r>
-          </w:p>
-          <w:p>
-            <w:pPr>
-              <w:numPr>
-                <w:ilvl w:val="0"/>
-                <w:numId w:val="1002"/>
-              </w:numPr>
-            </w:pPr>
-            <w:r>
-              <w:t xml:space="preserve">Wilkinson MD et al. A design framework and exemplar metrics for FAIRness.</w:t>
-            </w:r>
-            <w:r>
-              <w:t xml:space="preserve"> </w:t>
-            </w:r>
-            <w:r>
-              <w:rPr>
-                <w:i/>
-                <w:iCs/>
-              </w:rPr>
-              <w:t xml:space="preserve">Scientific Data</w:t>
-            </w:r>
-            <w:r>
-              <w:t xml:space="preserve">, 2018</w:t>
-            </w:r>
-            <w:r>
-              <w:t xml:space="preserve"> </w:t>
-            </w:r>
-            <w:r>
-              <w:t xml:space="preserve">[8]</w:t>
-            </w:r>
-            <w:r>
-              <w:t xml:space="preserve">. Operationalizes FAIR as machine-measurable indicators, which is what makes automated FAIR-compliance monitoring tractable at the portfolio scale we describe.</w:t>
-            </w:r>
-          </w:p>
-          <w:p>
-            <w:pPr>
-              <w:numPr>
-                <w:ilvl w:val="0"/>
-                <w:numId w:val="1002"/>
-              </w:numPr>
-            </w:pPr>
-            <w:r>
-              <w:t xml:space="preserve">Tedersoo L et al. Data sharing practices and data availability upon request differ across scientific disciplines</w:t>
-            </w:r>
-            <w:r>
-              <w:t xml:space="preserve"> </w:t>
-            </w:r>
-            <w:r>
-              <w:t xml:space="preserve">[12]</w:t>
-            </w:r>
-            <w:r>
-              <w:t xml:space="preserve">. Provides the bibliometric evidence that fewer than 30% of secondary analyses formally cite source data, the core empirical basis for our argument that citation-count KPIs systematically understate reuse.</w:t>
-            </w:r>
-          </w:p>
-          <w:p>
-            <w:pPr>
-              <w:numPr>
-                <w:ilvl w:val="0"/>
-                <w:numId w:val="1002"/>
-              </w:numPr>
-            </w:pPr>
-            <w:r>
-              <w:t xml:space="preserve">The GTEx Consortium. The Genotype-Tissue Expression (GTEx) project.</w:t>
-            </w:r>
-            <w:r>
-              <w:t xml:space="preserve"> </w:t>
-            </w:r>
-            <w:r>
-              <w:rPr>
-                <w:i/>
-                <w:iCs/>
-              </w:rPr>
-              <w:t xml:space="preserve">Nature Genetics</w:t>
-            </w:r>
-            <w:r>
-              <w:t xml:space="preserve">, 2013</w:t>
-            </w:r>
-            <w:r>
-              <w:t xml:space="preserve"> </w:t>
-            </w:r>
-            <w:r>
-              <w:t xml:space="preserve">[2]</w:t>
-            </w:r>
-            <w:r>
-              <w:t xml:space="preserve">. The paradigmatic example of a high-reuse public biomedical data resource (8,630 citations as of January 2026), used here to anchor the public-value framework with a concrete case.</w:t>
-            </w:r>
-          </w:p>
-          <w:p>
-            <w:pPr>
-              <w:numPr>
-                <w:ilvl w:val="0"/>
-                <w:numId w:val="1002"/>
-              </w:numPr>
-            </w:pPr>
-            <w:r>
-              <w:t xml:space="preserve">Centers for Disease Control and Prevention. Standard Evaluation Framework for Large Health Care Data</w:t>
-            </w:r>
-            <w:r>
-              <w:t xml:space="preserve"> </w:t>
-            </w:r>
-            <w:r>
-              <w:t xml:space="preserve">[16]</w:t>
-            </w:r>
-            <w:r>
-              <w:t xml:space="preserve">. The 49-attribute fitness-for-purpose framework whose representativeness and linkability attributes are particularly load-bearing for federated ecosystems like the CFDE.</w:t>
-            </w:r>
-          </w:p>
-          <w:p/>
-        </w:tc>
-      </w:tr>
-    </w:tbl>
-    <w:bookmarkEnd w:id="44"/>
-    <w:bookmarkStart w:id="94" w:name="references"/>
+    <w:bookmarkEnd w:id="38"/>
+    <w:bookmarkStart w:id="88" w:name="references"/>
     <w:p>
       <w:pPr>
         <w:pStyle w:val="Heading1"/>
@@ -8922,8 +8379,8 @@
         <w:t xml:space="preserve">References</w:t>
       </w:r>
     </w:p>
-    <w:bookmarkStart w:id="93" w:name="refs"/>
-    <w:bookmarkStart w:id="46" w:name="ref-pmid:24071849"/>
+    <w:bookmarkStart w:id="87" w:name="refs"/>
+    <w:bookmarkStart w:id="40" w:name="ref-pmid:24071849"/>
     <w:p>
       <w:pPr>
         <w:pStyle w:val="Bibliography"/>
@@ -8953,7 +8410,7 @@
       <w:r>
         <w:t xml:space="preserve"> </w:t>
       </w:r>
-      <w:hyperlink r:id="rId45">
+      <w:hyperlink r:id="rId39">
         <w:r>
           <w:rPr>
             <w:rStyle w:val="Hyperlink"/>
@@ -8978,8 +8435,8 @@
         <w:t xml:space="preserve">45, 1113–20</w:t>
       </w:r>
     </w:p>
-    <w:bookmarkEnd w:id="46"/>
-    <w:bookmarkStart w:id="48" w:name="ref-doi:10.1038/ng.2653"/>
+    <w:bookmarkEnd w:id="40"/>
+    <w:bookmarkStart w:id="42" w:name="ref-doi:10.1038/ng.2653"/>
     <w:p>
       <w:pPr>
         <w:pStyle w:val="Bibliography"/>
@@ -9015,7 +8472,7 @@
       <w:r>
         <w:t xml:space="preserve"> </w:t>
       </w:r>
-      <w:hyperlink r:id="rId47">
+      <w:hyperlink r:id="rId41">
         <w:r>
           <w:rPr>
             <w:rStyle w:val="Hyperlink"/>
@@ -9043,8 +8500,8 @@
         <w:t xml:space="preserve">45, 580–585</w:t>
       </w:r>
     </w:p>
-    <w:bookmarkEnd w:id="48"/>
-    <w:bookmarkStart w:id="50" w:name="ref-doi:10.1056/NEJMsr1809937"/>
+    <w:bookmarkEnd w:id="42"/>
+    <w:bookmarkStart w:id="44" w:name="ref-doi:10.1056/NEJMsr1809937"/>
     <w:p>
       <w:pPr>
         <w:pStyle w:val="Bibliography"/>
@@ -9064,7 +8521,7 @@
       <w:r>
         <w:t xml:space="preserve"> </w:t>
       </w:r>
-      <w:hyperlink r:id="rId49">
+      <w:hyperlink r:id="rId43">
         <w:r>
           <w:rPr>
             <w:rStyle w:val="Hyperlink"/>
@@ -9116,8 +8573,8 @@
         <w:t xml:space="preserve">381, 668–676</w:t>
       </w:r>
     </w:p>
-    <w:bookmarkEnd w:id="50"/>
-    <w:bookmarkStart w:id="52" w:name="ref-doi:10.1093/gigascience/giac105"/>
+    <w:bookmarkEnd w:id="44"/>
+    <w:bookmarkStart w:id="46" w:name="ref-doi:10.1093/gigascience/giac105"/>
     <w:p>
       <w:pPr>
         <w:pStyle w:val="Bibliography"/>
@@ -9153,7 +8610,7 @@
       <w:r>
         <w:t xml:space="preserve"> </w:t>
       </w:r>
-      <w:hyperlink r:id="rId51">
+      <w:hyperlink r:id="rId45">
         <w:r>
           <w:rPr>
             <w:rStyle w:val="Hyperlink"/>
@@ -9181,8 +8638,8 @@
         <w:t xml:space="preserve">11</w:t>
       </w:r>
     </w:p>
-    <w:bookmarkEnd w:id="52"/>
-    <w:bookmarkStart w:id="53" w:name="ref-isbn:9780471465102"/>
+    <w:bookmarkEnd w:id="46"/>
+    <w:bookmarkStart w:id="47" w:name="ref-isbn:9780471465102"/>
     <w:p>
       <w:pPr>
         <w:pStyle w:val="Bibliography"/>
@@ -9213,8 +8670,8 @@
         <w:t xml:space="preserve">, Wiley</w:t>
       </w:r>
     </w:p>
-    <w:bookmarkEnd w:id="53"/>
-    <w:bookmarkStart w:id="54" w:name="ref-isbn:9780792375067"/>
+    <w:bookmarkEnd w:id="47"/>
+    <w:bookmarkStart w:id="48" w:name="ref-isbn:9780792375067"/>
     <w:p>
       <w:pPr>
         <w:pStyle w:val="Bibliography"/>
@@ -9245,8 +8702,8 @@
         <w:t xml:space="preserve">, Kluwer Academic Publishers</w:t>
       </w:r>
     </w:p>
-    <w:bookmarkEnd w:id="54"/>
-    <w:bookmarkStart w:id="56" w:name="ref-doi:10.1038/sdata.2016.18"/>
+    <w:bookmarkEnd w:id="48"/>
+    <w:bookmarkStart w:id="50" w:name="ref-doi:10.1038/sdata.2016.18"/>
     <w:p>
       <w:pPr>
         <w:pStyle w:val="Bibliography"/>
@@ -9282,7 +8739,7 @@
       <w:r>
         <w:t xml:space="preserve"> </w:t>
       </w:r>
-      <w:hyperlink r:id="rId55">
+      <w:hyperlink r:id="rId49">
         <w:r>
           <w:rPr>
             <w:rStyle w:val="Hyperlink"/>
@@ -9310,8 +8767,8 @@
         <w:t xml:space="preserve">3</w:t>
       </w:r>
     </w:p>
-    <w:bookmarkEnd w:id="56"/>
-    <w:bookmarkStart w:id="58" w:name="ref-doi:10.1038/sdata.2018.118"/>
+    <w:bookmarkEnd w:id="50"/>
+    <w:bookmarkStart w:id="52" w:name="ref-doi:10.1038/sdata.2018.118"/>
     <w:p>
       <w:pPr>
         <w:pStyle w:val="Bibliography"/>
@@ -9347,7 +8804,7 @@
       <w:r>
         <w:t xml:space="preserve"> </w:t>
       </w:r>
-      <w:hyperlink r:id="rId57">
+      <w:hyperlink r:id="rId51">
         <w:r>
           <w:rPr>
             <w:rStyle w:val="Hyperlink"/>
@@ -9375,8 +8832,8 @@
         <w:t xml:space="preserve">5</w:t>
       </w:r>
     </w:p>
-    <w:bookmarkEnd w:id="58"/>
-    <w:bookmarkStart w:id="60" w:name="ref-doi:10.1371/journal.pone.0311493"/>
+    <w:bookmarkEnd w:id="52"/>
+    <w:bookmarkStart w:id="54" w:name="ref-doi:10.1371/journal.pone.0311493"/>
     <w:p>
       <w:pPr>
         <w:pStyle w:val="Bibliography"/>
@@ -9412,7 +8869,7 @@
       <w:r>
         <w:t xml:space="preserve"> </w:t>
       </w:r>
-      <w:hyperlink r:id="rId59">
+      <w:hyperlink r:id="rId53">
         <w:r>
           <w:rPr>
             <w:rStyle w:val="Hyperlink"/>
@@ -9440,8 +8897,8 @@
         <w:t xml:space="preserve">19, e0311493</w:t>
       </w:r>
     </w:p>
-    <w:bookmarkEnd w:id="60"/>
-    <w:bookmarkStart w:id="62" w:name="ref-doi:10.1038/520429a"/>
+    <w:bookmarkEnd w:id="54"/>
+    <w:bookmarkStart w:id="56" w:name="ref-doi:10.1038/520429a"/>
     <w:p>
       <w:pPr>
         <w:pStyle w:val="Bibliography"/>
@@ -9477,7 +8934,7 @@
       <w:r>
         <w:t xml:space="preserve"> </w:t>
       </w:r>
-      <w:hyperlink r:id="rId61">
+      <w:hyperlink r:id="rId55">
         <w:r>
           <w:rPr>
             <w:rStyle w:val="Hyperlink"/>
@@ -9505,8 +8962,8 @@
         <w:t xml:space="preserve">520, 429–431</w:t>
       </w:r>
     </w:p>
-    <w:bookmarkEnd w:id="62"/>
-    <w:bookmarkStart w:id="64" w:name="ref-doi:10.4103/1008-682X.171582"/>
+    <w:bookmarkEnd w:id="56"/>
+    <w:bookmarkStart w:id="58" w:name="ref-doi:10.4103/1008-682X.171582"/>
     <w:p>
       <w:pPr>
         <w:pStyle w:val="Bibliography"/>
@@ -9542,7 +8999,7 @@
       <w:r>
         <w:t xml:space="preserve"> </w:t>
       </w:r>
-      <w:hyperlink r:id="rId63">
+      <w:hyperlink r:id="rId57">
         <w:r>
           <w:rPr>
             <w:rStyle w:val="Hyperlink"/>
@@ -9570,8 +9027,8 @@
         <w:t xml:space="preserve">18, 296</w:t>
       </w:r>
     </w:p>
-    <w:bookmarkEnd w:id="64"/>
-    <w:bookmarkStart w:id="66" w:name="ref-doi:10.1101/2023.09.12.557386"/>
+    <w:bookmarkEnd w:id="58"/>
+    <w:bookmarkStart w:id="60" w:name="ref-doi:10.1101/2023.09.12.557386"/>
     <w:p>
       <w:pPr>
         <w:pStyle w:val="Bibliography"/>
@@ -9607,7 +9064,7 @@
       <w:r>
         <w:t xml:space="preserve"> </w:t>
       </w:r>
-      <w:hyperlink r:id="rId65">
+      <w:hyperlink r:id="rId59">
         <w:r>
           <w:rPr>
             <w:rStyle w:val="Hyperlink"/>
@@ -9619,8 +9076,8 @@
         <w:t xml:space="preserve">openRxiv</w:t>
       </w:r>
     </w:p>
-    <w:bookmarkEnd w:id="66"/>
-    <w:bookmarkStart w:id="68" w:name="ref-doi:10.2196/63544"/>
+    <w:bookmarkEnd w:id="60"/>
+    <w:bookmarkStart w:id="62" w:name="ref-doi:10.2196/63544"/>
     <w:p>
       <w:pPr>
         <w:pStyle w:val="Bibliography"/>
@@ -9640,7 +9097,7 @@
       <w:r>
         <w:t xml:space="preserve"> </w:t>
       </w:r>
-      <w:hyperlink r:id="rId67">
+      <w:hyperlink r:id="rId61">
         <w:r>
           <w:rPr>
             <w:rStyle w:val="Hyperlink"/>
@@ -9668,8 +9125,8 @@
         <w:t xml:space="preserve">13, e63544–e63544</w:t>
       </w:r>
     </w:p>
-    <w:bookmarkEnd w:id="68"/>
-    <w:bookmarkStart w:id="70" w:name="ref-doi:10.15265/IY-2014-0020"/>
+    <w:bookmarkEnd w:id="62"/>
+    <w:bookmarkStart w:id="64" w:name="ref-doi:10.15265/IY-2014-0020"/>
     <w:p>
       <w:pPr>
         <w:pStyle w:val="Bibliography"/>
@@ -9689,7 +9146,7 @@
       <w:r>
         <w:t xml:space="preserve"> </w:t>
       </w:r>
-      <w:hyperlink r:id="rId69">
+      <w:hyperlink r:id="rId63">
         <w:r>
           <w:rPr>
             <w:rStyle w:val="Hyperlink"/>
@@ -9717,8 +9174,8 @@
         <w:t xml:space="preserve">23, 14–20</w:t>
       </w:r>
     </w:p>
-    <w:bookmarkEnd w:id="70"/>
-    <w:bookmarkStart w:id="72" w:name="ref-doi:10.1371/journal.pone.0229003"/>
+    <w:bookmarkEnd w:id="64"/>
+    <w:bookmarkStart w:id="66" w:name="ref-doi:10.1371/journal.pone.0229003"/>
     <w:p>
       <w:pPr>
         <w:pStyle w:val="Bibliography"/>
@@ -9754,7 +9211,7 @@
       <w:r>
         <w:t xml:space="preserve"> </w:t>
       </w:r>
-      <w:hyperlink r:id="rId71">
+      <w:hyperlink r:id="rId65">
         <w:r>
           <w:rPr>
             <w:rStyle w:val="Hyperlink"/>
@@ -9782,8 +9239,8 @@
         <w:t xml:space="preserve">15, e0229003</w:t>
       </w:r>
     </w:p>
-    <w:bookmarkEnd w:id="72"/>
-    <w:bookmarkStart w:id="74" w:name="ref-doi:10.15585/mmwr.su7303a1"/>
+    <w:bookmarkEnd w:id="66"/>
+    <w:bookmarkStart w:id="68" w:name="ref-doi:10.15585/mmwr.su7303a1"/>
     <w:p>
       <w:pPr>
         <w:pStyle w:val="Bibliography"/>
@@ -9819,7 +9276,7 @@
       <w:r>
         <w:t xml:space="preserve"> </w:t>
       </w:r>
-      <w:hyperlink r:id="rId73">
+      <w:hyperlink r:id="rId67">
         <w:r>
           <w:rPr>
             <w:rStyle w:val="Hyperlink"/>
@@ -9847,8 +9304,8 @@
         <w:t xml:space="preserve">73, 1–13</w:t>
       </w:r>
     </w:p>
-    <w:bookmarkEnd w:id="74"/>
-    <w:bookmarkStart w:id="76" w:name="ref-doi:10.1038/nbt.3780"/>
+    <w:bookmarkEnd w:id="68"/>
+    <w:bookmarkStart w:id="70" w:name="ref-doi:10.1038/nbt.3780"/>
     <w:p>
       <w:pPr>
         <w:pStyle w:val="Bibliography"/>
@@ -9868,7 +9325,7 @@
       <w:r>
         <w:t xml:space="preserve"> </w:t>
       </w:r>
-      <w:hyperlink r:id="rId75">
+      <w:hyperlink r:id="rId69">
         <w:r>
           <w:rPr>
             <w:rStyle w:val="Hyperlink"/>
@@ -9896,8 +9353,8 @@
         <w:t xml:space="preserve">35, 342–346</w:t>
       </w:r>
     </w:p>
-    <w:bookmarkEnd w:id="76"/>
-    <w:bookmarkStart w:id="78" w:name="ref-doi:10.1186/gb-2004-5-10-r80"/>
+    <w:bookmarkEnd w:id="70"/>
+    <w:bookmarkStart w:id="72" w:name="ref-doi:10.1186/gb-2004-5-10-r80"/>
     <w:p>
       <w:pPr>
         <w:pStyle w:val="Bibliography"/>
@@ -9933,7 +9390,7 @@
       <w:r>
         <w:t xml:space="preserve"> </w:t>
       </w:r>
-      <w:hyperlink r:id="rId77">
+      <w:hyperlink r:id="rId71">
         <w:r>
           <w:rPr>
             <w:rStyle w:val="Hyperlink"/>
@@ -9961,8 +9418,8 @@
         <w:t xml:space="preserve">5</w:t>
       </w:r>
     </w:p>
-    <w:bookmarkEnd w:id="78"/>
-    <w:bookmarkStart w:id="80" w:name="ref-doi:10.12688/f1000research.9206.1"/>
+    <w:bookmarkEnd w:id="72"/>
+    <w:bookmarkStart w:id="74" w:name="ref-doi:10.12688/f1000research.9206.1"/>
     <w:p>
       <w:pPr>
         <w:pStyle w:val="Bibliography"/>
@@ -9998,7 +9455,7 @@
       <w:r>
         <w:t xml:space="preserve"> </w:t>
       </w:r>
-      <w:hyperlink r:id="rId79">
+      <w:hyperlink r:id="rId73">
         <w:r>
           <w:rPr>
             <w:rStyle w:val="Hyperlink"/>
@@ -10026,8 +9483,8 @@
         <w:t xml:space="preserve">5, 2000</w:t>
       </w:r>
     </w:p>
-    <w:bookmarkEnd w:id="80"/>
-    <w:bookmarkStart w:id="82" w:name="ref-doi:10.1093/jamia/ocab278"/>
+    <w:bookmarkEnd w:id="74"/>
+    <w:bookmarkStart w:id="76" w:name="ref-doi:10.1093/jamia/ocab278"/>
     <w:p>
       <w:pPr>
         <w:pStyle w:val="Bibliography"/>
@@ -10063,7 +9520,7 @@
       <w:r>
         <w:t xml:space="preserve"> </w:t>
       </w:r>
-      <w:hyperlink r:id="rId81">
+      <w:hyperlink r:id="rId75">
         <w:r>
           <w:rPr>
             <w:rStyle w:val="Hyperlink"/>
@@ -10091,8 +9548,8 @@
         <w:t xml:space="preserve">29, 592–600</w:t>
       </w:r>
     </w:p>
-    <w:bookmarkEnd w:id="82"/>
-    <w:bookmarkStart w:id="84" w:name="ref-doi:10.48550/arXiv.2509.12709"/>
+    <w:bookmarkEnd w:id="76"/>
+    <w:bookmarkStart w:id="78" w:name="ref-doi:10.48550/arXiv.2509.12709"/>
     <w:p>
       <w:pPr>
         <w:pStyle w:val="Bibliography"/>
@@ -10128,7 +9585,7 @@
       <w:r>
         <w:t xml:space="preserve"> </w:t>
       </w:r>
-      <w:hyperlink r:id="rId83">
+      <w:hyperlink r:id="rId77">
         <w:r>
           <w:rPr>
             <w:rStyle w:val="Hyperlink"/>
@@ -10140,8 +9597,8 @@
         <w:t xml:space="preserve">arXiv</w:t>
       </w:r>
     </w:p>
-    <w:bookmarkEnd w:id="84"/>
-    <w:bookmarkStart w:id="86" w:name="ref-doi:10.1007/s10488-013-0528-y"/>
+    <w:bookmarkEnd w:id="78"/>
+    <w:bookmarkStart w:id="80" w:name="ref-doi:10.1007/s10488-013-0528-y"/>
     <w:p>
       <w:pPr>
         <w:pStyle w:val="Bibliography"/>
@@ -10177,7 +9634,7 @@
       <w:r>
         <w:t xml:space="preserve"> </w:t>
       </w:r>
-      <w:hyperlink r:id="rId85">
+      <w:hyperlink r:id="rId79">
         <w:r>
           <w:rPr>
             <w:rStyle w:val="Hyperlink"/>
@@ -10205,8 +9662,8 @@
         <w:t xml:space="preserve">42, 533–544</w:t>
       </w:r>
     </w:p>
-    <w:bookmarkEnd w:id="86"/>
-    <w:bookmarkStart w:id="88" w:name="ref-doi:10.1002/jgf2.736"/>
+    <w:bookmarkEnd w:id="80"/>
+    <w:bookmarkStart w:id="82" w:name="ref-doi:10.1002/jgf2.736"/>
     <w:p>
       <w:pPr>
         <w:pStyle w:val="Bibliography"/>
@@ -10226,7 +9683,7 @@
       <w:r>
         <w:t xml:space="preserve"> </w:t>
       </w:r>
-      <w:hyperlink r:id="rId87">
+      <w:hyperlink r:id="rId81">
         <w:r>
           <w:rPr>
             <w:rStyle w:val="Hyperlink"/>
@@ -10254,8 +9711,8 @@
         <w:t xml:space="preserve">26, 4–11</w:t>
       </w:r>
     </w:p>
-    <w:bookmarkEnd w:id="88"/>
-    <w:bookmarkStart w:id="90" w:name="ref-pmid:30861395"/>
+    <w:bookmarkEnd w:id="82"/>
+    <w:bookmarkStart w:id="84" w:name="ref-pmid:30861395"/>
     <w:p>
       <w:pPr>
         <w:pStyle w:val="Bibliography"/>
@@ -10291,7 +9748,7 @@
       <w:r>
         <w:t xml:space="preserve"> </w:t>
       </w:r>
-      <w:hyperlink r:id="rId89">
+      <w:hyperlink r:id="rId83">
         <w:r>
           <w:rPr>
             <w:rStyle w:val="Hyperlink"/>
@@ -10316,8 +9773,8 @@
         <w:t xml:space="preserve">74, 69–75</w:t>
       </w:r>
     </w:p>
-    <w:bookmarkEnd w:id="90"/>
-    <w:bookmarkStart w:id="92" w:name="ref-doi:10.1016/j.socscimed.2017.03.041"/>
+    <w:bookmarkEnd w:id="84"/>
+    <w:bookmarkStart w:id="86" w:name="ref-doi:10.1016/j.socscimed.2017.03.041"/>
     <w:p>
       <w:pPr>
         <w:pStyle w:val="Bibliography"/>
@@ -10337,7 +9794,7 @@
       <w:r>
         <w:t xml:space="preserve"> </w:t>
       </w:r>
-      <w:hyperlink r:id="rId91">
+      <w:hyperlink r:id="rId85">
         <w:r>
           <w:rPr>
             <w:rStyle w:val="Hyperlink"/>
@@ -10365,9 +9822,9 @@
         <w:t xml:space="preserve">181, 54–65</w:t>
       </w:r>
     </w:p>
-    <w:bookmarkEnd w:id="92"/>
-    <w:bookmarkEnd w:id="93"/>
-    <w:bookmarkEnd w:id="94"/>
+    <w:bookmarkEnd w:id="86"/>
+    <w:bookmarkEnd w:id="87"/>
+    <w:bookmarkEnd w:id="88"/>
     <w:sectPr>
       <w:footnotePr>
         <w:numRestart w:val="eachSect"/>
@@ -10478,229 +9935,8 @@
       </w:pPr>
     </w:lvl>
   </w:abstractNum>
-  <w:abstractNum w:abstractNumId="991">
-    <w:nsid w:val="0000A991"/>
-    <w:multiLevelType w:val="multilevel"/>
-    <w:lvl w:ilvl="0">
-      <w:numFmt w:val="bullet"/>
-      <w:lvlText w:val=""/>
-      <w:lvlJc w:val="left"/>
-      <w:pPr>
-        <w:ind w:left="720" w:hanging="360"/>
-      </w:pPr>
-      <w:rPr>
-        <w:rFonts w:ascii="Symbol" w:hAnsi="Symbol" w:cs="Symbol" w:hint="default"/>
-      </w:rPr>
-    </w:lvl>
-    <w:lvl w:ilvl="1">
-      <w:numFmt w:val="bullet"/>
-      <w:lvlText w:val="o"/>
-      <w:lvlJc w:val="left"/>
-      <w:pPr>
-        <w:ind w:left="1440" w:hanging="360"/>
-      </w:pPr>
-      <w:rPr>
-        <w:rFonts w:ascii="Courier New" w:hAnsi="Courier New" w:cs="Courier New" w:hint="default"/>
-      </w:rPr>
-    </w:lvl>
-    <w:lvl w:ilvl="2">
-      <w:numFmt w:val="bullet"/>
-      <w:lvlText w:val=""/>
-      <w:lvlJc w:val="left"/>
-      <w:pPr>
-        <w:ind w:left="2160" w:hanging="360"/>
-      </w:pPr>
-      <w:rPr>
-        <w:rFonts w:ascii="Wingdings" w:hAnsi="Wingdings" w:cs="Wingdings" w:hint="default"/>
-      </w:rPr>
-    </w:lvl>
-    <w:lvl w:ilvl="3">
-      <w:numFmt w:val="bullet"/>
-      <w:lvlText w:val=""/>
-      <w:lvlJc w:val="left"/>
-      <w:pPr>
-        <w:ind w:left="2880" w:hanging="360"/>
-      </w:pPr>
-      <w:rPr>
-        <w:rFonts w:ascii="Symbol" w:hAnsi="Symbol" w:cs="Symbol" w:hint="default"/>
-      </w:rPr>
-    </w:lvl>
-    <w:lvl w:ilvl="4">
-      <w:numFmt w:val="bullet"/>
-      <w:lvlText w:val="o"/>
-      <w:lvlJc w:val="left"/>
-      <w:pPr>
-        <w:ind w:left="3600" w:hanging="360"/>
-      </w:pPr>
-      <w:rPr>
-        <w:rFonts w:ascii="Courier New" w:hAnsi="Courier New" w:cs="Courier New" w:hint="default"/>
-      </w:rPr>
-    </w:lvl>
-    <w:lvl w:ilvl="5">
-      <w:numFmt w:val="bullet"/>
-      <w:lvlText w:val=""/>
-      <w:lvlJc w:val="left"/>
-      <w:pPr>
-        <w:ind w:left="4320" w:hanging="360"/>
-      </w:pPr>
-      <w:rPr>
-        <w:rFonts w:ascii="Wingdings" w:hAnsi="Wingdings" w:cs="Wingdings" w:hint="default"/>
-      </w:rPr>
-    </w:lvl>
-    <w:lvl w:ilvl="6">
-      <w:numFmt w:val="bullet"/>
-      <w:lvlText w:val=""/>
-      <w:lvlJc w:val="left"/>
-      <w:pPr>
-        <w:ind w:left="5040" w:hanging="360"/>
-      </w:pPr>
-      <w:rPr>
-        <w:rFonts w:ascii="Symbol" w:hAnsi="Symbol" w:cs="Symbol" w:hint="default"/>
-      </w:rPr>
-    </w:lvl>
-    <w:lvl w:ilvl="7">
-      <w:numFmt w:val="bullet"/>
-      <w:lvlText w:val="o"/>
-      <w:lvlJc w:val="left"/>
-      <w:pPr>
-        <w:ind w:left="5760" w:hanging="360"/>
-      </w:pPr>
-      <w:rPr>
-        <w:rFonts w:ascii="Courier New" w:hAnsi="Courier New" w:cs="Courier New" w:hint="default"/>
-      </w:rPr>
-    </w:lvl>
-    <w:lvl w:ilvl="8">
-      <w:numFmt w:val="bullet"/>
-      <w:lvlText w:val=""/>
-      <w:lvlJc w:val="left"/>
-      <w:pPr>
-        <w:ind w:left="6480" w:hanging="360"/>
-      </w:pPr>
-      <w:rPr>
-        <w:rFonts w:ascii="Wingdings" w:hAnsi="Wingdings" w:cs="Wingdings" w:hint="default"/>
-      </w:rPr>
-    </w:lvl>
-  </w:abstractNum>
-  <w:abstractNum w:abstractNumId="99411">
-    <w:nsid w:val="00A99411"/>
-    <w:multiLevelType w:val="multilevel"/>
-    <w:lvl w:ilvl="0">
-      <w:start w:val="1"/>
-      <w:numFmt w:val="decimal"/>
-      <w:lvlText w:val="%1."/>
-      <w:lvlJc w:val="left"/>
-      <w:pPr>
-        <w:ind w:left="720" w:hanging="360"/>
-      </w:pPr>
-    </w:lvl>
-    <w:lvl w:ilvl="1">
-      <w:start w:val="1"/>
-      <w:numFmt w:val="decimal"/>
-      <w:lvlText w:val="%2."/>
-      <w:lvlJc w:val="left"/>
-      <w:pPr>
-        <w:ind w:left="1440" w:hanging="360"/>
-      </w:pPr>
-    </w:lvl>
-    <w:lvl w:ilvl="2">
-      <w:start w:val="1"/>
-      <w:numFmt w:val="decimal"/>
-      <w:lvlText w:val="%3."/>
-      <w:lvlJc w:val="left"/>
-      <w:pPr>
-        <w:ind w:left="2160" w:hanging="360"/>
-      </w:pPr>
-    </w:lvl>
-    <w:lvl w:ilvl="3">
-      <w:start w:val="1"/>
-      <w:numFmt w:val="decimal"/>
-      <w:lvlText w:val="%4."/>
-      <w:lvlJc w:val="left"/>
-      <w:pPr>
-        <w:ind w:left="2880" w:hanging="360"/>
-      </w:pPr>
-    </w:lvl>
-    <w:lvl w:ilvl="4">
-      <w:start w:val="1"/>
-      <w:numFmt w:val="decimal"/>
-      <w:lvlText w:val="%5."/>
-      <w:lvlJc w:val="left"/>
-      <w:pPr>
-        <w:ind w:left="3600" w:hanging="360"/>
-      </w:pPr>
-    </w:lvl>
-    <w:lvl w:ilvl="5">
-      <w:start w:val="1"/>
-      <w:numFmt w:val="decimal"/>
-      <w:lvlText w:val="%6."/>
-      <w:lvlJc w:val="left"/>
-      <w:pPr>
-        <w:ind w:left="4320" w:hanging="360"/>
-      </w:pPr>
-    </w:lvl>
-    <w:lvl w:ilvl="6">
-      <w:start w:val="1"/>
-      <w:numFmt w:val="decimal"/>
-      <w:lvlText w:val="%7."/>
-      <w:lvlJc w:val="left"/>
-      <w:pPr>
-        <w:ind w:left="5040" w:hanging="360"/>
-      </w:pPr>
-    </w:lvl>
-    <w:lvl w:ilvl="7">
-      <w:start w:val="1"/>
-      <w:numFmt w:val="decimal"/>
-      <w:lvlText w:val="%8."/>
-      <w:lvlJc w:val="left"/>
-      <w:pPr>
-        <w:ind w:left="5760" w:hanging="360"/>
-      </w:pPr>
-    </w:lvl>
-    <w:lvl w:ilvl="8">
-      <w:start w:val="1"/>
-      <w:numFmt w:val="decimal"/>
-      <w:lvlText w:val="%9."/>
-      <w:lvlJc w:val="left"/>
-      <w:pPr>
-        <w:ind w:left="6480" w:hanging="360"/>
-      </w:pPr>
-    </w:lvl>
-  </w:abstractNum>
   <w:num w:numId="1000">
     <w:abstractNumId w:val="990"/>
-  </w:num>
-  <w:num w:numId="1001">
-    <w:abstractNumId w:val="991"/>
-  </w:num>
-  <w:num w:numId="1002">
-    <w:abstractNumId w:val="99411"/>
-    <w:lvlOverride w:ilvl="0">
-      <w:startOverride w:val="1"/>
-    </w:lvlOverride>
-    <w:lvlOverride w:ilvl="1">
-      <w:startOverride w:val="1"/>
-    </w:lvlOverride>
-    <w:lvlOverride w:ilvl="2">
-      <w:startOverride w:val="1"/>
-    </w:lvlOverride>
-    <w:lvlOverride w:ilvl="3">
-      <w:startOverride w:val="1"/>
-    </w:lvlOverride>
-    <w:lvlOverride w:ilvl="4">
-      <w:startOverride w:val="1"/>
-    </w:lvlOverride>
-    <w:lvlOverride w:ilvl="5">
-      <w:startOverride w:val="1"/>
-    </w:lvlOverride>
-    <w:lvlOverride w:ilvl="6">
-      <w:startOverride w:val="1"/>
-    </w:lvlOverride>
-    <w:lvlOverride w:ilvl="7">
-      <w:startOverride w:val="1"/>
-    </w:lvlOverride>
-    <w:lvlOverride w:ilvl="8">
-      <w:startOverride w:val="1"/>
-    </w:lvlOverride>
   </w:num>
 </w:numbering>
 </file>

</xml_diff>

<commit_message>
Render push e2987bd7d0372c7e6c2a6c6ee70fb89604b58a5b Merge pull request #36 from seandavi/drop-faisal-close-orcid-formatting
Drop Faisal Alquaddoomi from author list (#23, partial) e2987bd7d0372c7e6c2a6c6ee70fb89604b58a5b
</commit_message>
<xml_diff>
--- a/manuscript.docx
+++ b/manuscript.docx
@@ -24,14 +24,6 @@
       </w:pPr>
       <w:r>
         <w:t xml:space="preserve">Vikram Adithya Ganesh</w:t>
-      </w:r>
-    </w:p>
-    <w:p>
-      <w:pPr>
-        <w:pStyle w:val="Author"/>
-      </w:pPr>
-      <w:r>
-        <w:t xml:space="preserve">Faisal Alquaddoomi</w:t>
       </w:r>
     </w:p>
     <w:p>
@@ -7964,7 +7956,7 @@
         <w:t xml:space="preserve"> </w:t>
       </w:r>
       <w:r>
-        <w:t xml:space="preserve">Ethan M. Lange, Vikram Adithya Ganesh, Faisal Alquaddoomi, David Mayer, Adriana Ivich, Vince Rubinetti, Casey Greene, and Sean Davis each made substantial contributions to the conception or design of the work and to the acquisition, analysis, or interpretation of data; participated in drafting the manuscript or revising it critically for important intellectual content; approved the final version for publication; and agreed to be accountable for all aspects of the work.</w:t>
+        <w:t xml:space="preserve">Ethan M. Lange, Vikram Adithya Ganesh, David Mayer, Adriana Ivich, Vince Rubinetti, Casey Greene, and Sean Davis each made substantial contributions to the conception or design of the work and to the acquisition, analysis, or interpretation of data; participated in drafting the manuscript or revising it critically for important intellectual content; approved the final version for publication; and agreed to be accountable for all aspects of the work.</w:t>
       </w:r>
     </w:p>
     <w:bookmarkEnd w:id="34"/>

</xml_diff>

<commit_message>
Render push 74fd7ed07a3296570be8f481a7c48b182966c429 Merge pull request #37 from seandavi/issue-9-sharpen-opinion
Sharpen the opinion — five claims promoted from descriptive to positional (#9) 74fd7ed07a3296570be8f481a7c48b182966c429
</commit_message>
<xml_diff>
--- a/manuscript.docx
+++ b/manuscript.docx
@@ -575,7 +575,7 @@
         <w:t xml:space="preserve"> </w:t>
       </w:r>
       <w:r>
-        <w:t xml:space="preserve">Embedding this lifecycle logic into evaluation design, rather than applying uniform metrics across all phases, is the key practical contribution we describe.</w:t>
+        <w:t xml:space="preserve">Uniform metric panels across phases misallocate funding in predictable ways; lifecycle-aware weighting is the operating principle that fixes this, not a refinement on top.</w:t>
       </w:r>
     </w:p>
     <w:tbl>
@@ -1014,7 +1014,7 @@
         <w:t xml:space="preserve"> </w:t>
       </w:r>
       <w:r>
-        <w:t xml:space="preserve">Standard bibliometrics therefore systematically understate reuse.</w:t>
+        <w:t xml:space="preserve">Standard bibliometrics therefore systematically understate reuse, and programs that lean on citation counts as their primary impact key performance indicator (KPI) are measuring reach rather than influence.</w:t>
       </w:r>
       <w:r>
         <w:t xml:space="preserve"> </w:t>
@@ -1184,6 +1184,12 @@
       </w:r>
       <w:r>
         <w:t xml:space="preserve">Concrete indicators include the cloud-versus-local analysis ratio, cross-disciplinary co-authorship across Common Fund programs, and the geographic and institutional breadth of the user base, especially participation by early-career investigators from under-resourced institutions.</w:t>
+      </w:r>
+      <w:r>
+        <w:t xml:space="preserve"> </w:t>
+      </w:r>
+      <w:r>
+        <w:t xml:space="preserve">Until practice change is measurable, every other public-value metric is at best a leading indicator.</w:t>
       </w:r>
     </w:p>
     <w:bookmarkEnd w:id="14"/>
@@ -1553,6 +1559,12 @@
       </w:r>
       <w:r>
         <w:t xml:space="preserve">.</w:t>
+      </w:r>
+      <w:r>
+        <w:t xml:space="preserve"> </w:t>
+      </w:r>
+      <w:r>
+        <w:t xml:space="preserve">Manual FAIR audits do not scale to CFDE-sized portfolios; automated second-generation indicators are the difference between a stated FAIR commitment and an inspectable one.</w:t>
       </w:r>
     </w:p>
     <w:bookmarkEnd w:id="15"/>
@@ -7659,6 +7671,12 @@
       </w:r>
       <w:r>
         <w:t xml:space="preserve">, and the 2023 Data Management and Sharing Policy creates a structural opportunity to establish pre-policy baselines for sharing and reuse — a rare chance to test rigorously whether mandates translate into measurable ecosystem improvements.</w:t>
+      </w:r>
+      <w:r>
+        <w:t xml:space="preserve"> </w:t>
+      </w:r>
+      <w:r>
+        <w:t xml:space="preserve">This window will not last; without pre-policy baselines captured now, the policy’s effect on sharing and reuse can be inferred but not measured.</w:t>
       </w:r>
     </w:p>
     <w:p>

</xml_diff>

<commit_message>
Render push 50c24070edda2550eaa45837db6ca1a57a2e41ff Merge pull request #38 from seandavi/issue-12-humanizer-pass
Humanizer pass on main text (#12) 50c24070edda2550eaa45837db6ca1a57a2e41ff
</commit_message>
<xml_diff>
--- a/manuscript.docx
+++ b/manuscript.docx
@@ -1020,7 +1020,7 @@
         <w:t xml:space="preserve"> </w:t>
       </w:r>
       <w:r>
-        <w:t xml:space="preserve">Closing the gap likely requires data ecosystems to mine accession numbers (e.g., GEO accession numbers, NCBI BioProject IDs) from publication full text rather than rely on citation databases.</w:t>
+        <w:t xml:space="preserve">Closing the gap requires data ecosystems to mine accession numbers (e.g., GEO accession numbers, NCBI BioProject IDs) from publication full text rather than rely on citation databases.</w:t>
       </w:r>
       <w:r>
         <w:t xml:space="preserve"> </w:t>
@@ -1604,10 +1604,7 @@
         <w:t xml:space="preserve"> </w:t>
       </w:r>
       <w:r>
-        <w:t xml:space="preserve">Server-level metrics —</w:t>
-      </w:r>
-      <w:r>
-        <w:t xml:space="preserve"> </w:t>
+        <w:t xml:space="preserve">Server-level metrics (</w:t>
       </w:r>
       <w:r>
         <w:rPr>
@@ -1669,13 +1666,7 @@
         <w:t xml:space="preserve">client errors</w:t>
       </w:r>
       <w:r>
-        <w:t xml:space="preserve"> </w:t>
-      </w:r>
-      <w:r>
-        <w:t xml:space="preserve">— and compute-level metrics —</w:t>
-      </w:r>
-      <w:r>
-        <w:t xml:space="preserve"> </w:t>
+        <w:t xml:space="preserve">) and compute-level metrics (</w:t>
       </w:r>
       <w:r>
         <w:rPr>
@@ -1737,10 +1728,7 @@
         <w:t xml:space="preserve">job run times</w:t>
       </w:r>
       <w:r>
-        <w:t xml:space="preserve"> </w:t>
-      </w:r>
-      <w:r>
-        <w:t xml:space="preserve">— are easy to capture but carry day-to-day variability from load, job size, and client-side network conditions, so trend monitoring is more informative than point-in-time values.</w:t>
+        <w:t xml:space="preserve">) are easy to capture but carry day-to-day variability from load, job size, and client-side network conditions, so trend monitoring is more informative than point-in-time values.</w:t>
       </w:r>
       <w:r>
         <w:t xml:space="preserve"> </w:t>
@@ -1955,7 +1943,19 @@
         <w:pStyle w:val="BodyText"/>
       </w:pPr>
       <w:r>
-        <w:t xml:space="preserve">The harder sustainability question is the break-even point for data sharing: mathematical models suggest aggregate research-community gains from reuse do not always outweigh the curation costs borne by data generators, which argues for selective investment in high-value datasets rather than uniform support.</w:t>
+        <w:t xml:space="preserve">The harder sustainability question is the break-even point for data sharing.</w:t>
+      </w:r>
+      <w:r>
+        <w:t xml:space="preserve"> </w:t>
+      </w:r>
+      <w:r>
+        <w:t xml:space="preserve">Curation costs are borne by data generators while reuse benefits accrue elsewhere — an asymmetry that means aggregate gains can fail to cover aggregate costs even when both are positive.</w:t>
+      </w:r>
+      <w:r>
+        <w:t xml:space="preserve"> </w:t>
+      </w:r>
+      <w:r>
+        <w:t xml:space="preserve">This argues for selective investment in high-value datasets rather than uniform support across the portfolio.</w:t>
       </w:r>
       <w:r>
         <w:t xml:space="preserve"> </w:t>
@@ -7393,7 +7393,13 @@
         <w:t xml:space="preserve"> </w:t>
       </w:r>
       <w:r>
-        <w:t xml:space="preserve">What the implementation demonstrates is not that the metric set is final — it is that lifecycle-aware portfolio evaluation is operationally tractable at NIH scale, in near real time, with the burden on individual projects manageable.</w:t>
+        <w:t xml:space="preserve">The implementation demonstrates that lifecycle-aware portfolio evaluation is operationally tractable at NIH scale, in near real time, with manageable burden on individual projects.</w:t>
+      </w:r>
+      <w:r>
+        <w:t xml:space="preserve"> </w:t>
+      </w:r>
+      <w:r>
+        <w:t xml:space="preserve">The metric set itself is not final, and the working-group structure described below is the mechanism by which it continues to evolve.</w:t>
       </w:r>
     </w:p>
     <w:bookmarkEnd w:id="23"/>

</xml_diff>

<commit_message>
Render push 21eb98aabd3f3d11d84e68ae3a23d77907aa2dad Merge pull request #40 from seandavi/issue-24-author-contributions
Rewrite Author Contributions in Trends format (#24) 21eb98aabd3f3d11d84e68ae3a23d77907aa2dad
</commit_message>
<xml_diff>
--- a/manuscript.docx
+++ b/manuscript.docx
@@ -71,7 +71,7 @@
         <w:pStyle w:val="Date"/>
       </w:pPr>
       <w:r>
-        <w:t xml:space="preserve">2026-05-16</w:t>
+        <w:t xml:space="preserve">2026-05-17</w:t>
       </w:r>
     </w:p>
     <w:p>
@@ -7974,13 +7974,25 @@
         <w:pStyle w:val="FirstParagraph"/>
       </w:pPr>
       <w:r>
-        <w:t xml:space="preserve">All authors meet the International Committee of Medical Journal Editors (ICMJE) criteria for authorship.</w:t>
-      </w:r>
-      <w:r>
-        <w:t xml:space="preserve"> </w:t>
-      </w:r>
-      <w:r>
-        <w:t xml:space="preserve">Ethan M. Lange, Vikram Adithya Ganesh, David Mayer, Adriana Ivich, Vince Rubinetti, Casey Greene, and Sean Davis each made substantial contributions to the conception or design of the work and to the acquisition, analysis, or interpretation of data; participated in drafting the manuscript or revising it critically for important intellectual content; approved the final version for publication; and agreed to be accountable for all aspects of the work.</w:t>
+        <w:t xml:space="preserve">S.D., E.L., and V.G. jointly developed the conceptualization for this Opinion and wrote the original draft of the manuscript.</w:t>
+      </w:r>
+      <w:r>
+        <w:t xml:space="preserve"> </w:t>
+      </w:r>
+      <w:r>
+        <w:t xml:space="preserve">D.M. also contributed to the conceptualization.</w:t>
+      </w:r>
+      <w:r>
+        <w:t xml:space="preserve"> </w:t>
+      </w:r>
+      <w:r>
+        <w:t xml:space="preserve">All authors contributed to the critical review and editing of the final version.</w:t>
+      </w:r>
+      <w:r>
+        <w:t xml:space="preserve"> </w:t>
+      </w:r>
+      <w:r>
+        <w:t xml:space="preserve">All authors have read and approved the final manuscript.</w:t>
       </w:r>
     </w:p>
     <w:bookmarkEnd w:id="34"/>

</xml_diff>

<commit_message>
Render push 0d33693b7455276d31dcfcf02f9ae0fb063905ea Merge pull request #41 from seandavi/fix-doubled-xref-prefixes
Fix doubled Figure/Table prefixes in cross-references 0d33693b7455276d31dcfcf02f9ae0fb063905ea
</commit_message>
<xml_diff>
--- a/manuscript.docx
+++ b/manuscript.docx
@@ -1978,12 +1978,6 @@
       <w:pPr>
         <w:pStyle w:val="BodyText"/>
       </w:pPr>
-      <w:r>
-        <w:t xml:space="preserve">Table</w:t>
-      </w:r>
-      <w:r>
-        <w:t xml:space="preserve"> </w:t>
-      </w:r>
       <w:hyperlink w:anchor="tbl-metrics-summary">
         <w:r>
           <w:rPr>
@@ -6864,10 +6858,7 @@
         <w:t xml:space="preserve"> </w:t>
       </w:r>
       <w:r>
-        <w:t xml:space="preserve">The ICC currently collects a prioritized subset of the metrics described above (Table</w:t>
-      </w:r>
-      <w:r>
-        <w:t xml:space="preserve"> </w:t>
+        <w:t xml:space="preserve">The ICC currently collects a prioritized subset of the metrics described above (</w:t>
       </w:r>
       <w:hyperlink w:anchor="tbl-metrics-cfde">
         <w:r>
@@ -7256,10 +7247,7 @@
         <w:pStyle w:val="BodyText"/>
       </w:pPr>
       <w:r>
-        <w:t xml:space="preserve">The dashboard supports project- and portfolio-level views with ORCID-based authentication and role-based access, so teams see their own data while program managers see the full portfolio (Figure</w:t>
-      </w:r>
-      <w:r>
-        <w:t xml:space="preserve"> </w:t>
+        <w:t xml:space="preserve">The dashboard supports project- and portfolio-level views with ORCID-based authentication and role-based access, so teams see their own data while program managers see the full portfolio (</w:t>
       </w:r>
       <w:hyperlink w:anchor="fig-dashboard">
         <w:r>

</xml_diff>

<commit_message>
Render push a53a1f4db0667e4917d2794bff52e1221179fe2b Merge pull request #42 from seandavi/checklist-verification-fixes
Submission checklist fixes: Figure 1 cite, COI statement, preprint→published (#13) a53a1f4db0667e4917d2794bff52e1221179fe2b
</commit_message>
<xml_diff>
--- a/manuscript.docx
+++ b/manuscript.docx
@@ -569,7 +569,18 @@
         <w:t xml:space="preserve"> </w:t>
       </w:r>
       <w:r>
-        <w:t xml:space="preserve">become the primary lenses.</w:t>
+        <w:t xml:space="preserve">become the primary lenses (</w:t>
+      </w:r>
+      <w:hyperlink w:anchor="fig-lifecycle_curves">
+        <w:r>
+          <w:rPr>
+            <w:rStyle w:val="Hyperlink"/>
+          </w:rPr>
+          <w:t xml:space="preserve">Figure 1</w:t>
+        </w:r>
+      </w:hyperlink>
+      <w:r>
+        <w:t xml:space="preserve">).</w:t>
       </w:r>
       <w:r>
         <w:t xml:space="preserve"> </w:t>
@@ -7742,13 +7753,13 @@
       </w:r>
     </w:p>
     <w:bookmarkEnd w:id="25"/>
-    <w:bookmarkStart w:id="33" w:name="resources"/>
+    <w:bookmarkStart w:id="26" w:name="declaration-of-interests"/>
     <w:p>
       <w:pPr>
         <w:pStyle w:val="Heading2"/>
       </w:pPr>
       <w:r>
-        <w:t xml:space="preserve">Resources</w:t>
+        <w:t xml:space="preserve">Declaration of interests</w:t>
       </w:r>
     </w:p>
     <w:p>
@@ -7756,6 +7767,24 @@
         <w:pStyle w:val="FirstParagraph"/>
       </w:pPr>
       <w:r>
+        <w:t xml:space="preserve">The authors declare no competing interests.</w:t>
+      </w:r>
+    </w:p>
+    <w:bookmarkEnd w:id="26"/>
+    <w:bookmarkStart w:id="34" w:name="resources"/>
+    <w:p>
+      <w:pPr>
+        <w:pStyle w:val="Heading2"/>
+      </w:pPr>
+      <w:r>
+        <w:t xml:space="preserve">Resources</w:t>
+      </w:r>
+    </w:p>
+    <w:p>
+      <w:pPr>
+        <w:pStyle w:val="FirstParagraph"/>
+      </w:pPr>
+      <w:r>
         <w:rPr>
           <w:vertAlign w:val="superscript"/>
         </w:rPr>
@@ -7770,7 +7799,7 @@
       <w:r>
         <w:t xml:space="preserve"> </w:t>
       </w:r>
-      <w:hyperlink r:id="rId26">
+      <w:hyperlink r:id="rId27">
         <w:r>
           <w:rPr>
             <w:rStyle w:val="Hyperlink"/>
@@ -7798,7 +7827,7 @@
       <w:r>
         <w:t xml:space="preserve"> </w:t>
       </w:r>
-      <w:hyperlink r:id="rId27">
+      <w:hyperlink r:id="rId28">
         <w:r>
           <w:rPr>
             <w:rStyle w:val="Hyperlink"/>
@@ -7826,7 +7855,7 @@
       <w:r>
         <w:t xml:space="preserve"> </w:t>
       </w:r>
-      <w:hyperlink r:id="rId28">
+      <w:hyperlink r:id="rId29">
         <w:r>
           <w:rPr>
             <w:rStyle w:val="Hyperlink"/>
@@ -7854,7 +7883,7 @@
       <w:r>
         <w:t xml:space="preserve"> </w:t>
       </w:r>
-      <w:hyperlink r:id="rId29">
+      <w:hyperlink r:id="rId30">
         <w:r>
           <w:rPr>
             <w:rStyle w:val="Hyperlink"/>
@@ -7882,7 +7911,7 @@
       <w:r>
         <w:t xml:space="preserve"> </w:t>
       </w:r>
-      <w:hyperlink r:id="rId30">
+      <w:hyperlink r:id="rId31">
         <w:r>
           <w:rPr>
             <w:rStyle w:val="Hyperlink"/>
@@ -7910,7 +7939,7 @@
       <w:r>
         <w:t xml:space="preserve"> </w:t>
       </w:r>
-      <w:hyperlink r:id="rId31">
+      <w:hyperlink r:id="rId32">
         <w:r>
           <w:rPr>
             <w:rStyle w:val="Hyperlink"/>
@@ -7938,7 +7967,7 @@
       <w:r>
         <w:t xml:space="preserve"> </w:t>
       </w:r>
-      <w:hyperlink r:id="rId32">
+      <w:hyperlink r:id="rId33">
         <w:r>
           <w:rPr>
             <w:rStyle w:val="Hyperlink"/>
@@ -7947,8 +7976,8 @@
         </w:r>
       </w:hyperlink>
     </w:p>
-    <w:bookmarkEnd w:id="33"/>
-    <w:bookmarkStart w:id="34" w:name="author-contributions"/>
+    <w:bookmarkEnd w:id="34"/>
+    <w:bookmarkStart w:id="35" w:name="author-contributions"/>
     <w:p>
       <w:pPr>
         <w:pStyle w:val="Heading2"/>
@@ -7983,8 +8012,8 @@
         <w:t xml:space="preserve">All authors have read and approved the final manuscript.</w:t>
       </w:r>
     </w:p>
-    <w:bookmarkEnd w:id="34"/>
-    <w:bookmarkStart w:id="38" w:name="X071796dd6bc546c91e96cca1cf5ff96599de61f"/>
+    <w:bookmarkEnd w:id="35"/>
+    <w:bookmarkStart w:id="39" w:name="X071796dd6bc546c91e96cca1cf5ff96599de61f"/>
     <w:p>
       <w:pPr>
         <w:pStyle w:val="Heading2"/>
@@ -8048,18 +8077,18 @@
                 <wp:inline>
                   <wp:extent cx="152400" cy="152400"/>
                   <wp:effectExtent b="0" l="0" r="0" t="0"/>
-                  <wp:docPr descr="" title="" id="36" name="Picture"/>
+                  <wp:docPr descr="" title="" id="37" name="Picture"/>
                   <a:graphic>
                     <a:graphicData uri="http://schemas.openxmlformats.org/drawingml/2006/picture">
                       <pic:pic>
                         <pic:nvPicPr>
-                          <pic:cNvPr descr="/opt/quarto/share/formats/docx/note.png" id="37" name="Picture"/>
+                          <pic:cNvPr descr="/opt/quarto/share/formats/docx/note.png" id="38" name="Picture"/>
                           <pic:cNvPicPr>
                             <a:picLocks noChangeArrowheads="1" noChangeAspect="1"/>
                           </pic:cNvPicPr>
                         </pic:nvPicPr>
                         <pic:blipFill>
-                          <a:blip r:embed="rId35"/>
+                          <a:blip r:embed="rId36"/>
                           <a:stretch>
                             <a:fillRect/>
                           </a:stretch>
@@ -8385,8 +8414,8 @@
         </w:tc>
       </w:tr>
     </w:tbl>
-    <w:bookmarkEnd w:id="38"/>
-    <w:bookmarkStart w:id="88" w:name="references"/>
+    <w:bookmarkEnd w:id="39"/>
+    <w:bookmarkStart w:id="89" w:name="references"/>
     <w:p>
       <w:pPr>
         <w:pStyle w:val="Heading1"/>
@@ -8395,8 +8424,8 @@
         <w:t xml:space="preserve">References</w:t>
       </w:r>
     </w:p>
-    <w:bookmarkStart w:id="87" w:name="refs"/>
-    <w:bookmarkStart w:id="40" w:name="ref-pmid:24071849"/>
+    <w:bookmarkStart w:id="88" w:name="refs"/>
+    <w:bookmarkStart w:id="41" w:name="ref-pmid:24071849"/>
     <w:p>
       <w:pPr>
         <w:pStyle w:val="Bibliography"/>
@@ -8426,7 +8455,7 @@
       <w:r>
         <w:t xml:space="preserve"> </w:t>
       </w:r>
-      <w:hyperlink r:id="rId39">
+      <w:hyperlink r:id="rId40">
         <w:r>
           <w:rPr>
             <w:rStyle w:val="Hyperlink"/>
@@ -8451,8 +8480,8 @@
         <w:t xml:space="preserve">45, 1113–20</w:t>
       </w:r>
     </w:p>
-    <w:bookmarkEnd w:id="40"/>
-    <w:bookmarkStart w:id="42" w:name="ref-doi:10.1038/ng.2653"/>
+    <w:bookmarkEnd w:id="41"/>
+    <w:bookmarkStart w:id="43" w:name="ref-doi:10.1038/ng.2653"/>
     <w:p>
       <w:pPr>
         <w:pStyle w:val="Bibliography"/>
@@ -8488,7 +8517,7 @@
       <w:r>
         <w:t xml:space="preserve"> </w:t>
       </w:r>
-      <w:hyperlink r:id="rId41">
+      <w:hyperlink r:id="rId42">
         <w:r>
           <w:rPr>
             <w:rStyle w:val="Hyperlink"/>
@@ -8516,8 +8545,8 @@
         <w:t xml:space="preserve">45, 580–585</w:t>
       </w:r>
     </w:p>
-    <w:bookmarkEnd w:id="42"/>
-    <w:bookmarkStart w:id="44" w:name="ref-doi:10.1056/NEJMsr1809937"/>
+    <w:bookmarkEnd w:id="43"/>
+    <w:bookmarkStart w:id="45" w:name="ref-doi:10.1056/NEJMsr1809937"/>
     <w:p>
       <w:pPr>
         <w:pStyle w:val="Bibliography"/>
@@ -8537,7 +8566,7 @@
       <w:r>
         <w:t xml:space="preserve"> </w:t>
       </w:r>
-      <w:hyperlink r:id="rId43">
+      <w:hyperlink r:id="rId44">
         <w:r>
           <w:rPr>
             <w:rStyle w:val="Hyperlink"/>
@@ -8589,8 +8618,8 @@
         <w:t xml:space="preserve">381, 668–676</w:t>
       </w:r>
     </w:p>
-    <w:bookmarkEnd w:id="44"/>
-    <w:bookmarkStart w:id="46" w:name="ref-doi:10.1093/gigascience/giac105"/>
+    <w:bookmarkEnd w:id="45"/>
+    <w:bookmarkStart w:id="47" w:name="ref-doi:10.1093/gigascience/giac105"/>
     <w:p>
       <w:pPr>
         <w:pStyle w:val="Bibliography"/>
@@ -8626,7 +8655,7 @@
       <w:r>
         <w:t xml:space="preserve"> </w:t>
       </w:r>
-      <w:hyperlink r:id="rId45">
+      <w:hyperlink r:id="rId46">
         <w:r>
           <w:rPr>
             <w:rStyle w:val="Hyperlink"/>
@@ -8654,8 +8683,8 @@
         <w:t xml:space="preserve">11</w:t>
       </w:r>
     </w:p>
-    <w:bookmarkEnd w:id="46"/>
-    <w:bookmarkStart w:id="47" w:name="ref-isbn:9780471465102"/>
+    <w:bookmarkEnd w:id="47"/>
+    <w:bookmarkStart w:id="48" w:name="ref-isbn:9780471465102"/>
     <w:p>
       <w:pPr>
         <w:pStyle w:val="Bibliography"/>
@@ -8686,8 +8715,8 @@
         <w:t xml:space="preserve">, Wiley</w:t>
       </w:r>
     </w:p>
-    <w:bookmarkEnd w:id="47"/>
-    <w:bookmarkStart w:id="48" w:name="ref-isbn:9780792375067"/>
+    <w:bookmarkEnd w:id="48"/>
+    <w:bookmarkStart w:id="49" w:name="ref-isbn:9780792375067"/>
     <w:p>
       <w:pPr>
         <w:pStyle w:val="Bibliography"/>
@@ -8718,8 +8747,8 @@
         <w:t xml:space="preserve">, Kluwer Academic Publishers</w:t>
       </w:r>
     </w:p>
-    <w:bookmarkEnd w:id="48"/>
-    <w:bookmarkStart w:id="50" w:name="ref-doi:10.1038/sdata.2016.18"/>
+    <w:bookmarkEnd w:id="49"/>
+    <w:bookmarkStart w:id="51" w:name="ref-doi:10.1038/sdata.2016.18"/>
     <w:p>
       <w:pPr>
         <w:pStyle w:val="Bibliography"/>
@@ -8755,7 +8784,7 @@
       <w:r>
         <w:t xml:space="preserve"> </w:t>
       </w:r>
-      <w:hyperlink r:id="rId49">
+      <w:hyperlink r:id="rId50">
         <w:r>
           <w:rPr>
             <w:rStyle w:val="Hyperlink"/>
@@ -8783,8 +8812,8 @@
         <w:t xml:space="preserve">3</w:t>
       </w:r>
     </w:p>
-    <w:bookmarkEnd w:id="50"/>
-    <w:bookmarkStart w:id="52" w:name="ref-doi:10.1038/sdata.2018.118"/>
+    <w:bookmarkEnd w:id="51"/>
+    <w:bookmarkStart w:id="53" w:name="ref-doi:10.1038/sdata.2018.118"/>
     <w:p>
       <w:pPr>
         <w:pStyle w:val="Bibliography"/>
@@ -8820,7 +8849,7 @@
       <w:r>
         <w:t xml:space="preserve"> </w:t>
       </w:r>
-      <w:hyperlink r:id="rId51">
+      <w:hyperlink r:id="rId52">
         <w:r>
           <w:rPr>
             <w:rStyle w:val="Hyperlink"/>
@@ -8848,8 +8877,8 @@
         <w:t xml:space="preserve">5</w:t>
       </w:r>
     </w:p>
-    <w:bookmarkEnd w:id="52"/>
-    <w:bookmarkStart w:id="54" w:name="ref-doi:10.1371/journal.pone.0311493"/>
+    <w:bookmarkEnd w:id="53"/>
+    <w:bookmarkStart w:id="55" w:name="ref-doi:10.1371/journal.pone.0311493"/>
     <w:p>
       <w:pPr>
         <w:pStyle w:val="Bibliography"/>
@@ -8885,7 +8914,7 @@
       <w:r>
         <w:t xml:space="preserve"> </w:t>
       </w:r>
-      <w:hyperlink r:id="rId53">
+      <w:hyperlink r:id="rId54">
         <w:r>
           <w:rPr>
             <w:rStyle w:val="Hyperlink"/>
@@ -8913,8 +8942,8 @@
         <w:t xml:space="preserve">19, e0311493</w:t>
       </w:r>
     </w:p>
-    <w:bookmarkEnd w:id="54"/>
-    <w:bookmarkStart w:id="56" w:name="ref-doi:10.1038/520429a"/>
+    <w:bookmarkEnd w:id="55"/>
+    <w:bookmarkStart w:id="57" w:name="ref-doi:10.1038/520429a"/>
     <w:p>
       <w:pPr>
         <w:pStyle w:val="Bibliography"/>
@@ -8950,7 +8979,7 @@
       <w:r>
         <w:t xml:space="preserve"> </w:t>
       </w:r>
-      <w:hyperlink r:id="rId55">
+      <w:hyperlink r:id="rId56">
         <w:r>
           <w:rPr>
             <w:rStyle w:val="Hyperlink"/>
@@ -8978,8 +9007,8 @@
         <w:t xml:space="preserve">520, 429–431</w:t>
       </w:r>
     </w:p>
-    <w:bookmarkEnd w:id="56"/>
-    <w:bookmarkStart w:id="58" w:name="ref-doi:10.4103/1008-682X.171582"/>
+    <w:bookmarkEnd w:id="57"/>
+    <w:bookmarkStart w:id="59" w:name="ref-doi:10.4103/1008-682X.171582"/>
     <w:p>
       <w:pPr>
         <w:pStyle w:val="Bibliography"/>
@@ -9015,7 +9044,7 @@
       <w:r>
         <w:t xml:space="preserve"> </w:t>
       </w:r>
-      <w:hyperlink r:id="rId57">
+      <w:hyperlink r:id="rId58">
         <w:r>
           <w:rPr>
             <w:rStyle w:val="Hyperlink"/>
@@ -9043,8 +9072,8 @@
         <w:t xml:space="preserve">18, 296</w:t>
       </w:r>
     </w:p>
-    <w:bookmarkEnd w:id="58"/>
-    <w:bookmarkStart w:id="60" w:name="ref-doi:10.1101/2023.09.12.557386"/>
+    <w:bookmarkEnd w:id="59"/>
+    <w:bookmarkStart w:id="61" w:name="ref-doi:10.1093/bioinformatics/btad746"/>
     <w:p>
       <w:pPr>
         <w:pStyle w:val="Bibliography"/>
@@ -9080,7 +9109,7 @@
       <w:r>
         <w:t xml:space="preserve"> </w:t>
       </w:r>
-      <w:hyperlink r:id="rId59">
+      <w:hyperlink r:id="rId60">
         <w:r>
           <w:rPr>
             <w:rStyle w:val="Hyperlink"/>
@@ -9089,11 +9118,27 @@
         </w:r>
       </w:hyperlink>
       <w:r>
-        <w:t xml:space="preserve">openRxiv</w:t>
+        <w:t xml:space="preserve">.</w:t>
+      </w:r>
+      <w:r>
+        <w:t xml:space="preserve"> </w:t>
+      </w:r>
+      <w:r>
+        <w:rPr>
+          <w:i/>
+          <w:iCs/>
+        </w:rPr>
+        <w:t xml:space="preserve">Bioinformatics</w:t>
+      </w:r>
+      <w:r>
+        <w:t xml:space="preserve"> </w:t>
+      </w:r>
+      <w:r>
+        <w:t xml:space="preserve">39</w:t>
       </w:r>
     </w:p>
-    <w:bookmarkEnd w:id="60"/>
-    <w:bookmarkStart w:id="62" w:name="ref-doi:10.2196/63544"/>
+    <w:bookmarkEnd w:id="61"/>
+    <w:bookmarkStart w:id="63" w:name="ref-doi:10.2196/63544"/>
     <w:p>
       <w:pPr>
         <w:pStyle w:val="Bibliography"/>
@@ -9113,7 +9158,7 @@
       <w:r>
         <w:t xml:space="preserve"> </w:t>
       </w:r>
-      <w:hyperlink r:id="rId61">
+      <w:hyperlink r:id="rId62">
         <w:r>
           <w:rPr>
             <w:rStyle w:val="Hyperlink"/>
@@ -9141,8 +9186,8 @@
         <w:t xml:space="preserve">13, e63544–e63544</w:t>
       </w:r>
     </w:p>
-    <w:bookmarkEnd w:id="62"/>
-    <w:bookmarkStart w:id="64" w:name="ref-doi:10.15265/IY-2014-0020"/>
+    <w:bookmarkEnd w:id="63"/>
+    <w:bookmarkStart w:id="65" w:name="ref-doi:10.15265/IY-2014-0020"/>
     <w:p>
       <w:pPr>
         <w:pStyle w:val="Bibliography"/>
@@ -9162,7 +9207,7 @@
       <w:r>
         <w:t xml:space="preserve"> </w:t>
       </w:r>
-      <w:hyperlink r:id="rId63">
+      <w:hyperlink r:id="rId64">
         <w:r>
           <w:rPr>
             <w:rStyle w:val="Hyperlink"/>
@@ -9190,8 +9235,8 @@
         <w:t xml:space="preserve">23, 14–20</w:t>
       </w:r>
     </w:p>
-    <w:bookmarkEnd w:id="64"/>
-    <w:bookmarkStart w:id="66" w:name="ref-doi:10.1371/journal.pone.0229003"/>
+    <w:bookmarkEnd w:id="65"/>
+    <w:bookmarkStart w:id="67" w:name="ref-doi:10.1371/journal.pone.0229003"/>
     <w:p>
       <w:pPr>
         <w:pStyle w:val="Bibliography"/>
@@ -9227,7 +9272,7 @@
       <w:r>
         <w:t xml:space="preserve"> </w:t>
       </w:r>
-      <w:hyperlink r:id="rId65">
+      <w:hyperlink r:id="rId66">
         <w:r>
           <w:rPr>
             <w:rStyle w:val="Hyperlink"/>
@@ -9255,8 +9300,8 @@
         <w:t xml:space="preserve">15, e0229003</w:t>
       </w:r>
     </w:p>
-    <w:bookmarkEnd w:id="66"/>
-    <w:bookmarkStart w:id="68" w:name="ref-doi:10.15585/mmwr.su7303a1"/>
+    <w:bookmarkEnd w:id="67"/>
+    <w:bookmarkStart w:id="69" w:name="ref-doi:10.15585/mmwr.su7303a1"/>
     <w:p>
       <w:pPr>
         <w:pStyle w:val="Bibliography"/>
@@ -9292,7 +9337,7 @@
       <w:r>
         <w:t xml:space="preserve"> </w:t>
       </w:r>
-      <w:hyperlink r:id="rId67">
+      <w:hyperlink r:id="rId68">
         <w:r>
           <w:rPr>
             <w:rStyle w:val="Hyperlink"/>
@@ -9320,8 +9365,8 @@
         <w:t xml:space="preserve">73, 1–13</w:t>
       </w:r>
     </w:p>
-    <w:bookmarkEnd w:id="68"/>
-    <w:bookmarkStart w:id="70" w:name="ref-doi:10.1038/nbt.3780"/>
+    <w:bookmarkEnd w:id="69"/>
+    <w:bookmarkStart w:id="71" w:name="ref-doi:10.1038/nbt.3780"/>
     <w:p>
       <w:pPr>
         <w:pStyle w:val="Bibliography"/>
@@ -9341,7 +9386,7 @@
       <w:r>
         <w:t xml:space="preserve"> </w:t>
       </w:r>
-      <w:hyperlink r:id="rId69">
+      <w:hyperlink r:id="rId70">
         <w:r>
           <w:rPr>
             <w:rStyle w:val="Hyperlink"/>
@@ -9369,8 +9414,8 @@
         <w:t xml:space="preserve">35, 342–346</w:t>
       </w:r>
     </w:p>
-    <w:bookmarkEnd w:id="70"/>
-    <w:bookmarkStart w:id="72" w:name="ref-doi:10.1186/gb-2004-5-10-r80"/>
+    <w:bookmarkEnd w:id="71"/>
+    <w:bookmarkStart w:id="73" w:name="ref-doi:10.1186/gb-2004-5-10-r80"/>
     <w:p>
       <w:pPr>
         <w:pStyle w:val="Bibliography"/>
@@ -9406,7 +9451,7 @@
       <w:r>
         <w:t xml:space="preserve"> </w:t>
       </w:r>
-      <w:hyperlink r:id="rId71">
+      <w:hyperlink r:id="rId72">
         <w:r>
           <w:rPr>
             <w:rStyle w:val="Hyperlink"/>
@@ -9434,8 +9479,8 @@
         <w:t xml:space="preserve">5</w:t>
       </w:r>
     </w:p>
-    <w:bookmarkEnd w:id="72"/>
-    <w:bookmarkStart w:id="74" w:name="ref-doi:10.12688/f1000research.9206.1"/>
+    <w:bookmarkEnd w:id="73"/>
+    <w:bookmarkStart w:id="75" w:name="ref-doi:10.12688/f1000research.9206.1"/>
     <w:p>
       <w:pPr>
         <w:pStyle w:val="Bibliography"/>
@@ -9471,7 +9516,7 @@
       <w:r>
         <w:t xml:space="preserve"> </w:t>
       </w:r>
-      <w:hyperlink r:id="rId73">
+      <w:hyperlink r:id="rId74">
         <w:r>
           <w:rPr>
             <w:rStyle w:val="Hyperlink"/>
@@ -9499,8 +9544,8 @@
         <w:t xml:space="preserve">5, 2000</w:t>
       </w:r>
     </w:p>
-    <w:bookmarkEnd w:id="74"/>
-    <w:bookmarkStart w:id="76" w:name="ref-doi:10.1093/jamia/ocab278"/>
+    <w:bookmarkEnd w:id="75"/>
+    <w:bookmarkStart w:id="77" w:name="ref-doi:10.1093/jamia/ocab278"/>
     <w:p>
       <w:pPr>
         <w:pStyle w:val="Bibliography"/>
@@ -9536,7 +9581,7 @@
       <w:r>
         <w:t xml:space="preserve"> </w:t>
       </w:r>
-      <w:hyperlink r:id="rId75">
+      <w:hyperlink r:id="rId76">
         <w:r>
           <w:rPr>
             <w:rStyle w:val="Hyperlink"/>
@@ -9564,8 +9609,8 @@
         <w:t xml:space="preserve">29, 592–600</w:t>
       </w:r>
     </w:p>
-    <w:bookmarkEnd w:id="76"/>
-    <w:bookmarkStart w:id="78" w:name="ref-doi:10.48550/arXiv.2509.12709"/>
+    <w:bookmarkEnd w:id="77"/>
+    <w:bookmarkStart w:id="79" w:name="ref-doi:10.48550/arXiv.2509.12709"/>
     <w:p>
       <w:pPr>
         <w:pStyle w:val="Bibliography"/>
@@ -9601,7 +9646,7 @@
       <w:r>
         <w:t xml:space="preserve"> </w:t>
       </w:r>
-      <w:hyperlink r:id="rId77">
+      <w:hyperlink r:id="rId78">
         <w:r>
           <w:rPr>
             <w:rStyle w:val="Hyperlink"/>
@@ -9613,8 +9658,8 @@
         <w:t xml:space="preserve">arXiv</w:t>
       </w:r>
     </w:p>
-    <w:bookmarkEnd w:id="78"/>
-    <w:bookmarkStart w:id="80" w:name="ref-doi:10.1007/s10488-013-0528-y"/>
+    <w:bookmarkEnd w:id="79"/>
+    <w:bookmarkStart w:id="81" w:name="ref-doi:10.1007/s10488-013-0528-y"/>
     <w:p>
       <w:pPr>
         <w:pStyle w:val="Bibliography"/>
@@ -9650,7 +9695,7 @@
       <w:r>
         <w:t xml:space="preserve"> </w:t>
       </w:r>
-      <w:hyperlink r:id="rId79">
+      <w:hyperlink r:id="rId80">
         <w:r>
           <w:rPr>
             <w:rStyle w:val="Hyperlink"/>
@@ -9678,8 +9723,8 @@
         <w:t xml:space="preserve">42, 533–544</w:t>
       </w:r>
     </w:p>
-    <w:bookmarkEnd w:id="80"/>
-    <w:bookmarkStart w:id="82" w:name="ref-doi:10.1002/jgf2.736"/>
+    <w:bookmarkEnd w:id="81"/>
+    <w:bookmarkStart w:id="83" w:name="ref-doi:10.1002/jgf2.736"/>
     <w:p>
       <w:pPr>
         <w:pStyle w:val="Bibliography"/>
@@ -9699,7 +9744,7 @@
       <w:r>
         <w:t xml:space="preserve"> </w:t>
       </w:r>
-      <w:hyperlink r:id="rId81">
+      <w:hyperlink r:id="rId82">
         <w:r>
           <w:rPr>
             <w:rStyle w:val="Hyperlink"/>
@@ -9727,8 +9772,8 @@
         <w:t xml:space="preserve">26, 4–11</w:t>
       </w:r>
     </w:p>
-    <w:bookmarkEnd w:id="82"/>
-    <w:bookmarkStart w:id="84" w:name="ref-pmid:30861395"/>
+    <w:bookmarkEnd w:id="83"/>
+    <w:bookmarkStart w:id="85" w:name="ref-pmid:30861395"/>
     <w:p>
       <w:pPr>
         <w:pStyle w:val="Bibliography"/>
@@ -9764,7 +9809,7 @@
       <w:r>
         <w:t xml:space="preserve"> </w:t>
       </w:r>
-      <w:hyperlink r:id="rId83">
+      <w:hyperlink r:id="rId84">
         <w:r>
           <w:rPr>
             <w:rStyle w:val="Hyperlink"/>
@@ -9789,8 +9834,8 @@
         <w:t xml:space="preserve">74, 69–75</w:t>
       </w:r>
     </w:p>
-    <w:bookmarkEnd w:id="84"/>
-    <w:bookmarkStart w:id="86" w:name="ref-doi:10.1016/j.socscimed.2017.03.041"/>
+    <w:bookmarkEnd w:id="85"/>
+    <w:bookmarkStart w:id="87" w:name="ref-doi:10.1016/j.socscimed.2017.03.041"/>
     <w:p>
       <w:pPr>
         <w:pStyle w:val="Bibliography"/>
@@ -9810,7 +9855,7 @@
       <w:r>
         <w:t xml:space="preserve"> </w:t>
       </w:r>
-      <w:hyperlink r:id="rId85">
+      <w:hyperlink r:id="rId86">
         <w:r>
           <w:rPr>
             <w:rStyle w:val="Hyperlink"/>
@@ -9838,9 +9883,9 @@
         <w:t xml:space="preserve">181, 54–65</w:t>
       </w:r>
     </w:p>
-    <w:bookmarkEnd w:id="86"/>
     <w:bookmarkEnd w:id="87"/>
     <w:bookmarkEnd w:id="88"/>
+    <w:bookmarkEnd w:id="89"/>
     <w:sectPr>
       <w:footnotePr>
         <w:numRestart w:val="eachSect"/>

</xml_diff>

<commit_message>
Render push 78b3c8c58394c3267e6fbb13d5db6dd894f8bc51 Merge pull request #43 from seandavi/augment-evidence-citations
Augment claims with evidence-based citations (Tier 1 + Tier 2 first two) 78b3c8c58394c3267e6fbb13d5db6dd894f8bc51
</commit_message>
<xml_diff>
--- a/manuscript.docx
+++ b/manuscript.docx
@@ -939,7 +939,19 @@
         <w:t xml:space="preserve"> </w:t>
       </w:r>
       <w:r>
-        <w:t xml:space="preserve">As AI-driven and agent-based traffic on data portals grows, the bot signal will need to be partitioned into noise to remove and demand to interpret.</w:t>
+        <w:t xml:space="preserve">As AI-driven and agent-based traffic on data portals grows — Cloudflare data show training-purpose AI crawler traffic rising rapidly across 2024 and 2025</w:t>
+      </w:r>
+      <w:r>
+        <w:t xml:space="preserve"> </w:t>
+      </w:r>
+      <w:r>
+        <w:t xml:space="preserve">[9/]</w:t>
+      </w:r>
+      <w:r>
+        <w:t xml:space="preserve"> </w:t>
+      </w:r>
+      <w:r>
+        <w:t xml:space="preserve">— the bot signal will need to be partitioned into noise to remove and demand to interpret.</w:t>
       </w:r>
     </w:p>
     <w:p>
@@ -977,7 +989,7 @@
         <w:t xml:space="preserve"> </w:t>
       </w:r>
       <w:r>
-        <w:t xml:space="preserve">[9]</w:t>
+        <w:t xml:space="preserve">[10]</w:t>
       </w:r>
       <w:r>
         <w:t xml:space="preserve">.</w:t>
@@ -992,7 +1004,7 @@
         <w:t xml:space="preserve"> </w:t>
       </w:r>
       <w:r>
-        <w:t xml:space="preserve">[10]</w:t>
+        <w:t xml:space="preserve">[11]</w:t>
       </w:r>
       <w:r>
         <w:t xml:space="preserve">, and journal-scoring alternatives that weight by citing-paper properties better capture subject-specific repository impact than raw counts</w:t>
@@ -1001,7 +1013,7 @@
         <w:t xml:space="preserve"> </w:t>
       </w:r>
       <w:r>
-        <w:t xml:space="preserve">[11]</w:t>
+        <w:t xml:space="preserve">[12]</w:t>
       </w:r>
       <w:r>
         <w:t xml:space="preserve">.</w:t>
@@ -1016,7 +1028,7 @@
         <w:t xml:space="preserve"> </w:t>
       </w:r>
       <w:r>
-        <w:t xml:space="preserve">[12]</w:t>
+        <w:t xml:space="preserve">[13]</w:t>
       </w:r>
       <w:r>
         <w:t xml:space="preserve">.</w:t>
@@ -1043,7 +1055,7 @@
         <w:t xml:space="preserve"> </w:t>
       </w:r>
       <w:r>
-        <w:t xml:space="preserve">[12]</w:t>
+        <w:t xml:space="preserve">[13]</w:t>
       </w:r>
       <w:r>
         <w:t xml:space="preserve">.</w:t>
@@ -1146,7 +1158,7 @@
         <w:t xml:space="preserve"> </w:t>
       </w:r>
       <w:r>
-        <w:t xml:space="preserve">[13]</w:t>
+        <w:t xml:space="preserve">[14]</w:t>
       </w:r>
       <w:r>
         <w:t xml:space="preserve">.</w:t>
@@ -1185,7 +1197,7 @@
         <w:t xml:space="preserve"> </w:t>
       </w:r>
       <w:r>
-        <w:t xml:space="preserve">[14]</w:t>
+        <w:t xml:space="preserve">[15]</w:t>
       </w:r>
       <w:r>
         <w:t xml:space="preserve">.</w:t>
@@ -1246,7 +1258,7 @@
         <w:t xml:space="preserve"> </w:t>
       </w:r>
       <w:r>
-        <w:t xml:space="preserve">[15]</w:t>
+        <w:t xml:space="preserve">[16]</w:t>
       </w:r>
       <w:r>
         <w:t xml:space="preserve">.</w:t>
@@ -1341,7 +1353,7 @@
         <w:t xml:space="preserve"> </w:t>
       </w:r>
       <w:r>
-        <w:t xml:space="preserve">[16]</w:t>
+        <w:t xml:space="preserve">[17]</w:t>
       </w:r>
       <w:r>
         <w:t xml:space="preserve">.</w:t>
@@ -1363,7 +1375,16 @@
         <w:t xml:space="preserve">representativeness</w:t>
       </w:r>
       <w:r>
-        <w:t xml:space="preserve">, the extent to which a dataset generalizes beyond its source population (critical for avoiding both Type 1 and Type 2 errors in scientific conclusions drawn from the data), and</w:t>
+        <w:t xml:space="preserve">, the extent to which a dataset generalizes beyond its source population (critical for avoiding both Type 1 and Type 2 errors in scientific conclusions drawn from the data, as the European-ancestry bias in human-genetics studies has repeatedly demonstrated</w:t>
+      </w:r>
+      <w:r>
+        <w:t xml:space="preserve"> </w:t>
+      </w:r>
+      <w:r>
+        <w:t xml:space="preserve">[18,19]</w:t>
+      </w:r>
+      <w:r>
+        <w:t xml:space="preserve">), and</w:t>
       </w:r>
       <w:r>
         <w:t xml:space="preserve"> </w:t>
@@ -1422,7 +1443,7 @@
         <w:t xml:space="preserve"> </w:t>
       </w:r>
       <w:r>
-        <w:t xml:space="preserve">[17]</w:t>
+        <w:t xml:space="preserve">[20]</w:t>
       </w:r>
       <w:r>
         <w:t xml:space="preserve">, and inclusion in curated ecosystems like Bioconductor</w:t>
@@ -1431,7 +1452,7 @@
         <w:t xml:space="preserve"> </w:t>
       </w:r>
       <w:r>
-        <w:t xml:space="preserve">[18]</w:t>
+        <w:t xml:space="preserve">[21]</w:t>
       </w:r>
       <w:r>
         <w:t xml:space="preserve">.</w:t>
@@ -1458,7 +1479,7 @@
         <w:t xml:space="preserve"> </w:t>
       </w:r>
       <w:r>
-        <w:t xml:space="preserve">[19]</w:t>
+        <w:t xml:space="preserve">[22]</w:t>
       </w:r>
       <w:r>
         <w:t xml:space="preserve">.</w:t>
@@ -1485,7 +1506,7 @@
         <w:t xml:space="preserve"> </w:t>
       </w:r>
       <w:r>
-        <w:t xml:space="preserve">[19]</w:t>
+        <w:t xml:space="preserve">[22]</w:t>
       </w:r>
       <w:r>
         <w:t xml:space="preserve">.</w:t>
@@ -1943,7 +1964,7 @@
         <w:t xml:space="preserve"> </w:t>
       </w:r>
       <w:r>
-        <w:t xml:space="preserve">[20]</w:t>
+        <w:t xml:space="preserve">[23]</w:t>
       </w:r>
       <w:r>
         <w:t xml:space="preserve">.</w:t>
@@ -1961,6 +1982,21 @@
       </w:r>
       <w:r>
         <w:t xml:space="preserve">Curation costs are borne by data generators while reuse benefits accrue elsewhere — an asymmetry that means aggregate gains can fail to cover aggregate costs even when both are positive.</w:t>
+      </w:r>
+      <w:r>
+        <w:t xml:space="preserve"> </w:t>
+      </w:r>
+      <w:r>
+        <w:t xml:space="preserve">A recent scoping review of open-science economics catalogs substantial measured value across efficiency, innovation, and growth from open data and software, though most studies estimate aggregate return on investment rather than the marginal break-even at the dataset level</w:t>
+      </w:r>
+      <w:r>
+        <w:t xml:space="preserve"> </w:t>
+      </w:r>
+      <w:r>
+        <w:t xml:space="preserve">[24]</w:t>
+      </w:r>
+      <w:r>
+        <w:t xml:space="preserve">.</w:t>
       </w:r>
       <w:r>
         <w:t xml:space="preserve"> </w:t>
@@ -7380,7 +7416,7 @@
         <w:t xml:space="preserve"> </w:t>
       </w:r>
       <w:r>
-        <w:t xml:space="preserve">[21]</w:t>
+        <w:t xml:space="preserve">[25]</w:t>
       </w:r>
       <w:r>
         <w:t xml:space="preserve"> </w:t>
@@ -7490,7 +7526,7 @@
         <w:t xml:space="preserve"> </w:t>
       </w:r>
       <w:r>
-        <w:t xml:space="preserve">[22]</w:t>
+        <w:t xml:space="preserve">[26]</w:t>
       </w:r>
       <w:r>
         <w:t xml:space="preserve">.</w:t>
@@ -7537,7 +7573,7 @@
         <w:t xml:space="preserve"> </w:t>
       </w:r>
       <w:r>
-        <w:t xml:space="preserve">[23]</w:t>
+        <w:t xml:space="preserve">[27]</w:t>
       </w:r>
       <w:r>
         <w:t xml:space="preserve">.</w:t>
@@ -7607,7 +7643,7 @@
         <w:t xml:space="preserve"> </w:t>
       </w:r>
       <w:r>
-        <w:t xml:space="preserve">[24]</w:t>
+        <w:t xml:space="preserve">[28]</w:t>
       </w:r>
       <w:r>
         <w:t xml:space="preserve">.</w:t>
@@ -7636,7 +7672,16 @@
         <w:t xml:space="preserve"> </w:t>
       </w:r>
       <w:r>
-        <w:t xml:space="preserve">— the distance between the information metrics provide and actual decision-making.</w:t>
+        <w:t xml:space="preserve">— the distance between the information metrics provide and actual decision-making</w:t>
+      </w:r>
+      <w:r>
+        <w:t xml:space="preserve"> </w:t>
+      </w:r>
+      <w:r>
+        <w:t xml:space="preserve">[29]</w:t>
+      </w:r>
+      <w:r>
+        <w:t xml:space="preserve">.</w:t>
       </w:r>
       <w:r>
         <w:t xml:space="preserve"> </w:t>
@@ -7648,7 +7693,7 @@
         <w:t xml:space="preserve"> </w:t>
       </w:r>
       <w:r>
-        <w:t xml:space="preserve">[25]</w:t>
+        <w:t xml:space="preserve">[30]</w:t>
       </w:r>
       <w:r>
         <w:t xml:space="preserve">.</w:t>
@@ -8415,7 +8460,7 @@
       </w:tr>
     </w:tbl>
     <w:bookmarkEnd w:id="39"/>
-    <w:bookmarkStart w:id="89" w:name="references"/>
+    <w:bookmarkStart w:id="99" w:name="references"/>
     <w:p>
       <w:pPr>
         <w:pStyle w:val="Heading1"/>
@@ -8424,7 +8469,7 @@
         <w:t xml:space="preserve">References</w:t>
       </w:r>
     </w:p>
-    <w:bookmarkStart w:id="88" w:name="refs"/>
+    <w:bookmarkStart w:id="98" w:name="refs"/>
     <w:bookmarkStart w:id="41" w:name="ref-pmid:24071849"/>
     <w:p>
       <w:pPr>
@@ -8878,7 +8923,7 @@
       </w:r>
     </w:p>
     <w:bookmarkEnd w:id="53"/>
-    <w:bookmarkStart w:id="55" w:name="ref-doi:10.1371/journal.pone.0311493"/>
+    <w:bookmarkStart w:id="55" w:name="X2a8a3e992b47b0c214c0c986c83575d69fc465e"/>
     <w:p>
       <w:pPr>
         <w:pStyle w:val="Bibliography"/>
@@ -8893,6 +8938,52 @@
         <w:t xml:space="preserve">	</w:t>
       </w:r>
       <w:r>
+        <w:t xml:space="preserve">(2025) A deeper look at AI crawlers: breaking down traffic by purpose and industry.</w:t>
+      </w:r>
+      <w:r>
+        <w:t xml:space="preserve"> </w:t>
+      </w:r>
+      <w:r>
+        <w:rPr>
+          <w:i/>
+          <w:iCs/>
+        </w:rPr>
+        <w:t xml:space="preserve">The Cloudflare Blog</w:t>
+      </w:r>
+      <w:r>
+        <w:t xml:space="preserve">. [Online]. Available:</w:t>
+      </w:r>
+      <w:r>
+        <w:t xml:space="preserve"> </w:t>
+      </w:r>
+      <w:hyperlink r:id="rId54">
+        <w:r>
+          <w:rPr>
+            <w:rStyle w:val="Hyperlink"/>
+          </w:rPr>
+          <w:t xml:space="preserve">https://blog.cloudflare.com/ai-crawler-traffic-by-purpose-and-industry/</w:t>
+        </w:r>
+      </w:hyperlink>
+      <w:r>
+        <w:t xml:space="preserve">. [Accessed: 17-May-2026]</w:t>
+      </w:r>
+    </w:p>
+    <w:bookmarkEnd w:id="55"/>
+    <w:bookmarkStart w:id="57" w:name="ref-doi:10.1371/journal.pone.0311493"/>
+    <w:p>
+      <w:pPr>
+        <w:pStyle w:val="Bibliography"/>
+      </w:pPr>
+      <w:r>
+        <w:t xml:space="preserve">10.</w:t>
+      </w:r>
+      <w:r>
+        <w:t xml:space="preserve"> </w:t>
+      </w:r>
+      <w:r>
+        <w:t xml:space="preserve">	</w:t>
+      </w:r>
+      <w:r>
         <w:t xml:space="preserve">Colavizza, G.</w:t>
       </w:r>
       <w:r>
@@ -8914,7 +9005,7 @@
       <w:r>
         <w:t xml:space="preserve"> </w:t>
       </w:r>
-      <w:hyperlink r:id="rId54">
+      <w:hyperlink r:id="rId56">
         <w:r>
           <w:rPr>
             <w:rStyle w:val="Hyperlink"/>
@@ -8942,14 +9033,14 @@
         <w:t xml:space="preserve">19, e0311493</w:t>
       </w:r>
     </w:p>
-    <w:bookmarkEnd w:id="55"/>
-    <w:bookmarkStart w:id="57" w:name="ref-doi:10.1038/520429a"/>
+    <w:bookmarkEnd w:id="57"/>
+    <w:bookmarkStart w:id="59" w:name="ref-doi:10.1038/520429a"/>
     <w:p>
       <w:pPr>
         <w:pStyle w:val="Bibliography"/>
       </w:pPr>
       <w:r>
-        <w:t xml:space="preserve">10.</w:t>
+        <w:t xml:space="preserve">11.</w:t>
       </w:r>
       <w:r>
         <w:t xml:space="preserve"> </w:t>
@@ -8979,7 +9070,7 @@
       <w:r>
         <w:t xml:space="preserve"> </w:t>
       </w:r>
-      <w:hyperlink r:id="rId56">
+      <w:hyperlink r:id="rId58">
         <w:r>
           <w:rPr>
             <w:rStyle w:val="Hyperlink"/>
@@ -9007,14 +9098,14 @@
         <w:t xml:space="preserve">520, 429–431</w:t>
       </w:r>
     </w:p>
-    <w:bookmarkEnd w:id="57"/>
-    <w:bookmarkStart w:id="59" w:name="ref-doi:10.4103/1008-682X.171582"/>
+    <w:bookmarkEnd w:id="59"/>
+    <w:bookmarkStart w:id="61" w:name="ref-doi:10.4103/1008-682X.171582"/>
     <w:p>
       <w:pPr>
         <w:pStyle w:val="Bibliography"/>
       </w:pPr>
       <w:r>
-        <w:t xml:space="preserve">11.</w:t>
+        <w:t xml:space="preserve">12.</w:t>
       </w:r>
       <w:r>
         <w:t xml:space="preserve"> </w:t>
@@ -9044,7 +9135,7 @@
       <w:r>
         <w:t xml:space="preserve"> </w:t>
       </w:r>
-      <w:hyperlink r:id="rId58">
+      <w:hyperlink r:id="rId60">
         <w:r>
           <w:rPr>
             <w:rStyle w:val="Hyperlink"/>
@@ -9072,14 +9163,14 @@
         <w:t xml:space="preserve">18, 296</w:t>
       </w:r>
     </w:p>
-    <w:bookmarkEnd w:id="59"/>
-    <w:bookmarkStart w:id="61" w:name="ref-doi:10.1093/bioinformatics/btad746"/>
+    <w:bookmarkEnd w:id="61"/>
+    <w:bookmarkStart w:id="63" w:name="ref-doi:10.1093/bioinformatics/btad746"/>
     <w:p>
       <w:pPr>
         <w:pStyle w:val="Bibliography"/>
       </w:pPr>
       <w:r>
-        <w:t xml:space="preserve">12.</w:t>
+        <w:t xml:space="preserve">13.</w:t>
       </w:r>
       <w:r>
         <w:t xml:space="preserve"> </w:t>
@@ -9109,7 +9200,7 @@
       <w:r>
         <w:t xml:space="preserve"> </w:t>
       </w:r>
-      <w:hyperlink r:id="rId60">
+      <w:hyperlink r:id="rId62">
         <w:r>
           <w:rPr>
             <w:rStyle w:val="Hyperlink"/>
@@ -9137,14 +9228,14 @@
         <w:t xml:space="preserve">39</w:t>
       </w:r>
     </w:p>
-    <w:bookmarkEnd w:id="61"/>
-    <w:bookmarkStart w:id="63" w:name="ref-doi:10.2196/63544"/>
+    <w:bookmarkEnd w:id="63"/>
+    <w:bookmarkStart w:id="65" w:name="ref-doi:10.2196/63544"/>
     <w:p>
       <w:pPr>
         <w:pStyle w:val="Bibliography"/>
       </w:pPr>
       <w:r>
-        <w:t xml:space="preserve">13.</w:t>
+        <w:t xml:space="preserve">14.</w:t>
       </w:r>
       <w:r>
         <w:t xml:space="preserve"> </w:t>
@@ -9158,7 +9249,7 @@
       <w:r>
         <w:t xml:space="preserve"> </w:t>
       </w:r>
-      <w:hyperlink r:id="rId62">
+      <w:hyperlink r:id="rId64">
         <w:r>
           <w:rPr>
             <w:rStyle w:val="Hyperlink"/>
@@ -9186,14 +9277,14 @@
         <w:t xml:space="preserve">13, e63544–e63544</w:t>
       </w:r>
     </w:p>
-    <w:bookmarkEnd w:id="63"/>
-    <w:bookmarkStart w:id="65" w:name="ref-doi:10.15265/IY-2014-0020"/>
+    <w:bookmarkEnd w:id="65"/>
+    <w:bookmarkStart w:id="67" w:name="ref-doi:10.15265/IY-2014-0020"/>
     <w:p>
       <w:pPr>
         <w:pStyle w:val="Bibliography"/>
       </w:pPr>
       <w:r>
-        <w:t xml:space="preserve">14.</w:t>
+        <w:t xml:space="preserve">15.</w:t>
       </w:r>
       <w:r>
         <w:t xml:space="preserve"> </w:t>
@@ -9207,7 +9298,7 @@
       <w:r>
         <w:t xml:space="preserve"> </w:t>
       </w:r>
-      <w:hyperlink r:id="rId64">
+      <w:hyperlink r:id="rId66">
         <w:r>
           <w:rPr>
             <w:rStyle w:val="Hyperlink"/>
@@ -9235,14 +9326,14 @@
         <w:t xml:space="preserve">23, 14–20</w:t>
       </w:r>
     </w:p>
-    <w:bookmarkEnd w:id="65"/>
-    <w:bookmarkStart w:id="67" w:name="ref-doi:10.1371/journal.pone.0229003"/>
+    <w:bookmarkEnd w:id="67"/>
+    <w:bookmarkStart w:id="69" w:name="ref-doi:10.1371/journal.pone.0229003"/>
     <w:p>
       <w:pPr>
         <w:pStyle w:val="Bibliography"/>
       </w:pPr>
       <w:r>
-        <w:t xml:space="preserve">15.</w:t>
+        <w:t xml:space="preserve">16.</w:t>
       </w:r>
       <w:r>
         <w:t xml:space="preserve"> </w:t>
@@ -9272,7 +9363,7 @@
       <w:r>
         <w:t xml:space="preserve"> </w:t>
       </w:r>
-      <w:hyperlink r:id="rId66">
+      <w:hyperlink r:id="rId68">
         <w:r>
           <w:rPr>
             <w:rStyle w:val="Hyperlink"/>
@@ -9300,14 +9391,14 @@
         <w:t xml:space="preserve">15, e0229003</w:t>
       </w:r>
     </w:p>
-    <w:bookmarkEnd w:id="67"/>
-    <w:bookmarkStart w:id="69" w:name="ref-doi:10.15585/mmwr.su7303a1"/>
+    <w:bookmarkEnd w:id="69"/>
+    <w:bookmarkStart w:id="71" w:name="ref-doi:10.15585/mmwr.su7303a1"/>
     <w:p>
       <w:pPr>
         <w:pStyle w:val="Bibliography"/>
       </w:pPr>
       <w:r>
-        <w:t xml:space="preserve">16.</w:t>
+        <w:t xml:space="preserve">17.</w:t>
       </w:r>
       <w:r>
         <w:t xml:space="preserve"> </w:t>
@@ -9337,7 +9428,7 @@
       <w:r>
         <w:t xml:space="preserve"> </w:t>
       </w:r>
-      <w:hyperlink r:id="rId68">
+      <w:hyperlink r:id="rId70">
         <w:r>
           <w:rPr>
             <w:rStyle w:val="Hyperlink"/>
@@ -9365,14 +9456,14 @@
         <w:t xml:space="preserve">73, 1–13</w:t>
       </w:r>
     </w:p>
-    <w:bookmarkEnd w:id="69"/>
-    <w:bookmarkStart w:id="71" w:name="ref-doi:10.1038/nbt.3780"/>
+    <w:bookmarkEnd w:id="71"/>
+    <w:bookmarkStart w:id="73" w:name="ref-doi:10.1016/j.cell.2019.02.048"/>
     <w:p>
       <w:pPr>
         <w:pStyle w:val="Bibliography"/>
       </w:pPr>
       <w:r>
-        <w:t xml:space="preserve">17.</w:t>
+        <w:t xml:space="preserve">18.</w:t>
       </w:r>
       <w:r>
         <w:t xml:space="preserve"> </w:t>
@@ -9381,12 +9472,126 @@
         <w:t xml:space="preserve">	</w:t>
       </w:r>
       <w:r>
+        <w:t xml:space="preserve">Sirugo, G.</w:t>
+      </w:r>
+      <w:r>
+        <w:t xml:space="preserve"> </w:t>
+      </w:r>
+      <w:r>
+        <w:rPr>
+          <w:i/>
+          <w:iCs/>
+        </w:rPr>
+        <w:t xml:space="preserve">et al.</w:t>
+      </w:r>
+      <w:r>
+        <w:t xml:space="preserve"> </w:t>
+      </w:r>
+      <w:r>
+        <w:t xml:space="preserve">(2019)</w:t>
+      </w:r>
+      <w:r>
+        <w:t xml:space="preserve"> </w:t>
+      </w:r>
+      <w:hyperlink r:id="rId72">
+        <w:r>
+          <w:rPr>
+            <w:rStyle w:val="Hyperlink"/>
+          </w:rPr>
+          <w:t xml:space="preserve">The Missing Diversity in Human Genetic Studies</w:t>
+        </w:r>
+      </w:hyperlink>
+      <w:r>
+        <w:t xml:space="preserve">.</w:t>
+      </w:r>
+      <w:r>
+        <w:t xml:space="preserve"> </w:t>
+      </w:r>
+      <w:r>
+        <w:rPr>
+          <w:i/>
+          <w:iCs/>
+        </w:rPr>
+        <w:t xml:space="preserve">Cell</w:t>
+      </w:r>
+      <w:r>
+        <w:t xml:space="preserve"> </w:t>
+      </w:r>
+      <w:r>
+        <w:t xml:space="preserve">177, 26–31</w:t>
+      </w:r>
+    </w:p>
+    <w:bookmarkEnd w:id="73"/>
+    <w:bookmarkStart w:id="75" w:name="ref-doi:10.1038/538161a"/>
+    <w:p>
+      <w:pPr>
+        <w:pStyle w:val="Bibliography"/>
+      </w:pPr>
+      <w:r>
+        <w:t xml:space="preserve">19.</w:t>
+      </w:r>
+      <w:r>
+        <w:t xml:space="preserve"> </w:t>
+      </w:r>
+      <w:r>
+        <w:t xml:space="preserve">	</w:t>
+      </w:r>
+      <w:r>
+        <w:t xml:space="preserve">Popejoy, A.B. and Fullerton, S.M. (2016)</w:t>
+      </w:r>
+      <w:r>
+        <w:t xml:space="preserve"> </w:t>
+      </w:r>
+      <w:hyperlink r:id="rId74">
+        <w:r>
+          <w:rPr>
+            <w:rStyle w:val="Hyperlink"/>
+          </w:rPr>
+          <w:t xml:space="preserve">Genomics is failing on diversity</w:t>
+        </w:r>
+      </w:hyperlink>
+      <w:r>
+        <w:t xml:space="preserve">.</w:t>
+      </w:r>
+      <w:r>
+        <w:t xml:space="preserve"> </w:t>
+      </w:r>
+      <w:r>
+        <w:rPr>
+          <w:i/>
+          <w:iCs/>
+        </w:rPr>
+        <w:t xml:space="preserve">Nature</w:t>
+      </w:r>
+      <w:r>
+        <w:t xml:space="preserve"> </w:t>
+      </w:r>
+      <w:r>
+        <w:t xml:space="preserve">538, 161–164</w:t>
+      </w:r>
+    </w:p>
+    <w:bookmarkEnd w:id="75"/>
+    <w:bookmarkStart w:id="77" w:name="ref-doi:10.1038/nbt.3780"/>
+    <w:p>
+      <w:pPr>
+        <w:pStyle w:val="Bibliography"/>
+      </w:pPr>
+      <w:r>
+        <w:t xml:space="preserve">20.</w:t>
+      </w:r>
+      <w:r>
+        <w:t xml:space="preserve"> </w:t>
+      </w:r>
+      <w:r>
+        <w:t xml:space="preserve">	</w:t>
+      </w:r>
+      <w:r>
         <w:t xml:space="preserve">Beaulieu-Jones, B.K. and Greene, C.S. (2017)</w:t>
       </w:r>
       <w:r>
         <w:t xml:space="preserve"> </w:t>
       </w:r>
-      <w:hyperlink r:id="rId70">
+      <w:hyperlink r:id="rId76">
         <w:r>
           <w:rPr>
             <w:rStyle w:val="Hyperlink"/>
@@ -9414,14 +9619,14 @@
         <w:t xml:space="preserve">35, 342–346</w:t>
       </w:r>
     </w:p>
-    <w:bookmarkEnd w:id="71"/>
-    <w:bookmarkStart w:id="73" w:name="ref-doi:10.1186/gb-2004-5-10-r80"/>
+    <w:bookmarkEnd w:id="77"/>
+    <w:bookmarkStart w:id="79" w:name="ref-doi:10.1186/gb-2004-5-10-r80"/>
     <w:p>
       <w:pPr>
         <w:pStyle w:val="Bibliography"/>
       </w:pPr>
       <w:r>
-        <w:t xml:space="preserve">18.</w:t>
+        <w:t xml:space="preserve">21.</w:t>
       </w:r>
       <w:r>
         <w:t xml:space="preserve"> </w:t>
@@ -9451,7 +9656,7 @@
       <w:r>
         <w:t xml:space="preserve"> </w:t>
       </w:r>
-      <w:hyperlink r:id="rId72">
+      <w:hyperlink r:id="rId78">
         <w:r>
           <w:rPr>
             <w:rStyle w:val="Hyperlink"/>
@@ -9479,14 +9684,14 @@
         <w:t xml:space="preserve">5</w:t>
       </w:r>
     </w:p>
-    <w:bookmarkEnd w:id="73"/>
-    <w:bookmarkStart w:id="75" w:name="ref-doi:10.12688/f1000research.9206.1"/>
+    <w:bookmarkEnd w:id="79"/>
+    <w:bookmarkStart w:id="81" w:name="ref-doi:10.12688/f1000research.9206.1"/>
     <w:p>
       <w:pPr>
         <w:pStyle w:val="Bibliography"/>
       </w:pPr>
       <w:r>
-        <w:t xml:space="preserve">19.</w:t>
+        <w:t xml:space="preserve">22.</w:t>
       </w:r>
       <w:r>
         <w:t xml:space="preserve"> </w:t>
@@ -9516,7 +9721,7 @@
       <w:r>
         <w:t xml:space="preserve"> </w:t>
       </w:r>
-      <w:hyperlink r:id="rId74">
+      <w:hyperlink r:id="rId80">
         <w:r>
           <w:rPr>
             <w:rStyle w:val="Hyperlink"/>
@@ -9544,14 +9749,14 @@
         <w:t xml:space="preserve">5, 2000</w:t>
       </w:r>
     </w:p>
-    <w:bookmarkEnd w:id="75"/>
-    <w:bookmarkStart w:id="77" w:name="ref-doi:10.1093/jamia/ocab278"/>
+    <w:bookmarkEnd w:id="81"/>
+    <w:bookmarkStart w:id="83" w:name="ref-doi:10.1093/jamia/ocab278"/>
     <w:p>
       <w:pPr>
         <w:pStyle w:val="Bibliography"/>
       </w:pPr>
       <w:r>
-        <w:t xml:space="preserve">20.</w:t>
+        <w:t xml:space="preserve">23.</w:t>
       </w:r>
       <w:r>
         <w:t xml:space="preserve"> </w:t>
@@ -9581,7 +9786,7 @@
       <w:r>
         <w:t xml:space="preserve"> </w:t>
       </w:r>
-      <w:hyperlink r:id="rId76">
+      <w:hyperlink r:id="rId82">
         <w:r>
           <w:rPr>
             <w:rStyle w:val="Hyperlink"/>
@@ -9609,14 +9814,14 @@
         <w:t xml:space="preserve">29, 592–600</w:t>
       </w:r>
     </w:p>
-    <w:bookmarkEnd w:id="77"/>
-    <w:bookmarkStart w:id="79" w:name="ref-doi:10.48550/arXiv.2509.12709"/>
+    <w:bookmarkEnd w:id="83"/>
+    <w:bookmarkStart w:id="85" w:name="ref-doi:10.1098/rsos.250754"/>
     <w:p>
       <w:pPr>
         <w:pStyle w:val="Bibliography"/>
       </w:pPr>
       <w:r>
-        <w:t xml:space="preserve">21.</w:t>
+        <w:t xml:space="preserve">24.</w:t>
       </w:r>
       <w:r>
         <w:t xml:space="preserve"> </w:t>
@@ -9625,6 +9830,71 @@
         <w:t xml:space="preserve">	</w:t>
       </w:r>
       <w:r>
+        <w:t xml:space="preserve">Tsipouri, L.</w:t>
+      </w:r>
+      <w:r>
+        <w:t xml:space="preserve"> </w:t>
+      </w:r>
+      <w:r>
+        <w:rPr>
+          <w:i/>
+          <w:iCs/>
+        </w:rPr>
+        <w:t xml:space="preserve">et al.</w:t>
+      </w:r>
+      <w:r>
+        <w:t xml:space="preserve"> </w:t>
+      </w:r>
+      <w:r>
+        <w:t xml:space="preserve">(2025)</w:t>
+      </w:r>
+      <w:r>
+        <w:t xml:space="preserve"> </w:t>
+      </w:r>
+      <w:hyperlink r:id="rId84">
+        <w:r>
+          <w:rPr>
+            <w:rStyle w:val="Hyperlink"/>
+          </w:rPr>
+          <w:t xml:space="preserve">The economic impact of open science: a scoping review</w:t>
+        </w:r>
+      </w:hyperlink>
+      <w:r>
+        <w:t xml:space="preserve">.</w:t>
+      </w:r>
+      <w:r>
+        <w:t xml:space="preserve"> </w:t>
+      </w:r>
+      <w:r>
+        <w:rPr>
+          <w:i/>
+          <w:iCs/>
+        </w:rPr>
+        <w:t xml:space="preserve">R. Soc. Open Sci.</w:t>
+      </w:r>
+      <w:r>
+        <w:t xml:space="preserve"> </w:t>
+      </w:r>
+      <w:r>
+        <w:t xml:space="preserve">12</w:t>
+      </w:r>
+    </w:p>
+    <w:bookmarkEnd w:id="85"/>
+    <w:bookmarkStart w:id="87" w:name="ref-doi:10.48550/arXiv.2509.12709"/>
+    <w:p>
+      <w:pPr>
+        <w:pStyle w:val="Bibliography"/>
+      </w:pPr>
+      <w:r>
+        <w:t xml:space="preserve">25.</w:t>
+      </w:r>
+      <w:r>
+        <w:t xml:space="preserve"> </w:t>
+      </w:r>
+      <w:r>
+        <w:t xml:space="preserve">	</w:t>
+      </w:r>
+      <w:r>
         <w:t xml:space="preserve">Zhang, H.</w:t>
       </w:r>
       <w:r>
@@ -9646,7 +9916,7 @@
       <w:r>
         <w:t xml:space="preserve"> </w:t>
       </w:r>
-      <w:hyperlink r:id="rId78">
+      <w:hyperlink r:id="rId86">
         <w:r>
           <w:rPr>
             <w:rStyle w:val="Hyperlink"/>
@@ -9658,14 +9928,14 @@
         <w:t xml:space="preserve">arXiv</w:t>
       </w:r>
     </w:p>
-    <w:bookmarkEnd w:id="79"/>
-    <w:bookmarkStart w:id="81" w:name="ref-doi:10.1007/s10488-013-0528-y"/>
+    <w:bookmarkEnd w:id="87"/>
+    <w:bookmarkStart w:id="89" w:name="ref-doi:10.1007/s10488-013-0528-y"/>
     <w:p>
       <w:pPr>
         <w:pStyle w:val="Bibliography"/>
       </w:pPr>
       <w:r>
-        <w:t xml:space="preserve">22.</w:t>
+        <w:t xml:space="preserve">26.</w:t>
       </w:r>
       <w:r>
         <w:t xml:space="preserve"> </w:t>
@@ -9695,7 +9965,7 @@
       <w:r>
         <w:t xml:space="preserve"> </w:t>
       </w:r>
-      <w:hyperlink r:id="rId80">
+      <w:hyperlink r:id="rId88">
         <w:r>
           <w:rPr>
             <w:rStyle w:val="Hyperlink"/>
@@ -9723,14 +9993,14 @@
         <w:t xml:space="preserve">42, 533–544</w:t>
       </w:r>
     </w:p>
-    <w:bookmarkEnd w:id="81"/>
-    <w:bookmarkStart w:id="83" w:name="ref-doi:10.1002/jgf2.736"/>
+    <w:bookmarkEnd w:id="89"/>
+    <w:bookmarkStart w:id="91" w:name="ref-doi:10.1002/jgf2.736"/>
     <w:p>
       <w:pPr>
         <w:pStyle w:val="Bibliography"/>
       </w:pPr>
       <w:r>
-        <w:t xml:space="preserve">23.</w:t>
+        <w:t xml:space="preserve">27.</w:t>
       </w:r>
       <w:r>
         <w:t xml:space="preserve"> </w:t>
@@ -9744,7 +10014,7 @@
       <w:r>
         <w:t xml:space="preserve"> </w:t>
       </w:r>
-      <w:hyperlink r:id="rId82">
+      <w:hyperlink r:id="rId90">
         <w:r>
           <w:rPr>
             <w:rStyle w:val="Hyperlink"/>
@@ -9772,14 +10042,14 @@
         <w:t xml:space="preserve">26, 4–11</w:t>
       </w:r>
     </w:p>
-    <w:bookmarkEnd w:id="83"/>
-    <w:bookmarkStart w:id="85" w:name="ref-pmid:30861395"/>
+    <w:bookmarkEnd w:id="91"/>
+    <w:bookmarkStart w:id="93" w:name="ref-pmid:30861395"/>
     <w:p>
       <w:pPr>
         <w:pStyle w:val="Bibliography"/>
       </w:pPr>
       <w:r>
-        <w:t xml:space="preserve">24.</w:t>
+        <w:t xml:space="preserve">28.</w:t>
       </w:r>
       <w:r>
         <w:t xml:space="preserve"> </w:t>
@@ -9809,7 +10079,7 @@
       <w:r>
         <w:t xml:space="preserve"> </w:t>
       </w:r>
-      <w:hyperlink r:id="rId84">
+      <w:hyperlink r:id="rId92">
         <w:r>
           <w:rPr>
             <w:rStyle w:val="Hyperlink"/>
@@ -9834,14 +10104,14 @@
         <w:t xml:space="preserve">74, 69–75</w:t>
       </w:r>
     </w:p>
-    <w:bookmarkEnd w:id="85"/>
-    <w:bookmarkStart w:id="87" w:name="ref-doi:10.1016/j.socscimed.2017.03.041"/>
+    <w:bookmarkEnd w:id="93"/>
+    <w:bookmarkStart w:id="95" w:name="ref-pmid:16283043"/>
     <w:p>
       <w:pPr>
         <w:pStyle w:val="Bibliography"/>
       </w:pPr>
       <w:r>
-        <w:t xml:space="preserve">25.</w:t>
+        <w:t xml:space="preserve">29.</w:t>
       </w:r>
       <w:r>
         <w:t xml:space="preserve"> </w:t>
@@ -9850,12 +10120,74 @@
         <w:t xml:space="preserve">	</w:t>
       </w:r>
       <w:r>
+        <w:t xml:space="preserve">Pablos-Mendez, A.</w:t>
+      </w:r>
+      <w:r>
+        <w:t xml:space="preserve"> </w:t>
+      </w:r>
+      <w:r>
+        <w:rPr>
+          <w:i/>
+          <w:iCs/>
+        </w:rPr>
+        <w:t xml:space="preserve">et al.</w:t>
+      </w:r>
+      <w:r>
+        <w:t xml:space="preserve"> </w:t>
+      </w:r>
+      <w:r>
+        <w:t xml:space="preserve">(2005)</w:t>
+      </w:r>
+      <w:r>
+        <w:t xml:space="preserve"> </w:t>
+      </w:r>
+      <w:hyperlink r:id="rId94">
+        <w:r>
+          <w:rPr>
+            <w:rStyle w:val="Hyperlink"/>
+          </w:rPr>
+          <w:t xml:space="preserve">Knowledge translation in global health.</w:t>
+        </w:r>
+      </w:hyperlink>
+      <w:r>
+        <w:t xml:space="preserve"> </w:t>
+      </w:r>
+      <w:r>
+        <w:rPr>
+          <w:i/>
+          <w:iCs/>
+        </w:rPr>
+        <w:t xml:space="preserve">Bull World Health Organ</w:t>
+      </w:r>
+      <w:r>
+        <w:t xml:space="preserve"> </w:t>
+      </w:r>
+      <w:r>
+        <w:t xml:space="preserve">83, 723</w:t>
+      </w:r>
+    </w:p>
+    <w:bookmarkEnd w:id="95"/>
+    <w:bookmarkStart w:id="97" w:name="ref-doi:10.1016/j.socscimed.2017.03.041"/>
+    <w:p>
+      <w:pPr>
+        <w:pStyle w:val="Bibliography"/>
+      </w:pPr>
+      <w:r>
+        <w:t xml:space="preserve">30.</w:t>
+      </w:r>
+      <w:r>
+        <w:t xml:space="preserve"> </w:t>
+      </w:r>
+      <w:r>
+        <w:t xml:space="preserve">	</w:t>
+      </w:r>
+      <w:r>
         <w:t xml:space="preserve">Leonard, K.L. and Masatu, M.C. (2017)</w:t>
       </w:r>
       <w:r>
         <w:t xml:space="preserve"> </w:t>
       </w:r>
-      <w:hyperlink r:id="rId86">
+      <w:hyperlink r:id="rId96">
         <w:r>
           <w:rPr>
             <w:rStyle w:val="Hyperlink"/>
@@ -9883,9 +10215,9 @@
         <w:t xml:space="preserve">181, 54–65</w:t>
       </w:r>
     </w:p>
-    <w:bookmarkEnd w:id="87"/>
-    <w:bookmarkEnd w:id="88"/>
-    <w:bookmarkEnd w:id="89"/>
+    <w:bookmarkEnd w:id="97"/>
+    <w:bookmarkEnd w:id="98"/>
+    <w:bookmarkEnd w:id="99"/>
     <w:sectPr>
       <w:footnotePr>
         <w:numRestart w:val="eachSect"/>

</xml_diff>